<commit_message>
last updates with everything
</commit_message>
<xml_diff>
--- a/Lab7/Labo-Module07_InstantaneousFrequency/EE512-Module07-InstantaneousFrequency-LabQuestions.docx
+++ b/Lab7/Labo-Module07_InstantaneousFrequency/EE512-Module07-InstantaneousFrequency-LabQuestions.docx
@@ -74,7 +74,7 @@
     </w:p>
     <w:p>
       <w:pPr>
-        <w:pStyle w:val="Heading1"/>
+        <w:pStyle w:val="Titre1"/>
         <w:jc w:val="both"/>
         <w:rPr>
           <w:lang w:val="en-US"/>
@@ -113,7 +113,7 @@
     </w:p>
     <w:p>
       <w:pPr>
-        <w:pStyle w:val="ListParagraph"/>
+        <w:pStyle w:val="Paragraphedeliste"/>
         <w:numPr>
           <w:ilvl w:val="0"/>
           <w:numId w:val="20"/>
@@ -134,7 +134,7 @@
     </w:p>
     <w:p>
       <w:pPr>
-        <w:pStyle w:val="ListParagraph"/>
+        <w:pStyle w:val="Paragraphedeliste"/>
         <w:numPr>
           <w:ilvl w:val="0"/>
           <w:numId w:val="20"/>
@@ -167,7 +167,7 @@
     </w:p>
     <w:p>
       <w:pPr>
-        <w:pStyle w:val="ListParagraph"/>
+        <w:pStyle w:val="Paragraphedeliste"/>
         <w:numPr>
           <w:ilvl w:val="0"/>
           <w:numId w:val="20"/>
@@ -230,7 +230,7 @@
     </w:p>
     <w:p>
       <w:pPr>
-        <w:pStyle w:val="ListParagraph"/>
+        <w:pStyle w:val="Paragraphedeliste"/>
         <w:numPr>
           <w:ilvl w:val="0"/>
           <w:numId w:val="20"/>
@@ -329,7 +329,7 @@
     </w:p>
     <w:p>
       <w:pPr>
-        <w:pStyle w:val="ListParagraph"/>
+        <w:pStyle w:val="Paragraphedeliste"/>
         <w:spacing w:after="80" w:line="259" w:lineRule="auto"/>
         <w:contextualSpacing w:val="0"/>
         <w:jc w:val="both"/>
@@ -340,7 +340,7 @@
     </w:p>
     <w:p>
       <w:pPr>
-        <w:pStyle w:val="Heading1"/>
+        <w:pStyle w:val="Titre1"/>
         <w:jc w:val="both"/>
         <w:rPr>
           <w:rFonts w:ascii="Century Gothic" w:hAnsi="Century Gothic"/>
@@ -707,6 +707,7 @@
           <w:lang w:val="en-US"/>
         </w:rPr>
         <w:tab/>
+        <w:t>IF estimation using adaptive bandpass filter</w:t>
       </w:r>
       <w:r>
         <w:rPr>
@@ -715,7 +716,7 @@
           <w:szCs w:val="24"/>
           <w:lang w:val="en-US"/>
         </w:rPr>
-        <w:t>IF estimation using adaptive bandpass filter</w:t>
+        <w:t xml:space="preserve"> on </w:t>
       </w:r>
       <w:r>
         <w:rPr>
@@ -724,467 +725,426 @@
           <w:szCs w:val="24"/>
           <w:lang w:val="en-US"/>
         </w:rPr>
-        <w:t xml:space="preserve"> on </w:t>
-      </w:r>
-      <w:r>
-        <w:rPr>
-          <w:rFonts w:ascii="Century Gothic" w:hAnsi="Century Gothic"/>
+        <w:t>multiple signals</w:t>
+      </w:r>
+    </w:p>
+    <w:p>
+      <w:pPr>
+        <w:rPr>
+          <w:lang w:val="en-US"/>
+        </w:rPr>
+      </w:pPr>
+    </w:p>
+    <w:p>
+      <w:pPr>
+        <w:pStyle w:val="Titre6"/>
+        <w:jc w:val="both"/>
+        <w:rPr>
           <w:sz w:val="24"/>
-          <w:szCs w:val="24"/>
-          <w:lang w:val="en-US"/>
-        </w:rPr>
-        <w:t>multiple signals</w:t>
-      </w:r>
-    </w:p>
-    <w:p>
-      <w:pPr>
-        <w:rPr>
-          <w:lang w:val="en-US"/>
-        </w:rPr>
-      </w:pPr>
-    </w:p>
-    <w:p>
-      <w:pPr>
-        <w:pStyle w:val="Heading6"/>
-        <w:jc w:val="both"/>
+          <w:lang w:val="en-US"/>
+        </w:rPr>
+      </w:pPr>
+      <w:r>
         <w:rPr>
           <w:sz w:val="24"/>
           <w:lang w:val="en-US"/>
         </w:rPr>
-      </w:pPr>
+        <w:t xml:space="preserve">Additional </w:t>
+      </w:r>
       <w:r>
         <w:rPr>
           <w:sz w:val="24"/>
           <w:lang w:val="en-US"/>
         </w:rPr>
-        <w:t xml:space="preserve">Additional </w:t>
-      </w:r>
+        <w:t xml:space="preserve">build-in </w:t>
+      </w:r>
+      <w:proofErr w:type="spellStart"/>
       <w:r>
         <w:rPr>
           <w:sz w:val="24"/>
           <w:lang w:val="en-US"/>
         </w:rPr>
-        <w:t xml:space="preserve">build-in </w:t>
-      </w:r>
+        <w:t>Matlab</w:t>
+      </w:r>
+      <w:proofErr w:type="spellEnd"/>
+      <w:r>
+        <w:rPr>
+          <w:sz w:val="24"/>
+          <w:lang w:val="en-US"/>
+        </w:rPr>
+        <w:t xml:space="preserve"> </w:t>
+      </w:r>
+      <w:r>
+        <w:rPr>
+          <w:sz w:val="24"/>
+          <w:lang w:val="en-US"/>
+        </w:rPr>
+        <w:t>commands</w:t>
+      </w:r>
+    </w:p>
+    <w:p>
+      <w:pPr>
+        <w:jc w:val="both"/>
+        <w:rPr>
+          <w:rFonts w:ascii="Century Gothic" w:hAnsi="Century Gothic"/>
+          <w:sz w:val="24"/>
+          <w:szCs w:val="24"/>
+          <w:lang w:val="en-US"/>
+        </w:rPr>
+      </w:pPr>
       <w:proofErr w:type="spellStart"/>
       <w:r>
         <w:rPr>
+          <w:rFonts w:ascii="Century Gothic" w:hAnsi="Century Gothic"/>
           <w:sz w:val="24"/>
-          <w:lang w:val="en-US"/>
-        </w:rPr>
-        <w:t>Matlab</w:t>
+          <w:szCs w:val="24"/>
+          <w:lang w:val="en-US"/>
+        </w:rPr>
+        <w:t>buttord</w:t>
       </w:r>
       <w:proofErr w:type="spellEnd"/>
       <w:r>
         <w:rPr>
+          <w:rFonts w:ascii="Century Gothic" w:hAnsi="Century Gothic"/>
           <w:sz w:val="24"/>
+          <w:szCs w:val="24"/>
+          <w:lang w:val="en-US"/>
+        </w:rPr>
+        <w:tab/>
+        <w:t>determination of filter order</w:t>
+      </w:r>
+    </w:p>
+    <w:p>
+      <w:pPr>
+        <w:jc w:val="both"/>
+        <w:rPr>
+          <w:rFonts w:ascii="Century Gothic" w:hAnsi="Century Gothic"/>
+          <w:sz w:val="24"/>
+          <w:szCs w:val="24"/>
+          <w:lang w:val="en-US"/>
+        </w:rPr>
+      </w:pPr>
+      <w:r>
+        <w:rPr>
+          <w:rFonts w:ascii="Century Gothic" w:hAnsi="Century Gothic"/>
+          <w:sz w:val="24"/>
+          <w:szCs w:val="24"/>
+          <w:lang w:val="en-US"/>
+        </w:rPr>
+        <w:t xml:space="preserve">butter </w:t>
+      </w:r>
+      <w:r>
+        <w:rPr>
+          <w:rFonts w:ascii="Century Gothic" w:hAnsi="Century Gothic"/>
+          <w:sz w:val="24"/>
+          <w:szCs w:val="24"/>
+          <w:lang w:val="en-US"/>
+        </w:rPr>
+        <w:tab/>
+        <w:t>IIR filter synthesis</w:t>
+      </w:r>
+    </w:p>
+    <w:p>
+      <w:pPr>
+        <w:jc w:val="both"/>
+        <w:rPr>
+          <w:rFonts w:ascii="Century Gothic" w:hAnsi="Century Gothic"/>
+          <w:sz w:val="24"/>
+          <w:szCs w:val="24"/>
+          <w:lang w:val="en-US"/>
+        </w:rPr>
+      </w:pPr>
+      <w:proofErr w:type="spellStart"/>
+      <w:r>
+        <w:rPr>
+          <w:rFonts w:ascii="Century Gothic" w:hAnsi="Century Gothic"/>
+          <w:sz w:val="24"/>
+          <w:szCs w:val="24"/>
+          <w:lang w:val="en-US"/>
+        </w:rPr>
+        <w:t>filtfilt</w:t>
+      </w:r>
+      <w:proofErr w:type="spellEnd"/>
+      <w:r>
+        <w:rPr>
+          <w:rFonts w:ascii="Century Gothic" w:hAnsi="Century Gothic"/>
+          <w:sz w:val="24"/>
+          <w:szCs w:val="24"/>
+          <w:lang w:val="en-US"/>
+        </w:rPr>
+        <w:t xml:space="preserve">              output of a filter with forward and backward filtering</w:t>
+      </w:r>
+    </w:p>
+    <w:p>
+      <w:pPr>
+        <w:jc w:val="both"/>
+        <w:rPr>
+          <w:rFonts w:ascii="Century Gothic" w:hAnsi="Century Gothic"/>
+          <w:sz w:val="24"/>
+          <w:szCs w:val="24"/>
+          <w:lang w:val="en-US"/>
+        </w:rPr>
+      </w:pPr>
+      <w:proofErr w:type="spellStart"/>
+      <w:r>
+        <w:rPr>
+          <w:rFonts w:ascii="Century Gothic" w:hAnsi="Century Gothic"/>
+          <w:sz w:val="24"/>
+          <w:szCs w:val="24"/>
+          <w:lang w:val="en-US"/>
+        </w:rPr>
+        <w:t>freqz</w:t>
+      </w:r>
+      <w:proofErr w:type="spellEnd"/>
+      <w:r>
+        <w:rPr>
+          <w:rFonts w:ascii="Century Gothic" w:hAnsi="Century Gothic"/>
+          <w:sz w:val="24"/>
+          <w:szCs w:val="24"/>
+          <w:lang w:val="en-US"/>
+        </w:rPr>
+        <w:tab/>
+      </w:r>
+      <w:r>
+        <w:rPr>
+          <w:rFonts w:ascii="Century Gothic" w:hAnsi="Century Gothic"/>
+          <w:sz w:val="24"/>
+          <w:szCs w:val="24"/>
+          <w:lang w:val="en-US"/>
+        </w:rPr>
+        <w:tab/>
+        <w:t>filter frequency response</w:t>
+      </w:r>
+    </w:p>
+    <w:p>
+      <w:pPr>
+        <w:jc w:val="both"/>
+        <w:rPr>
+          <w:rFonts w:ascii="Century Gothic" w:hAnsi="Century Gothic"/>
+          <w:sz w:val="24"/>
+          <w:szCs w:val="24"/>
+          <w:lang w:val="en-US"/>
+        </w:rPr>
+      </w:pPr>
+      <w:r>
+        <w:rPr>
+          <w:rFonts w:ascii="Century Gothic" w:hAnsi="Century Gothic"/>
+          <w:sz w:val="24"/>
+          <w:szCs w:val="24"/>
+          <w:lang w:val="en-US"/>
+        </w:rPr>
+        <w:t>resample</w:t>
+      </w:r>
+      <w:r>
+        <w:rPr>
+          <w:rFonts w:ascii="Century Gothic" w:hAnsi="Century Gothic"/>
+          <w:sz w:val="24"/>
+          <w:szCs w:val="24"/>
+          <w:lang w:val="en-US"/>
+        </w:rPr>
+        <w:tab/>
+        <w:t>signal resampling</w:t>
+      </w:r>
+    </w:p>
+    <w:p>
+      <w:pPr>
+        <w:jc w:val="both"/>
+        <w:rPr>
+          <w:rFonts w:ascii="Century Gothic" w:hAnsi="Century Gothic"/>
+          <w:sz w:val="24"/>
+          <w:szCs w:val="24"/>
+          <w:lang w:val="en-US"/>
+        </w:rPr>
+      </w:pPr>
+      <w:r>
+        <w:rPr>
+          <w:rFonts w:ascii="Century Gothic" w:hAnsi="Century Gothic"/>
+          <w:sz w:val="24"/>
+          <w:szCs w:val="24"/>
           <w:lang w:val="en-US"/>
         </w:rPr>
         <w:t xml:space="preserve"> </w:t>
       </w:r>
-      <w:r>
-        <w:rPr>
+    </w:p>
+    <w:p>
+      <w:pPr>
+        <w:jc w:val="both"/>
+        <w:rPr>
+          <w:rFonts w:ascii="Century Gothic" w:hAnsi="Century Gothic"/>
           <w:sz w:val="24"/>
-          <w:lang w:val="en-US"/>
-        </w:rPr>
-        <w:t>commands</w:t>
-      </w:r>
-    </w:p>
-    <w:p>
-      <w:pPr>
-        <w:jc w:val="both"/>
-        <w:rPr>
-          <w:rFonts w:ascii="Century Gothic" w:hAnsi="Century Gothic"/>
+          <w:szCs w:val="24"/>
+          <w:lang w:val="en-US"/>
+        </w:rPr>
+      </w:pPr>
+    </w:p>
+    <w:p>
+      <w:pPr>
+        <w:jc w:val="both"/>
+        <w:rPr>
+          <w:lang w:val="en-US"/>
+        </w:rPr>
+      </w:pPr>
+    </w:p>
+    <w:p>
+      <w:pPr>
+        <w:pStyle w:val="Titre2"/>
+        <w:rPr>
+          <w:rFonts w:ascii="Century Gothic" w:hAnsi="Century Gothic"/>
+          <w:szCs w:val="24"/>
+          <w:lang w:val="en-US"/>
+        </w:rPr>
+      </w:pPr>
+      <w:r>
+        <w:rPr>
+          <w:rFonts w:ascii="Century Gothic" w:hAnsi="Century Gothic"/>
+          <w:szCs w:val="24"/>
+          <w:lang w:val="en-US"/>
+        </w:rPr>
+        <w:t xml:space="preserve">Experiment </w:t>
+      </w:r>
+      <w:r>
+        <w:rPr>
+          <w:rFonts w:ascii="Century Gothic" w:hAnsi="Century Gothic"/>
+          <w:szCs w:val="24"/>
+          <w:lang w:val="en-US"/>
+        </w:rPr>
+        <w:t>1</w:t>
+      </w:r>
+      <w:r>
+        <w:rPr>
+          <w:rFonts w:ascii="Century Gothic" w:hAnsi="Century Gothic"/>
+          <w:szCs w:val="24"/>
+          <w:lang w:val="en-US"/>
+        </w:rPr>
+        <w:t>: the importance of pre-filtering for instantaneous frequency estimation</w:t>
+      </w:r>
+    </w:p>
+    <w:p>
+      <w:pPr>
+        <w:rPr>
+          <w:lang w:val="en-US"/>
+        </w:rPr>
+      </w:pPr>
+    </w:p>
+    <w:p>
+      <w:pPr>
+        <w:jc w:val="both"/>
+        <w:rPr>
+          <w:rFonts w:ascii="Century Gothic" w:hAnsi="Century Gothic"/>
+          <w:sz w:val="22"/>
+          <w:szCs w:val="22"/>
+          <w:lang w:val="en-US"/>
+        </w:rPr>
+      </w:pPr>
+      <w:r>
+        <w:rPr>
+          <w:rFonts w:ascii="Century Gothic" w:hAnsi="Century Gothic"/>
+          <w:sz w:val="22"/>
+          <w:szCs w:val="22"/>
+          <w:lang w:val="en-US"/>
+        </w:rPr>
+        <w:t>The f</w:t>
+      </w:r>
+      <w:r>
+        <w:rPr>
+          <w:rFonts w:ascii="Century Gothic" w:hAnsi="Century Gothic"/>
+          <w:sz w:val="22"/>
+          <w:szCs w:val="22"/>
+          <w:lang w:val="en-US"/>
+        </w:rPr>
+        <w:t xml:space="preserve">ile </w:t>
+      </w:r>
+      <w:r>
+        <w:rPr>
+          <w:rFonts w:ascii="Century Gothic" w:hAnsi="Century Gothic"/>
+          <w:sz w:val="22"/>
+          <w:szCs w:val="22"/>
+          <w:lang w:val="en-US"/>
+        </w:rPr>
+        <w:t>“</w:t>
+      </w:r>
+      <w:proofErr w:type="spellStart"/>
+      <w:r>
+        <w:rPr>
+          <w:rFonts w:ascii="Century Gothic" w:hAnsi="Century Gothic"/>
+          <w:b/>
+          <w:sz w:val="22"/>
+          <w:szCs w:val="22"/>
+          <w:lang w:val="en-US"/>
+        </w:rPr>
+        <w:t>AA_</w:t>
+      </w:r>
+      <w:r>
+        <w:rPr>
+          <w:rFonts w:ascii="Century Gothic" w:hAnsi="Century Gothic"/>
+          <w:b/>
+          <w:sz w:val="22"/>
+          <w:szCs w:val="22"/>
+          <w:lang w:val="en-US"/>
+        </w:rPr>
+        <w:t>AFib</w:t>
+      </w:r>
+      <w:proofErr w:type="spellEnd"/>
+      <w:r>
+        <w:rPr>
+          <w:rFonts w:ascii="Century Gothic" w:hAnsi="Century Gothic"/>
+          <w:sz w:val="22"/>
+          <w:szCs w:val="22"/>
+          <w:lang w:val="en-US"/>
+        </w:rPr>
+        <w:t>”</w:t>
+      </w:r>
+      <w:r>
+        <w:rPr>
+          <w:rFonts w:ascii="Century Gothic" w:hAnsi="Century Gothic"/>
+          <w:sz w:val="22"/>
+          <w:szCs w:val="22"/>
+          <w:lang w:val="en-US"/>
+        </w:rPr>
+        <w:t xml:space="preserve"> contains 500 samples from the 12 </w:t>
+      </w:r>
+      <w:r>
+        <w:rPr>
+          <w:rFonts w:ascii="Century Gothic" w:hAnsi="Century Gothic"/>
+          <w:sz w:val="22"/>
+          <w:szCs w:val="22"/>
+          <w:lang w:val="en-US"/>
+        </w:rPr>
+        <w:t xml:space="preserve">surface </w:t>
+      </w:r>
+      <w:r>
+        <w:rPr>
+          <w:rFonts w:ascii="Century Gothic" w:hAnsi="Century Gothic"/>
+          <w:sz w:val="22"/>
+          <w:szCs w:val="22"/>
+          <w:lang w:val="en-US"/>
+        </w:rPr>
+        <w:t xml:space="preserve">ECG electrodes (sampling frequency </w:t>
+      </w:r>
+      <w:r>
+        <w:rPr>
+          <w:rFonts w:ascii="Century Gothic" w:hAnsi="Century Gothic"/>
+          <w:sz w:val="22"/>
+          <w:szCs w:val="22"/>
+          <w:lang w:val="en-US"/>
+        </w:rPr>
+        <w:t xml:space="preserve">Fs = </w:t>
+      </w:r>
+      <w:r>
+        <w:rPr>
+          <w:rFonts w:ascii="Century Gothic" w:hAnsi="Century Gothic"/>
+          <w:sz w:val="22"/>
+          <w:szCs w:val="22"/>
+          <w:lang w:val="en-US"/>
+        </w:rPr>
+        <w:t xml:space="preserve">50 Hz) during an episode of atrial fibrillation, after ventricular activity cancellation. </w:t>
+      </w:r>
+    </w:p>
+    <w:p>
+      <w:pPr>
+        <w:jc w:val="both"/>
+        <w:rPr>
           <w:sz w:val="24"/>
-          <w:szCs w:val="24"/>
-          <w:lang w:val="en-US"/>
-        </w:rPr>
-      </w:pPr>
-      <w:proofErr w:type="spellStart"/>
-      <w:r>
-        <w:rPr>
-          <w:rFonts w:ascii="Century Gothic" w:hAnsi="Century Gothic"/>
-          <w:sz w:val="24"/>
-          <w:szCs w:val="24"/>
-          <w:lang w:val="en-US"/>
-        </w:rPr>
-        <w:t>buttord</w:t>
-      </w:r>
-      <w:proofErr w:type="spellEnd"/>
-      <w:r>
-        <w:rPr>
-          <w:rFonts w:ascii="Century Gothic" w:hAnsi="Century Gothic"/>
-          <w:sz w:val="24"/>
-          <w:szCs w:val="24"/>
-          <w:lang w:val="en-US"/>
-        </w:rPr>
-        <w:tab/>
-      </w:r>
-      <w:r>
-        <w:rPr>
-          <w:rFonts w:ascii="Century Gothic" w:hAnsi="Century Gothic"/>
-          <w:sz w:val="24"/>
-          <w:szCs w:val="24"/>
-          <w:lang w:val="en-US"/>
-        </w:rPr>
-        <w:t>determination of filter order</w:t>
-      </w:r>
-    </w:p>
-    <w:p>
-      <w:pPr>
-        <w:jc w:val="both"/>
-        <w:rPr>
-          <w:rFonts w:ascii="Century Gothic" w:hAnsi="Century Gothic"/>
-          <w:sz w:val="24"/>
-          <w:szCs w:val="24"/>
-          <w:lang w:val="en-US"/>
-        </w:rPr>
-      </w:pPr>
-      <w:r>
-        <w:rPr>
-          <w:rFonts w:ascii="Century Gothic" w:hAnsi="Century Gothic"/>
-          <w:sz w:val="24"/>
-          <w:szCs w:val="24"/>
-          <w:lang w:val="en-US"/>
-        </w:rPr>
-        <w:t xml:space="preserve">butter </w:t>
-      </w:r>
-      <w:r>
-        <w:rPr>
-          <w:rFonts w:ascii="Century Gothic" w:hAnsi="Century Gothic"/>
-          <w:sz w:val="24"/>
-          <w:szCs w:val="24"/>
-          <w:lang w:val="en-US"/>
-        </w:rPr>
-        <w:tab/>
-      </w:r>
-      <w:r>
-        <w:rPr>
-          <w:rFonts w:ascii="Century Gothic" w:hAnsi="Century Gothic"/>
-          <w:sz w:val="24"/>
-          <w:szCs w:val="24"/>
-          <w:lang w:val="en-US"/>
-        </w:rPr>
-        <w:t>IIR filter synthesis</w:t>
-      </w:r>
-    </w:p>
-    <w:p>
-      <w:pPr>
-        <w:jc w:val="both"/>
-        <w:rPr>
-          <w:rFonts w:ascii="Century Gothic" w:hAnsi="Century Gothic"/>
-          <w:sz w:val="24"/>
-          <w:szCs w:val="24"/>
-          <w:lang w:val="en-US"/>
-        </w:rPr>
-      </w:pPr>
-      <w:proofErr w:type="spellStart"/>
-      <w:r>
-        <w:rPr>
-          <w:rFonts w:ascii="Century Gothic" w:hAnsi="Century Gothic"/>
-          <w:sz w:val="24"/>
-          <w:szCs w:val="24"/>
-          <w:lang w:val="en-US"/>
-        </w:rPr>
-        <w:t>filtfilt</w:t>
-      </w:r>
-      <w:proofErr w:type="spellEnd"/>
-      <w:r>
-        <w:rPr>
-          <w:rFonts w:ascii="Century Gothic" w:hAnsi="Century Gothic"/>
-          <w:sz w:val="24"/>
-          <w:szCs w:val="24"/>
-          <w:lang w:val="en-US"/>
-        </w:rPr>
-        <w:t xml:space="preserve">              output of a filter with forward and backward filtering</w:t>
-      </w:r>
-    </w:p>
-    <w:p>
-      <w:pPr>
-        <w:jc w:val="both"/>
-        <w:rPr>
-          <w:rFonts w:ascii="Century Gothic" w:hAnsi="Century Gothic"/>
-          <w:sz w:val="24"/>
-          <w:szCs w:val="24"/>
-          <w:lang w:val="en-US"/>
-        </w:rPr>
-      </w:pPr>
-      <w:proofErr w:type="spellStart"/>
-      <w:r>
-        <w:rPr>
-          <w:rFonts w:ascii="Century Gothic" w:hAnsi="Century Gothic"/>
-          <w:sz w:val="24"/>
-          <w:szCs w:val="24"/>
-          <w:lang w:val="en-US"/>
-        </w:rPr>
-        <w:t>freqz</w:t>
-      </w:r>
-      <w:proofErr w:type="spellEnd"/>
-      <w:r>
-        <w:rPr>
-          <w:rFonts w:ascii="Century Gothic" w:hAnsi="Century Gothic"/>
-          <w:sz w:val="24"/>
-          <w:szCs w:val="24"/>
-          <w:lang w:val="en-US"/>
-        </w:rPr>
-        <w:tab/>
-      </w:r>
-      <w:r>
-        <w:rPr>
-          <w:rFonts w:ascii="Century Gothic" w:hAnsi="Century Gothic"/>
-          <w:sz w:val="24"/>
-          <w:szCs w:val="24"/>
-          <w:lang w:val="en-US"/>
-        </w:rPr>
-        <w:tab/>
-      </w:r>
-      <w:r>
-        <w:rPr>
-          <w:rFonts w:ascii="Century Gothic" w:hAnsi="Century Gothic"/>
-          <w:sz w:val="24"/>
-          <w:szCs w:val="24"/>
-          <w:lang w:val="en-US"/>
-        </w:rPr>
-        <w:t>filter frequency response</w:t>
-      </w:r>
-    </w:p>
-    <w:p>
-      <w:pPr>
-        <w:jc w:val="both"/>
-        <w:rPr>
-          <w:rFonts w:ascii="Century Gothic" w:hAnsi="Century Gothic"/>
-          <w:sz w:val="24"/>
-          <w:szCs w:val="24"/>
-          <w:lang w:val="en-US"/>
-        </w:rPr>
-      </w:pPr>
-      <w:r>
-        <w:rPr>
-          <w:rFonts w:ascii="Century Gothic" w:hAnsi="Century Gothic"/>
-          <w:sz w:val="24"/>
-          <w:szCs w:val="24"/>
-          <w:lang w:val="en-US"/>
-        </w:rPr>
-        <w:t>resample</w:t>
-      </w:r>
-      <w:r>
-        <w:rPr>
-          <w:rFonts w:ascii="Century Gothic" w:hAnsi="Century Gothic"/>
-          <w:sz w:val="24"/>
-          <w:szCs w:val="24"/>
-          <w:lang w:val="en-US"/>
-        </w:rPr>
-        <w:tab/>
-      </w:r>
-      <w:r>
-        <w:rPr>
-          <w:rFonts w:ascii="Century Gothic" w:hAnsi="Century Gothic"/>
-          <w:sz w:val="24"/>
-          <w:szCs w:val="24"/>
-          <w:lang w:val="en-US"/>
-        </w:rPr>
-        <w:t>signal resampling</w:t>
-      </w:r>
-    </w:p>
-    <w:p>
-      <w:pPr>
-        <w:jc w:val="both"/>
-        <w:rPr>
-          <w:rFonts w:ascii="Century Gothic" w:hAnsi="Century Gothic"/>
-          <w:sz w:val="24"/>
-          <w:szCs w:val="24"/>
-          <w:lang w:val="en-US"/>
-        </w:rPr>
-      </w:pPr>
-      <w:r>
-        <w:rPr>
-          <w:rFonts w:ascii="Century Gothic" w:hAnsi="Century Gothic"/>
-          <w:sz w:val="24"/>
-          <w:szCs w:val="24"/>
-          <w:lang w:val="en-US"/>
-        </w:rPr>
-        <w:t xml:space="preserve"> </w:t>
-      </w:r>
-    </w:p>
-    <w:p>
-      <w:pPr>
-        <w:jc w:val="both"/>
-        <w:rPr>
-          <w:rFonts w:ascii="Century Gothic" w:hAnsi="Century Gothic"/>
-          <w:sz w:val="24"/>
-          <w:szCs w:val="24"/>
-          <w:lang w:val="en-US"/>
-        </w:rPr>
-      </w:pPr>
-    </w:p>
-    <w:p>
-      <w:pPr>
-        <w:jc w:val="both"/>
-        <w:rPr>
-          <w:lang w:val="en-US"/>
-        </w:rPr>
-      </w:pPr>
-    </w:p>
-    <w:p>
-      <w:pPr>
-        <w:pStyle w:val="Heading2"/>
-        <w:rPr>
-          <w:rFonts w:ascii="Century Gothic" w:hAnsi="Century Gothic"/>
-          <w:szCs w:val="24"/>
-          <w:lang w:val="en-US"/>
-        </w:rPr>
-      </w:pPr>
-      <w:r>
-        <w:rPr>
-          <w:rFonts w:ascii="Century Gothic" w:hAnsi="Century Gothic"/>
-          <w:szCs w:val="24"/>
-          <w:lang w:val="en-US"/>
-        </w:rPr>
-        <w:t xml:space="preserve">Experiment </w:t>
-      </w:r>
-      <w:r>
-        <w:rPr>
-          <w:rFonts w:ascii="Century Gothic" w:hAnsi="Century Gothic"/>
-          <w:szCs w:val="24"/>
-          <w:lang w:val="en-US"/>
-        </w:rPr>
-        <w:t>1</w:t>
-      </w:r>
-      <w:r>
-        <w:rPr>
-          <w:rFonts w:ascii="Century Gothic" w:hAnsi="Century Gothic"/>
-          <w:szCs w:val="24"/>
-          <w:lang w:val="en-US"/>
-        </w:rPr>
-        <w:t>: the importance of pre-filtering for instantaneous frequency estimation</w:t>
-      </w:r>
-    </w:p>
-    <w:p>
-      <w:pPr>
-        <w:rPr>
-          <w:lang w:val="en-US"/>
-        </w:rPr>
-      </w:pPr>
-    </w:p>
-    <w:p>
-      <w:pPr>
-        <w:jc w:val="both"/>
-        <w:rPr>
-          <w:rFonts w:ascii="Century Gothic" w:hAnsi="Century Gothic"/>
-          <w:sz w:val="22"/>
-          <w:szCs w:val="22"/>
-          <w:lang w:val="en-US"/>
-        </w:rPr>
-      </w:pPr>
-      <w:r>
-        <w:rPr>
-          <w:rFonts w:ascii="Century Gothic" w:hAnsi="Century Gothic"/>
-          <w:sz w:val="22"/>
-          <w:szCs w:val="22"/>
-          <w:lang w:val="en-US"/>
-        </w:rPr>
-        <w:t>The f</w:t>
-      </w:r>
-      <w:r>
-        <w:rPr>
-          <w:rFonts w:ascii="Century Gothic" w:hAnsi="Century Gothic"/>
-          <w:sz w:val="22"/>
-          <w:szCs w:val="22"/>
-          <w:lang w:val="en-US"/>
-        </w:rPr>
-        <w:t xml:space="preserve">ile </w:t>
-      </w:r>
-      <w:r>
-        <w:rPr>
-          <w:rFonts w:ascii="Century Gothic" w:hAnsi="Century Gothic"/>
-          <w:sz w:val="22"/>
-          <w:szCs w:val="22"/>
-          <w:lang w:val="en-US"/>
-        </w:rPr>
-        <w:t>“</w:t>
-      </w:r>
-      <w:proofErr w:type="spellStart"/>
-      <w:r>
-        <w:rPr>
-          <w:rFonts w:ascii="Century Gothic" w:hAnsi="Century Gothic"/>
-          <w:b/>
-          <w:sz w:val="22"/>
-          <w:szCs w:val="22"/>
-          <w:lang w:val="en-US"/>
-        </w:rPr>
-        <w:t>AA_</w:t>
-      </w:r>
-      <w:r>
-        <w:rPr>
-          <w:rFonts w:ascii="Century Gothic" w:hAnsi="Century Gothic"/>
-          <w:b/>
-          <w:sz w:val="22"/>
-          <w:szCs w:val="22"/>
-          <w:lang w:val="en-US"/>
-        </w:rPr>
-        <w:t>AFib</w:t>
-      </w:r>
-      <w:proofErr w:type="spellEnd"/>
-      <w:r>
-        <w:rPr>
-          <w:rFonts w:ascii="Century Gothic" w:hAnsi="Century Gothic"/>
-          <w:sz w:val="22"/>
-          <w:szCs w:val="22"/>
-          <w:lang w:val="en-US"/>
-        </w:rPr>
-        <w:t>”</w:t>
-      </w:r>
-      <w:r>
-        <w:rPr>
-          <w:rFonts w:ascii="Century Gothic" w:hAnsi="Century Gothic"/>
-          <w:sz w:val="22"/>
-          <w:szCs w:val="22"/>
-          <w:lang w:val="en-US"/>
-        </w:rPr>
-        <w:t xml:space="preserve"> contains 500 samples from the 12 </w:t>
-      </w:r>
-      <w:r>
-        <w:rPr>
-          <w:rFonts w:ascii="Century Gothic" w:hAnsi="Century Gothic"/>
-          <w:sz w:val="22"/>
-          <w:szCs w:val="22"/>
-          <w:lang w:val="en-US"/>
-        </w:rPr>
-        <w:t xml:space="preserve">surface </w:t>
-      </w:r>
-      <w:r>
-        <w:rPr>
-          <w:rFonts w:ascii="Century Gothic" w:hAnsi="Century Gothic"/>
-          <w:sz w:val="22"/>
-          <w:szCs w:val="22"/>
-          <w:lang w:val="en-US"/>
-        </w:rPr>
-        <w:t xml:space="preserve">ECG electrodes (sampling frequency </w:t>
-      </w:r>
-      <w:r>
-        <w:rPr>
-          <w:rFonts w:ascii="Century Gothic" w:hAnsi="Century Gothic"/>
-          <w:sz w:val="22"/>
-          <w:szCs w:val="22"/>
-          <w:lang w:val="en-US"/>
-        </w:rPr>
-        <w:t xml:space="preserve">Fs = </w:t>
-      </w:r>
-      <w:r>
-        <w:rPr>
-          <w:rFonts w:ascii="Century Gothic" w:hAnsi="Century Gothic"/>
-          <w:sz w:val="22"/>
-          <w:szCs w:val="22"/>
-          <w:lang w:val="en-US"/>
-        </w:rPr>
-        <w:t xml:space="preserve">50 Hz) during an episode of atrial fibrillation, after ventricular activity cancellation. </w:t>
-      </w:r>
-    </w:p>
-    <w:p>
-      <w:pPr>
-        <w:jc w:val="both"/>
-        <w:rPr>
-          <w:sz w:val="24"/>
           <w:lang w:val="en-US"/>
         </w:rPr>
       </w:pPr>
@@ -1274,10 +1234,10 @@
     </w:p>
     <w:p>
       <w:pPr>
-        <w:pStyle w:val="Heading1"/>
-        <w:jc w:val="both"/>
-        <w:rPr>
-          <w:rFonts w:ascii="Courier New" w:hAnsi="Courier New" w:eastAsia="Calibri" w:cs="Courier New"/>
+        <w:pStyle w:val="Titre1"/>
+        <w:jc w:val="both"/>
+        <w:rPr>
+          <w:rFonts w:ascii="Courier New" w:eastAsia="Calibri" w:hAnsi="Courier New" w:cs="Courier New"/>
           <w:b w:val="0"/>
           <w:bCs w:val="0"/>
           <w:szCs w:val="24"/>
@@ -1286,7 +1246,7 @@
       </w:pPr>
       <w:r>
         <w:rPr>
-          <w:rFonts w:ascii="Courier New" w:hAnsi="Courier New" w:eastAsia="Calibri" w:cs="Courier New"/>
+          <w:rFonts w:ascii="Courier New" w:eastAsia="Calibri" w:hAnsi="Courier New" w:cs="Courier New"/>
           <w:b w:val="0"/>
           <w:bCs w:val="0"/>
           <w:szCs w:val="24"/>
@@ -1297,7 +1257,7 @@
       <w:proofErr w:type="spellStart"/>
       <w:r>
         <w:rPr>
-          <w:rFonts w:ascii="Courier New" w:hAnsi="Courier New" w:eastAsia="Calibri" w:cs="Courier New"/>
+          <w:rFonts w:ascii="Courier New" w:eastAsia="Calibri" w:hAnsi="Courier New" w:cs="Courier New"/>
           <w:b w:val="0"/>
           <w:bCs w:val="0"/>
           <w:szCs w:val="24"/>
@@ -1307,7 +1267,7 @@
       </w:r>
       <w:r>
         <w:rPr>
-          <w:rFonts w:ascii="Courier New" w:hAnsi="Courier New" w:eastAsia="Calibri" w:cs="Courier New"/>
+          <w:rFonts w:ascii="Courier New" w:eastAsia="Calibri" w:hAnsi="Courier New" w:cs="Courier New"/>
           <w:b w:val="0"/>
           <w:bCs w:val="0"/>
           <w:szCs w:val="24"/>
@@ -1317,7 +1277,7 @@
       </w:r>
       <w:r>
         <w:rPr>
-          <w:rFonts w:ascii="Courier New" w:hAnsi="Courier New" w:eastAsia="Calibri" w:cs="Courier New"/>
+          <w:rFonts w:ascii="Courier New" w:eastAsia="Calibri" w:hAnsi="Courier New" w:cs="Courier New"/>
           <w:b w:val="0"/>
           <w:bCs w:val="0"/>
           <w:szCs w:val="24"/>
@@ -1328,7 +1288,7 @@
       <w:proofErr w:type="spellEnd"/>
       <w:r>
         <w:rPr>
-          <w:rFonts w:ascii="Courier New" w:hAnsi="Courier New" w:eastAsia="Calibri" w:cs="Courier New"/>
+          <w:rFonts w:ascii="Courier New" w:eastAsia="Calibri" w:hAnsi="Courier New" w:cs="Courier New"/>
           <w:b w:val="0"/>
           <w:bCs w:val="0"/>
           <w:szCs w:val="24"/>
@@ -1338,7 +1298,7 @@
       </w:r>
       <w:r>
         <w:rPr>
-          <w:rFonts w:ascii="Courier New" w:hAnsi="Courier New" w:eastAsia="Calibri" w:cs="Courier New"/>
+          <w:rFonts w:ascii="Courier New" w:eastAsia="Calibri" w:hAnsi="Courier New" w:cs="Courier New"/>
           <w:b w:val="0"/>
           <w:bCs w:val="0"/>
           <w:szCs w:val="24"/>
@@ -1349,7 +1309,7 @@
       <w:proofErr w:type="spellStart"/>
       <w:r>
         <w:rPr>
-          <w:rFonts w:ascii="Courier New" w:hAnsi="Courier New" w:eastAsia="Calibri" w:cs="Courier New"/>
+          <w:rFonts w:ascii="Courier New" w:eastAsia="Calibri" w:hAnsi="Courier New" w:cs="Courier New"/>
           <w:b w:val="0"/>
           <w:bCs w:val="0"/>
           <w:szCs w:val="24"/>
@@ -1360,7 +1320,7 @@
       <w:proofErr w:type="spellEnd"/>
       <w:r>
         <w:rPr>
-          <w:rFonts w:ascii="Courier New" w:hAnsi="Courier New" w:eastAsia="Calibri" w:cs="Courier New"/>
+          <w:rFonts w:ascii="Courier New" w:eastAsia="Calibri" w:hAnsi="Courier New" w:cs="Courier New"/>
           <w:b w:val="0"/>
           <w:bCs w:val="0"/>
           <w:szCs w:val="24"/>
@@ -1371,296 +1331,237 @@
     </w:p>
     <w:p>
       <w:pPr>
-        <w:pStyle w:val="Heading1"/>
-        <w:jc w:val="both"/>
-        <w:rPr>
-          <w:rFonts w:ascii="Courier New" w:hAnsi="Courier New" w:eastAsia="Calibri" w:cs="Courier New"/>
+        <w:pStyle w:val="Titre1"/>
+        <w:jc w:val="both"/>
+        <w:rPr>
+          <w:rFonts w:ascii="Courier New" w:eastAsia="Calibri" w:hAnsi="Courier New" w:cs="Courier New"/>
           <w:b w:val="0"/>
           <w:bCs w:val="0"/>
-          <w:lang w:val="en-AU"/>
-        </w:rPr>
-      </w:pPr>
-      <w:r>
-        <w:rPr>
-          <w:rFonts w:ascii="Courier New" w:hAnsi="Courier New" w:eastAsia="Calibri" w:cs="Courier New"/>
+        </w:rPr>
+      </w:pPr>
+      <w:r>
+        <w:rPr>
+          <w:rFonts w:ascii="Courier New" w:eastAsia="Calibri" w:hAnsi="Courier New" w:cs="Courier New"/>
           <w:b w:val="0"/>
           <w:bCs w:val="0"/>
-          <w:lang w:val="en-AU"/>
-        </w:rPr>
-        <w:t>&gt;&gt; [</w:t>
-      </w:r>
-      <w:r>
-        <w:rPr>
-          <w:rFonts w:ascii="Courier New" w:hAnsi="Courier New" w:eastAsia="Calibri" w:cs="Courier New"/>
+        </w:rPr>
+        <w:t>&gt;&gt; [b,a] = butter(N</w:t>
+      </w:r>
+      <w:r>
+        <w:rPr>
+          <w:rFonts w:ascii="Courier New" w:eastAsia="Calibri" w:hAnsi="Courier New" w:cs="Courier New"/>
           <w:b w:val="0"/>
           <w:bCs w:val="0"/>
-          <w:lang w:val="en-AU"/>
-        </w:rPr>
-        <w:t>b,a</w:t>
-      </w:r>
-      <w:r>
-        <w:rPr>
-          <w:rFonts w:ascii="Courier New" w:hAnsi="Courier New" w:eastAsia="Calibri" w:cs="Courier New"/>
+        </w:rPr>
+        <w:t>b</w:t>
+      </w:r>
+      <w:r>
+        <w:rPr>
+          <w:rFonts w:ascii="Courier New" w:eastAsia="Calibri" w:hAnsi="Courier New" w:cs="Courier New"/>
           <w:b w:val="0"/>
           <w:bCs w:val="0"/>
-          <w:lang w:val="en-AU"/>
-        </w:rPr>
-        <w:t>] = butter(</w:t>
-      </w:r>
-      <w:r>
-        <w:rPr>
-          <w:rFonts w:ascii="Courier New" w:hAnsi="Courier New" w:eastAsia="Calibri" w:cs="Courier New"/>
+        </w:rPr>
+        <w:t>,wn);</w:t>
+      </w:r>
+    </w:p>
+    <w:p>
+      <w:pPr>
+        <w:pStyle w:val="Titre1"/>
+        <w:jc w:val="both"/>
+        <w:rPr>
+          <w:rFonts w:ascii="Courier New" w:eastAsia="Calibri" w:hAnsi="Courier New" w:cs="Courier New"/>
           <w:b w:val="0"/>
           <w:bCs w:val="0"/>
-          <w:lang w:val="en-AU"/>
-        </w:rPr>
-        <w:t>N</w:t>
-      </w:r>
-      <w:r>
-        <w:rPr>
-          <w:rFonts w:ascii="Courier New" w:hAnsi="Courier New" w:eastAsia="Calibri" w:cs="Courier New"/>
+        </w:rPr>
+      </w:pPr>
+      <w:r>
+        <w:rPr>
+          <w:rFonts w:ascii="Courier New" w:eastAsia="Calibri" w:hAnsi="Courier New" w:cs="Courier New"/>
           <w:b w:val="0"/>
           <w:bCs w:val="0"/>
-          <w:lang w:val="en-AU"/>
-        </w:rPr>
-        <w:t>b</w:t>
-      </w:r>
-      <w:r>
-        <w:rPr>
-          <w:rFonts w:ascii="Courier New" w:hAnsi="Courier New" w:eastAsia="Calibri" w:cs="Courier New"/>
+        </w:rPr>
+        <w:t>&gt;&gt; signal_filt</w:t>
+      </w:r>
+      <w:r>
+        <w:rPr>
+          <w:rFonts w:ascii="Courier New" w:eastAsia="Calibri" w:hAnsi="Courier New" w:cs="Courier New"/>
           <w:b w:val="0"/>
           <w:bCs w:val="0"/>
-          <w:lang w:val="en-AU"/>
-        </w:rPr>
-        <w:t>,wn</w:t>
-      </w:r>
-      <w:r>
-        <w:rPr>
-          <w:rFonts w:ascii="Courier New" w:hAnsi="Courier New" w:eastAsia="Calibri" w:cs="Courier New"/>
+        </w:rPr>
+        <w:t xml:space="preserve"> </w:t>
+      </w:r>
+      <w:r>
+        <w:rPr>
+          <w:rFonts w:ascii="Courier New" w:eastAsia="Calibri" w:hAnsi="Courier New" w:cs="Courier New"/>
           <w:b w:val="0"/>
           <w:bCs w:val="0"/>
-          <w:lang w:val="en-AU"/>
-        </w:rPr>
-        <w:t>);</w:t>
-      </w:r>
-    </w:p>
-    <w:p>
-      <w:pPr>
-        <w:pStyle w:val="Heading1"/>
-        <w:jc w:val="both"/>
-        <w:rPr>
-          <w:rFonts w:ascii="Courier New" w:hAnsi="Courier New" w:eastAsia="Calibri" w:cs="Courier New"/>
-          <w:b w:val="0"/>
-          <w:bCs w:val="0"/>
-          <w:lang w:val="en-AU"/>
-        </w:rPr>
-      </w:pPr>
-      <w:r>
-        <w:rPr>
-          <w:rFonts w:ascii="Courier New" w:hAnsi="Courier New" w:eastAsia="Calibri" w:cs="Courier New"/>
-          <w:b w:val="0"/>
-          <w:bCs w:val="0"/>
-          <w:lang w:val="en-AU"/>
-        </w:rPr>
-        <w:t xml:space="preserve">&gt;&gt; </w:t>
-      </w:r>
-      <w:r>
-        <w:rPr>
-          <w:rFonts w:ascii="Courier New" w:hAnsi="Courier New" w:eastAsia="Calibri" w:cs="Courier New"/>
-          <w:b w:val="0"/>
-          <w:bCs w:val="0"/>
-          <w:lang w:val="en-AU"/>
-        </w:rPr>
-        <w:t>signal_filt</w:t>
-      </w:r>
-      <w:r>
-        <w:rPr>
-          <w:rFonts w:ascii="Courier New" w:hAnsi="Courier New" w:eastAsia="Calibri" w:cs="Courier New"/>
-          <w:b w:val="0"/>
-          <w:bCs w:val="0"/>
-          <w:lang w:val="en-AU"/>
+        </w:rPr>
+        <w:t>= filtfilt(b,a,signal);</w:t>
+      </w:r>
+    </w:p>
+    <w:p>
+      <w:pPr>
+        <w:rPr>
+          <w:lang w:val="en-US"/>
+        </w:rPr>
+      </w:pPr>
+    </w:p>
+    <w:p>
+      <w:pPr>
+        <w:jc w:val="both"/>
+        <w:rPr>
+          <w:rFonts w:ascii="Century Gothic" w:hAnsi="Century Gothic"/>
+          <w:sz w:val="22"/>
+          <w:szCs w:val="22"/>
+          <w:lang w:val="en-US"/>
+        </w:rPr>
+      </w:pPr>
+      <w:r>
+        <w:rPr>
+          <w:rFonts w:ascii="Century Gothic" w:hAnsi="Century Gothic"/>
+          <w:sz w:val="22"/>
+          <w:szCs w:val="22"/>
+          <w:lang w:val="en-US"/>
+        </w:rPr>
+        <w:t>Due to physiological constraints, the atrial fibrillation frequency lies in</w:t>
+      </w:r>
+      <w:r>
+        <w:rPr>
+          <w:rFonts w:ascii="Century Gothic" w:hAnsi="Century Gothic"/>
+          <w:sz w:val="22"/>
+          <w:szCs w:val="22"/>
+          <w:lang w:val="en-US"/>
+        </w:rPr>
+        <w:t>to</w:t>
+      </w:r>
+      <w:r>
+        <w:rPr>
+          <w:rFonts w:ascii="Century Gothic" w:hAnsi="Century Gothic"/>
+          <w:sz w:val="22"/>
+          <w:szCs w:val="22"/>
+          <w:lang w:val="en-US"/>
+        </w:rPr>
+        <w:t xml:space="preserve"> the interval [</w:t>
+      </w:r>
+      <w:r>
+        <w:rPr>
+          <w:rFonts w:ascii="Century Gothic" w:hAnsi="Century Gothic"/>
+          <w:sz w:val="22"/>
+          <w:szCs w:val="22"/>
+          <w:lang w:val="en-US"/>
+        </w:rPr>
+        <w:t>3</w:t>
+      </w:r>
+      <w:r>
+        <w:rPr>
+          <w:rFonts w:ascii="Century Gothic" w:hAnsi="Century Gothic"/>
+          <w:sz w:val="22"/>
+          <w:szCs w:val="22"/>
+          <w:lang w:val="en-US"/>
+        </w:rPr>
+        <w:t>-</w:t>
+      </w:r>
+      <w:r>
+        <w:rPr>
+          <w:rFonts w:ascii="Century Gothic" w:hAnsi="Century Gothic"/>
+          <w:sz w:val="22"/>
+          <w:szCs w:val="22"/>
+          <w:lang w:val="en-US"/>
+        </w:rPr>
+        <w:t>1</w:t>
+      </w:r>
+      <w:r>
+        <w:rPr>
+          <w:rFonts w:ascii="Century Gothic" w:hAnsi="Century Gothic"/>
+          <w:sz w:val="22"/>
+          <w:szCs w:val="22"/>
+          <w:lang w:val="en-US"/>
+        </w:rPr>
+        <w:t>2</w:t>
+      </w:r>
+      <w:r>
+        <w:rPr>
+          <w:rFonts w:ascii="Century Gothic" w:hAnsi="Century Gothic"/>
+          <w:sz w:val="22"/>
+          <w:szCs w:val="22"/>
+          <w:lang w:val="en-US"/>
+        </w:rPr>
+        <w:t>]Hz</w:t>
+      </w:r>
+      <w:r>
+        <w:rPr>
+          <w:rFonts w:ascii="Century Gothic" w:hAnsi="Century Gothic"/>
+          <w:sz w:val="22"/>
+          <w:szCs w:val="22"/>
+          <w:lang w:val="en-US"/>
+        </w:rPr>
+        <w:t xml:space="preserve">, but the </w:t>
+      </w:r>
+      <w:r>
+        <w:rPr>
+          <w:rFonts w:ascii="Century Gothic" w:hAnsi="Century Gothic"/>
+          <w:sz w:val="22"/>
+          <w:szCs w:val="22"/>
+          <w:lang w:val="en-US"/>
+        </w:rPr>
+        <w:t xml:space="preserve">frequency </w:t>
+      </w:r>
+      <w:r>
+        <w:rPr>
+          <w:rFonts w:ascii="Century Gothic" w:hAnsi="Century Gothic"/>
+          <w:sz w:val="22"/>
+          <w:szCs w:val="22"/>
+          <w:lang w:val="en-US"/>
+        </w:rPr>
+        <w:t>range usua</w:t>
+      </w:r>
+      <w:r>
+        <w:rPr>
+          <w:rFonts w:ascii="Century Gothic" w:hAnsi="Century Gothic"/>
+          <w:sz w:val="22"/>
+          <w:szCs w:val="22"/>
+          <w:lang w:val="en-US"/>
+        </w:rPr>
+        <w:t>l</w:t>
+      </w:r>
+      <w:r>
+        <w:rPr>
+          <w:rFonts w:ascii="Century Gothic" w:hAnsi="Century Gothic"/>
+          <w:sz w:val="22"/>
+          <w:szCs w:val="22"/>
+          <w:lang w:val="en-US"/>
+        </w:rPr>
+        <w:t xml:space="preserve">ly met in clinical practice is [4-7]Hz. </w:t>
+      </w:r>
+      <w:r>
+        <w:rPr>
+          <w:rFonts w:ascii="Century Gothic" w:hAnsi="Century Gothic"/>
+          <w:sz w:val="22"/>
+          <w:szCs w:val="22"/>
+          <w:lang w:val="en-US"/>
         </w:rPr>
         <w:t xml:space="preserve"> </w:t>
       </w:r>
-      <w:r>
-        <w:rPr>
-          <w:rFonts w:ascii="Courier New" w:hAnsi="Courier New" w:eastAsia="Calibri" w:cs="Courier New"/>
-          <w:b w:val="0"/>
-          <w:bCs w:val="0"/>
-          <w:lang w:val="en-AU"/>
-        </w:rPr>
-        <w:t xml:space="preserve">= </w:t>
-      </w:r>
-      <w:r>
-        <w:rPr>
-          <w:rFonts w:ascii="Courier New" w:hAnsi="Courier New" w:eastAsia="Calibri" w:cs="Courier New"/>
-          <w:b w:val="0"/>
-          <w:bCs w:val="0"/>
-          <w:lang w:val="en-AU"/>
-        </w:rPr>
-        <w:t>filtfilt</w:t>
-      </w:r>
-      <w:r>
-        <w:rPr>
-          <w:rFonts w:ascii="Courier New" w:hAnsi="Courier New" w:eastAsia="Calibri" w:cs="Courier New"/>
-          <w:b w:val="0"/>
-          <w:bCs w:val="0"/>
-          <w:lang w:val="en-AU"/>
-        </w:rPr>
-        <w:t>(</w:t>
-      </w:r>
-      <w:r>
-        <w:rPr>
-          <w:rFonts w:ascii="Courier New" w:hAnsi="Courier New" w:eastAsia="Calibri" w:cs="Courier New"/>
-          <w:b w:val="0"/>
-          <w:bCs w:val="0"/>
-          <w:lang w:val="en-AU"/>
-        </w:rPr>
-        <w:t>b,a,signal</w:t>
-      </w:r>
-      <w:r>
-        <w:rPr>
-          <w:rFonts w:ascii="Courier New" w:hAnsi="Courier New" w:eastAsia="Calibri" w:cs="Courier New"/>
-          <w:b w:val="0"/>
-          <w:bCs w:val="0"/>
-          <w:lang w:val="en-AU"/>
-        </w:rPr>
-        <w:t>);</w:t>
-      </w:r>
-    </w:p>
-    <w:p>
-      <w:pPr>
-        <w:rPr>
-          <w:lang w:val="en-US"/>
-        </w:rPr>
-      </w:pPr>
-    </w:p>
-    <w:p>
-      <w:pPr>
-        <w:jc w:val="both"/>
-        <w:rPr>
-          <w:rFonts w:ascii="Century Gothic" w:hAnsi="Century Gothic"/>
-          <w:sz w:val="22"/>
-          <w:szCs w:val="22"/>
-          <w:lang w:val="en-US"/>
-        </w:rPr>
-      </w:pPr>
-      <w:r>
-        <w:rPr>
-          <w:rFonts w:ascii="Century Gothic" w:hAnsi="Century Gothic"/>
-          <w:sz w:val="22"/>
-          <w:szCs w:val="22"/>
-          <w:lang w:val="en-US"/>
-        </w:rPr>
-        <w:t>Due to physiological constraints, the atrial fibrillation frequency lies in</w:t>
-      </w:r>
-      <w:r>
-        <w:rPr>
-          <w:rFonts w:ascii="Century Gothic" w:hAnsi="Century Gothic"/>
-          <w:sz w:val="22"/>
-          <w:szCs w:val="22"/>
-          <w:lang w:val="en-US"/>
-        </w:rPr>
-        <w:t>to</w:t>
-      </w:r>
-      <w:r>
-        <w:rPr>
-          <w:rFonts w:ascii="Century Gothic" w:hAnsi="Century Gothic"/>
-          <w:sz w:val="22"/>
-          <w:szCs w:val="22"/>
-          <w:lang w:val="en-US"/>
-        </w:rPr>
-        <w:t xml:space="preserve"> the interval [</w:t>
-      </w:r>
-      <w:r>
-        <w:rPr>
-          <w:rFonts w:ascii="Century Gothic" w:hAnsi="Century Gothic"/>
-          <w:sz w:val="22"/>
-          <w:szCs w:val="22"/>
-          <w:lang w:val="en-US"/>
-        </w:rPr>
-        <w:t>3</w:t>
-      </w:r>
-      <w:r>
-        <w:rPr>
-          <w:rFonts w:ascii="Century Gothic" w:hAnsi="Century Gothic"/>
-          <w:sz w:val="22"/>
-          <w:szCs w:val="22"/>
-          <w:lang w:val="en-US"/>
-        </w:rPr>
-        <w:t>-</w:t>
-      </w:r>
-      <w:r>
-        <w:rPr>
-          <w:rFonts w:ascii="Century Gothic" w:hAnsi="Century Gothic"/>
-          <w:sz w:val="22"/>
-          <w:szCs w:val="22"/>
-          <w:lang w:val="en-US"/>
-        </w:rPr>
-        <w:t>1</w:t>
-      </w:r>
-      <w:r>
-        <w:rPr>
-          <w:rFonts w:ascii="Century Gothic" w:hAnsi="Century Gothic"/>
-          <w:sz w:val="22"/>
-          <w:szCs w:val="22"/>
-          <w:lang w:val="en-US"/>
-        </w:rPr>
-        <w:t>2</w:t>
-      </w:r>
-      <w:r>
-        <w:rPr>
-          <w:rFonts w:ascii="Century Gothic" w:hAnsi="Century Gothic"/>
-          <w:sz w:val="22"/>
-          <w:szCs w:val="22"/>
-          <w:lang w:val="en-US"/>
-        </w:rPr>
-        <w:t>]Hz</w:t>
-      </w:r>
-      <w:r>
-        <w:rPr>
-          <w:rFonts w:ascii="Century Gothic" w:hAnsi="Century Gothic"/>
-          <w:sz w:val="22"/>
-          <w:szCs w:val="22"/>
-          <w:lang w:val="en-US"/>
-        </w:rPr>
-        <w:t xml:space="preserve">, but the </w:t>
-      </w:r>
-      <w:r>
-        <w:rPr>
-          <w:rFonts w:ascii="Century Gothic" w:hAnsi="Century Gothic"/>
-          <w:sz w:val="22"/>
-          <w:szCs w:val="22"/>
-          <w:lang w:val="en-US"/>
-        </w:rPr>
-        <w:t xml:space="preserve">frequency </w:t>
-      </w:r>
-      <w:r>
-        <w:rPr>
-          <w:rFonts w:ascii="Century Gothic" w:hAnsi="Century Gothic"/>
-          <w:sz w:val="22"/>
-          <w:szCs w:val="22"/>
-          <w:lang w:val="en-US"/>
-        </w:rPr>
-        <w:t>range usua</w:t>
-      </w:r>
-      <w:r>
-        <w:rPr>
-          <w:rFonts w:ascii="Century Gothic" w:hAnsi="Century Gothic"/>
-          <w:sz w:val="22"/>
-          <w:szCs w:val="22"/>
-          <w:lang w:val="en-US"/>
-        </w:rPr>
-        <w:t>l</w:t>
-      </w:r>
-      <w:r>
-        <w:rPr>
-          <w:rFonts w:ascii="Century Gothic" w:hAnsi="Century Gothic"/>
-          <w:sz w:val="22"/>
-          <w:szCs w:val="22"/>
-          <w:lang w:val="en-US"/>
-        </w:rPr>
-        <w:t xml:space="preserve">ly met in clinical practice is [4-7]Hz. </w:t>
+    </w:p>
+    <w:p>
+      <w:pPr>
+        <w:jc w:val="both"/>
+        <w:rPr>
+          <w:rFonts w:ascii="Century Gothic" w:hAnsi="Century Gothic"/>
+          <w:sz w:val="22"/>
+          <w:szCs w:val="22"/>
+          <w:lang w:val="en-US"/>
+        </w:rPr>
+      </w:pPr>
+      <w:r>
+        <w:rPr>
+          <w:rFonts w:ascii="Century Gothic" w:hAnsi="Century Gothic"/>
+          <w:b/>
+          <w:sz w:val="22"/>
+          <w:szCs w:val="22"/>
+          <w:lang w:val="en-US"/>
+        </w:rPr>
+        <w:t>Q1.1.</w:t>
       </w:r>
       <w:r>
         <w:rPr>
@@ -1671,26 +1572,65 @@
         </w:rPr>
         <w:t xml:space="preserve"> </w:t>
       </w:r>
-    </w:p>
-    <w:p>
-      <w:pPr>
-        <w:jc w:val="both"/>
-        <w:rPr>
-          <w:rFonts w:ascii="Century Gothic" w:hAnsi="Century Gothic"/>
-          <w:sz w:val="22"/>
-          <w:szCs w:val="22"/>
-          <w:lang w:val="en-US"/>
-        </w:rPr>
-      </w:pPr>
-      <w:r>
-        <w:rPr>
-          <w:rFonts w:ascii="Century Gothic" w:hAnsi="Century Gothic"/>
-          <w:b/>
-          <w:sz w:val="22"/>
-          <w:szCs w:val="22"/>
-          <w:lang w:val="en-US"/>
-        </w:rPr>
-        <w:t>Q1.1.</w:t>
+      <w:r>
+        <w:rPr>
+          <w:rFonts w:ascii="Century Gothic" w:hAnsi="Century Gothic"/>
+          <w:sz w:val="22"/>
+          <w:szCs w:val="22"/>
+          <w:lang w:val="en-US"/>
+        </w:rPr>
+        <w:t>Is the frequency response of the filter adequate?</w:t>
+      </w:r>
+    </w:p>
+    <w:p>
+      <w:pPr>
+        <w:jc w:val="both"/>
+        <w:rPr>
+          <w:rFonts w:ascii="Century Gothic" w:hAnsi="Century Gothic"/>
+          <w:sz w:val="22"/>
+          <w:szCs w:val="22"/>
+          <w:lang w:val="en-US"/>
+        </w:rPr>
+      </w:pPr>
+    </w:p>
+    <w:p>
+      <w:pPr>
+        <w:jc w:val="both"/>
+        <w:rPr>
+          <w:rFonts w:ascii="Century Gothic" w:hAnsi="Century Gothic"/>
+          <w:sz w:val="22"/>
+          <w:szCs w:val="22"/>
+          <w:lang w:val="en-US"/>
+        </w:rPr>
+      </w:pPr>
+      <w:r>
+        <w:rPr>
+          <w:rFonts w:ascii="Century Gothic" w:hAnsi="Century Gothic"/>
+          <w:sz w:val="22"/>
+          <w:szCs w:val="22"/>
+          <w:lang w:val="en-US"/>
+        </w:rPr>
+        <w:t>The filter’s amplitude response shows a flat passband between 4–7 Hz, matching the expected atrial fibrillation (AF) frequency range.</w:t>
+      </w:r>
+    </w:p>
+    <w:p>
+      <w:pPr>
+        <w:jc w:val="both"/>
+        <w:rPr>
+          <w:rFonts w:ascii="Century Gothic" w:hAnsi="Century Gothic"/>
+          <w:sz w:val="22"/>
+          <w:szCs w:val="22"/>
+          <w:lang w:val="en-US"/>
+        </w:rPr>
+      </w:pPr>
+      <w:r>
+        <w:rPr>
+          <w:rFonts w:ascii="Century Gothic" w:hAnsi="Century Gothic"/>
+          <w:sz w:val="22"/>
+          <w:szCs w:val="22"/>
+          <w:lang w:val="en-US"/>
+        </w:rPr>
+        <w:t>Low (&lt; 3.5 Hz) and high (&gt; 7.5 Hz) frequencies are strongly attenuated, minimizing baseline drift and noise.</w:t>
       </w:r>
       <w:r>
         <w:rPr>
@@ -1708,95 +1648,47 @@
           <w:szCs w:val="22"/>
           <w:lang w:val="en-US"/>
         </w:rPr>
-        <w:t>Is the frequency response of the filter adequate?</w:t>
-      </w:r>
-    </w:p>
-    <w:p>
-      <w:pPr>
-        <w:jc w:val="both"/>
-        <w:rPr>
-          <w:rFonts w:ascii="Century Gothic" w:hAnsi="Century Gothic"/>
-          <w:sz w:val="22"/>
-          <w:szCs w:val="22"/>
-          <w:lang w:val="en-US"/>
-        </w:rPr>
-      </w:pPr>
-    </w:p>
-    <w:p>
-      <w:pPr>
-        <w:jc w:val="both"/>
-        <w:rPr>
-          <w:rFonts w:ascii="Century Gothic" w:hAnsi="Century Gothic"/>
-          <w:sz w:val="22"/>
-          <w:szCs w:val="22"/>
-          <w:lang w:val="en-US"/>
-        </w:rPr>
-      </w:pPr>
-      <w:r>
-        <w:rPr>
-          <w:rFonts w:ascii="Century Gothic" w:hAnsi="Century Gothic"/>
-          <w:sz w:val="22"/>
-          <w:szCs w:val="22"/>
-          <w:lang w:val="en-US"/>
-        </w:rPr>
-        <w:t>The filter’s amplitude response shows a flat passband between 4–7 Hz, matching the expected atrial fibrillation (AF) frequency range.</w:t>
-      </w:r>
-    </w:p>
-    <w:p>
-      <w:pPr>
-        <w:jc w:val="both"/>
-        <w:rPr>
-          <w:rFonts w:ascii="Century Gothic" w:hAnsi="Century Gothic"/>
-          <w:sz w:val="22"/>
-          <w:szCs w:val="22"/>
-          <w:lang w:val="en-US"/>
-        </w:rPr>
-      </w:pPr>
-      <w:r>
-        <w:rPr>
-          <w:rFonts w:ascii="Century Gothic" w:hAnsi="Century Gothic"/>
-          <w:sz w:val="22"/>
-          <w:szCs w:val="22"/>
-          <w:lang w:val="en-US"/>
-        </w:rPr>
-        <w:t>Low (&lt; 3.5 Hz) and high (&gt; 7.5 Hz) frequencies are strongly attenuated, minimizing baseline drift and noise.</w:t>
-      </w:r>
-      <w:r>
-        <w:rPr>
-          <w:rFonts w:ascii="Century Gothic" w:hAnsi="Century Gothic"/>
+        <w:t xml:space="preserve">The transition bands are steep and the gain in the passband </w:t>
+      </w:r>
+      <w:r>
+        <w:rPr>
+          <w:rFonts w:ascii="Century Gothic" w:hAnsi="Century Gothic"/>
+          <w:sz w:val="22"/>
+          <w:szCs w:val="22"/>
+          <w:lang w:val="en-US"/>
+        </w:rPr>
+        <w:t>is</w:t>
+      </w:r>
+      <w:r>
+        <w:rPr>
+          <w:rFonts w:ascii="Century Gothic" w:hAnsi="Century Gothic"/>
+          <w:sz w:val="22"/>
+          <w:szCs w:val="22"/>
+          <w:lang w:val="en-US"/>
+        </w:rPr>
+        <w:t xml:space="preserve"> 1, so the filter is well-suited for isolating the atrial activity.</w:t>
+      </w:r>
+      <w:r>
+        <w:rPr>
+          <w:rFonts w:ascii="Century Gothic" w:hAnsi="Century Gothic"/>
+          <w:noProof/>
           <w:sz w:val="22"/>
           <w:szCs w:val="22"/>
           <w:lang w:val="en-US"/>
         </w:rPr>
         <w:t xml:space="preserve"> </w:t>
       </w:r>
-      <w:r>
-        <w:rPr>
-          <w:rFonts w:ascii="Century Gothic" w:hAnsi="Century Gothic"/>
-          <w:sz w:val="22"/>
-          <w:szCs w:val="22"/>
-          <w:lang w:val="en-US"/>
-        </w:rPr>
-        <w:t xml:space="preserve">The transition bands are steep and the gain in the passband </w:t>
-      </w:r>
-      <w:r>
-        <w:rPr>
-          <w:rFonts w:ascii="Century Gothic" w:hAnsi="Century Gothic"/>
-          <w:sz w:val="22"/>
-          <w:szCs w:val="22"/>
-          <w:lang w:val="en-US"/>
-        </w:rPr>
-        <w:t>is</w:t>
-      </w:r>
-      <w:r>
-        <w:rPr>
-          <w:rFonts w:ascii="Century Gothic" w:hAnsi="Century Gothic"/>
-          <w:sz w:val="22"/>
-          <w:szCs w:val="22"/>
-          <w:lang w:val="en-US"/>
-        </w:rPr>
-        <w:t xml:space="preserve"> 1, so the filter is well-suited for isolating the atrial activity.</w:t>
-      </w:r>
+    </w:p>
+    <w:p>
+      <w:pPr>
+        <w:jc w:val="both"/>
+        <w:rPr>
+          <w:rFonts w:ascii="Century Gothic" w:hAnsi="Century Gothic"/>
+          <w:sz w:val="22"/>
+          <w:szCs w:val="22"/>
+          <w:lang w:val="en-US"/>
+        </w:rPr>
+      </w:pPr>
       <w:r>
         <w:rPr>
           <w:rFonts w:ascii="Century Gothic" w:hAnsi="Century Gothic"/>
@@ -1805,29 +1697,9 @@
           <w:szCs w:val="22"/>
           <w:lang w:val="en-US"/>
         </w:rPr>
-        <w:t xml:space="preserve"> </w:t>
-      </w:r>
-    </w:p>
-    <w:p>
-      <w:pPr>
-        <w:jc w:val="both"/>
-        <w:rPr>
-          <w:rFonts w:ascii="Century Gothic" w:hAnsi="Century Gothic"/>
-          <w:sz w:val="22"/>
-          <w:szCs w:val="22"/>
-          <w:lang w:val="en-US"/>
-        </w:rPr>
-      </w:pPr>
-      <w:r>
-        <w:rPr>
-          <w:rFonts w:ascii="Century Gothic" w:hAnsi="Century Gothic"/>
-          <w:noProof/>
-          <w:sz w:val="22"/>
-          <w:szCs w:val="22"/>
-          <w:lang w:val="en-US"/>
-        </w:rPr>
+        <w:lastRenderedPageBreak/>
         <w:pict w14:anchorId="2CA5FA60">
-          <v:shapetype id="_x0000_t75" coordsize="21600,21600" filled="f" stroked="f" o:spt="75" o:preferrelative="t" path="m@4@5l@4@11@9@11@9@5xe">
+          <v:shapetype id="_x0000_t75" coordsize="21600,21600" o:spt="75" o:preferrelative="t" path="m@4@5l@4@11@9@11@9@5xe" filled="f" stroked="f">
             <v:stroke joinstyle="miter"/>
             <v:formulas>
               <v:f eqn="if lineDrawn pixelLineWidth 0"/>
@@ -1843,11 +1715,11 @@
               <v:f eqn="prod @7 21600 pixelHeight"/>
               <v:f eqn="sum @10 21600 0"/>
             </v:formulas>
-            <v:path gradientshapeok="t" o:connecttype="rect" o:extrusionok="f"/>
+            <v:path o:extrusionok="f" gradientshapeok="t" o:connecttype="rect"/>
             <o:lock v:ext="edit" aspectratio="t"/>
           </v:shapetype>
-          <v:shape id="Image 1" style="width:171.75pt;height:99pt;visibility:visible" o:spid="_x0000_i1025" type="#_x0000_t75">
-            <v:imagedata o:title="" r:id="rId5"/>
+          <v:shape id="Image 1" o:spid="_x0000_i1025" type="#_x0000_t75" style="width:172.45pt;height:98.8pt;visibility:visible">
+            <v:imagedata r:id="rId5" o:title=""/>
           </v:shape>
         </w:pict>
       </w:r>
@@ -1930,10 +1802,10 @@
     </w:p>
     <w:p>
       <w:pPr>
-        <w:pStyle w:val="Heading1"/>
-        <w:jc w:val="both"/>
-        <w:rPr>
-          <w:rFonts w:ascii="Courier New" w:hAnsi="Courier New" w:eastAsia="Calibri" w:cs="Courier New"/>
+        <w:pStyle w:val="Titre1"/>
+        <w:jc w:val="both"/>
+        <w:rPr>
+          <w:rFonts w:ascii="Courier New" w:eastAsia="Calibri" w:hAnsi="Courier New" w:cs="Courier New"/>
           <w:b w:val="0"/>
           <w:bCs w:val="0"/>
           <w:szCs w:val="24"/>
@@ -1942,7 +1814,7 @@
       </w:pPr>
       <w:r>
         <w:rPr>
-          <w:rFonts w:ascii="Courier New" w:hAnsi="Courier New" w:eastAsia="Calibri" w:cs="Courier New"/>
+          <w:rFonts w:ascii="Courier New" w:eastAsia="Calibri" w:hAnsi="Courier New" w:cs="Courier New"/>
           <w:b w:val="0"/>
           <w:bCs w:val="0"/>
           <w:szCs w:val="24"/>
@@ -1953,7 +1825,7 @@
       <w:proofErr w:type="spellStart"/>
       <w:r>
         <w:rPr>
-          <w:rFonts w:ascii="Courier New" w:hAnsi="Courier New" w:eastAsia="Calibri" w:cs="Courier New"/>
+          <w:rFonts w:ascii="Courier New" w:eastAsia="Calibri" w:hAnsi="Courier New" w:cs="Courier New"/>
           <w:b w:val="0"/>
           <w:bCs w:val="0"/>
           <w:szCs w:val="24"/>
@@ -1964,7 +1836,7 @@
       <w:proofErr w:type="spellEnd"/>
       <w:r>
         <w:rPr>
-          <w:rFonts w:ascii="Courier New" w:hAnsi="Courier New" w:eastAsia="Calibri" w:cs="Courier New"/>
+          <w:rFonts w:ascii="Courier New" w:eastAsia="Calibri" w:hAnsi="Courier New" w:cs="Courier New"/>
           <w:b w:val="0"/>
           <w:bCs w:val="0"/>
           <w:szCs w:val="24"/>
@@ -1975,7 +1847,7 @@
       <w:proofErr w:type="spellStart"/>
       <w:r>
         <w:rPr>
-          <w:rFonts w:ascii="Courier New" w:hAnsi="Courier New" w:eastAsia="Calibri" w:cs="Courier New"/>
+          <w:rFonts w:ascii="Courier New" w:eastAsia="Calibri" w:hAnsi="Courier New" w:cs="Courier New"/>
           <w:b w:val="0"/>
           <w:bCs w:val="0"/>
           <w:szCs w:val="24"/>
@@ -1986,7 +1858,7 @@
       <w:proofErr w:type="spellEnd"/>
       <w:r>
         <w:rPr>
-          <w:rFonts w:ascii="Courier New" w:hAnsi="Courier New" w:eastAsia="Calibri" w:cs="Courier New"/>
+          <w:rFonts w:ascii="Courier New" w:eastAsia="Calibri" w:hAnsi="Courier New" w:cs="Courier New"/>
           <w:b w:val="0"/>
           <w:bCs w:val="0"/>
           <w:szCs w:val="24"/>
@@ -1997,10 +1869,10 @@
     </w:p>
     <w:p>
       <w:pPr>
-        <w:pStyle w:val="Heading1"/>
-        <w:jc w:val="both"/>
-        <w:rPr>
-          <w:rFonts w:ascii="Courier New" w:hAnsi="Courier New" w:eastAsia="Calibri" w:cs="Courier New"/>
+        <w:pStyle w:val="Titre1"/>
+        <w:jc w:val="both"/>
+        <w:rPr>
+          <w:rFonts w:ascii="Courier New" w:eastAsia="Calibri" w:hAnsi="Courier New" w:cs="Courier New"/>
           <w:b w:val="0"/>
           <w:bCs w:val="0"/>
           <w:szCs w:val="24"/>
@@ -2009,7 +1881,7 @@
       </w:pPr>
       <w:r>
         <w:rPr>
-          <w:rFonts w:ascii="Courier New" w:hAnsi="Courier New" w:eastAsia="Calibri" w:cs="Courier New"/>
+          <w:rFonts w:ascii="Courier New" w:eastAsia="Calibri" w:hAnsi="Courier New" w:cs="Courier New"/>
           <w:b w:val="0"/>
           <w:bCs w:val="0"/>
           <w:szCs w:val="24"/>
@@ -2019,7 +1891,7 @@
       </w:r>
       <w:r>
         <w:rPr>
-          <w:rFonts w:ascii="Courier New" w:hAnsi="Courier New" w:eastAsia="Calibri" w:cs="Courier New"/>
+          <w:rFonts w:ascii="Courier New" w:eastAsia="Calibri" w:hAnsi="Courier New" w:cs="Courier New"/>
           <w:b w:val="0"/>
           <w:bCs w:val="0"/>
           <w:szCs w:val="24"/>
@@ -2030,7 +1902,7 @@
       <w:proofErr w:type="spellStart"/>
       <w:r>
         <w:rPr>
-          <w:rFonts w:ascii="Courier New" w:hAnsi="Courier New" w:eastAsia="Calibri" w:cs="Courier New"/>
+          <w:rFonts w:ascii="Courier New" w:eastAsia="Calibri" w:hAnsi="Courier New" w:cs="Courier New"/>
           <w:b w:val="0"/>
           <w:bCs w:val="0"/>
           <w:szCs w:val="24"/>
@@ -2041,7 +1913,7 @@
       <w:proofErr w:type="spellEnd"/>
       <w:r>
         <w:rPr>
-          <w:rFonts w:ascii="Courier New" w:hAnsi="Courier New" w:eastAsia="Calibri" w:cs="Courier New"/>
+          <w:rFonts w:ascii="Courier New" w:eastAsia="Calibri" w:hAnsi="Courier New" w:cs="Courier New"/>
           <w:b w:val="0"/>
           <w:bCs w:val="0"/>
           <w:szCs w:val="24"/>
@@ -2051,7 +1923,7 @@
       </w:r>
       <w:r>
         <w:rPr>
-          <w:rFonts w:ascii="Courier New" w:hAnsi="Courier New" w:eastAsia="Calibri" w:cs="Courier New"/>
+          <w:rFonts w:ascii="Courier New" w:eastAsia="Calibri" w:hAnsi="Courier New" w:cs="Courier New"/>
           <w:b w:val="0"/>
           <w:bCs w:val="0"/>
           <w:szCs w:val="24"/>
@@ -2061,7 +1933,7 @@
       </w:r>
       <w:r>
         <w:rPr>
-          <w:rFonts w:ascii="Courier New" w:hAnsi="Courier New" w:eastAsia="Calibri" w:cs="Courier New"/>
+          <w:rFonts w:ascii="Courier New" w:eastAsia="Calibri" w:hAnsi="Courier New" w:cs="Courier New"/>
           <w:b w:val="0"/>
           <w:bCs w:val="0"/>
           <w:szCs w:val="24"/>
@@ -2184,17 +2056,17 @@
     </w:p>
     <w:p>
       <w:pPr>
-        <w:pStyle w:val="Heading1"/>
-        <w:jc w:val="both"/>
-        <w:rPr>
-          <w:rFonts w:ascii="Courier New" w:hAnsi="Courier New" w:eastAsia="Calibri" w:cs="Courier New"/>
+        <w:pStyle w:val="Titre1"/>
+        <w:jc w:val="both"/>
+        <w:rPr>
+          <w:rFonts w:ascii="Courier New" w:eastAsia="Calibri" w:hAnsi="Courier New" w:cs="Courier New"/>
           <w:b w:val="0"/>
           <w:bCs w:val="0"/>
         </w:rPr>
       </w:pPr>
       <w:r>
         <w:rPr>
-          <w:rFonts w:ascii="Courier New" w:hAnsi="Courier New" w:eastAsia="Calibri" w:cs="Courier New"/>
+          <w:rFonts w:ascii="Courier New" w:eastAsia="Calibri" w:hAnsi="Courier New" w:cs="Courier New"/>
           <w:b w:val="0"/>
           <w:bCs w:val="0"/>
         </w:rPr>
@@ -2202,7 +2074,7 @@
       </w:r>
       <w:r>
         <w:rPr>
-          <w:rFonts w:ascii="Courier New" w:hAnsi="Courier New" w:eastAsia="Calibri" w:cs="Courier New"/>
+          <w:rFonts w:ascii="Courier New" w:eastAsia="Calibri" w:hAnsi="Courier New" w:cs="Courier New"/>
           <w:b w:val="0"/>
           <w:bCs w:val="0"/>
         </w:rPr>
@@ -2211,7 +2083,7 @@
       <w:proofErr w:type="spellStart"/>
       <w:r>
         <w:rPr>
-          <w:rFonts w:ascii="Courier New" w:hAnsi="Courier New" w:eastAsia="Calibri" w:cs="Courier New"/>
+          <w:rFonts w:ascii="Courier New" w:eastAsia="Calibri" w:hAnsi="Courier New" w:cs="Courier New"/>
           <w:b w:val="0"/>
           <w:bCs w:val="0"/>
         </w:rPr>
@@ -2220,7 +2092,7 @@
       <w:proofErr w:type="spellEnd"/>
       <w:r>
         <w:rPr>
-          <w:rFonts w:ascii="Courier New" w:hAnsi="Courier New" w:eastAsia="Calibri" w:cs="Courier New"/>
+          <w:rFonts w:ascii="Courier New" w:eastAsia="Calibri" w:hAnsi="Courier New" w:cs="Courier New"/>
           <w:b w:val="0"/>
           <w:bCs w:val="0"/>
         </w:rPr>
@@ -2229,7 +2101,7 @@
       <w:proofErr w:type="spellStart"/>
       <w:r>
         <w:rPr>
-          <w:rFonts w:ascii="Courier New" w:hAnsi="Courier New" w:eastAsia="Calibri" w:cs="Courier New"/>
+          <w:rFonts w:ascii="Courier New" w:eastAsia="Calibri" w:hAnsi="Courier New" w:cs="Courier New"/>
           <w:b w:val="0"/>
           <w:bCs w:val="0"/>
         </w:rPr>
@@ -2238,7 +2110,7 @@
       <w:proofErr w:type="spellEnd"/>
       <w:r>
         <w:rPr>
-          <w:rFonts w:ascii="Courier New" w:hAnsi="Courier New" w:eastAsia="Calibri" w:cs="Courier New"/>
+          <w:rFonts w:ascii="Courier New" w:eastAsia="Calibri" w:hAnsi="Courier New" w:cs="Courier New"/>
           <w:b w:val="0"/>
           <w:bCs w:val="0"/>
         </w:rPr>
@@ -2247,7 +2119,7 @@
       <w:proofErr w:type="spellStart"/>
       <w:r>
         <w:rPr>
-          <w:rFonts w:ascii="Courier New" w:hAnsi="Courier New" w:eastAsia="Calibri" w:cs="Courier New"/>
+          <w:rFonts w:ascii="Courier New" w:eastAsia="Calibri" w:hAnsi="Courier New" w:cs="Courier New"/>
           <w:b w:val="0"/>
           <w:bCs w:val="0"/>
         </w:rPr>
@@ -2256,7 +2128,7 @@
       <w:proofErr w:type="spellEnd"/>
       <w:r>
         <w:rPr>
-          <w:rFonts w:ascii="Courier New" w:hAnsi="Courier New" w:eastAsia="Calibri" w:cs="Courier New"/>
+          <w:rFonts w:ascii="Courier New" w:eastAsia="Calibri" w:hAnsi="Courier New" w:cs="Courier New"/>
           <w:b w:val="0"/>
           <w:bCs w:val="0"/>
         </w:rPr>
@@ -2264,7 +2136,7 @@
       </w:r>
       <w:r>
         <w:rPr>
-          <w:rFonts w:ascii="Courier New" w:hAnsi="Courier New" w:eastAsia="Calibri" w:cs="Courier New"/>
+          <w:rFonts w:ascii="Courier New" w:eastAsia="Calibri" w:hAnsi="Courier New" w:cs="Courier New"/>
           <w:b w:val="0"/>
           <w:bCs w:val="0"/>
         </w:rPr>
@@ -2272,7 +2144,7 @@
       </w:r>
       <w:r>
         <w:rPr>
-          <w:rFonts w:ascii="Courier New" w:hAnsi="Courier New" w:eastAsia="Calibri" w:cs="Courier New"/>
+          <w:rFonts w:ascii="Courier New" w:eastAsia="Calibri" w:hAnsi="Courier New" w:cs="Courier New"/>
           <w:b w:val="0"/>
           <w:bCs w:val="0"/>
         </w:rPr>
@@ -2280,7 +2152,7 @@
       </w:r>
       <w:r>
         <w:rPr>
-          <w:rFonts w:ascii="Courier New" w:hAnsi="Courier New" w:eastAsia="Calibri" w:cs="Courier New"/>
+          <w:rFonts w:ascii="Courier New" w:eastAsia="Calibri" w:hAnsi="Courier New" w:cs="Courier New"/>
           <w:b w:val="0"/>
           <w:bCs w:val="0"/>
         </w:rPr>
@@ -2288,7 +2160,7 @@
       </w:r>
       <w:r>
         <w:rPr>
-          <w:rFonts w:ascii="Courier New" w:hAnsi="Courier New" w:eastAsia="Calibri" w:cs="Courier New"/>
+          <w:rFonts w:ascii="Courier New" w:eastAsia="Calibri" w:hAnsi="Courier New" w:cs="Courier New"/>
           <w:b w:val="0"/>
           <w:bCs w:val="0"/>
         </w:rPr>
@@ -2296,7 +2168,7 @@
       </w:r>
       <w:r>
         <w:rPr>
-          <w:rFonts w:ascii="Courier New" w:hAnsi="Courier New" w:eastAsia="Calibri" w:cs="Courier New"/>
+          <w:rFonts w:ascii="Courier New" w:eastAsia="Calibri" w:hAnsi="Courier New" w:cs="Courier New"/>
           <w:b w:val="0"/>
           <w:bCs w:val="0"/>
         </w:rPr>
@@ -2304,7 +2176,7 @@
       </w:r>
       <w:r>
         <w:rPr>
-          <w:rFonts w:ascii="Courier New" w:hAnsi="Courier New" w:eastAsia="Calibri" w:cs="Courier New"/>
+          <w:rFonts w:ascii="Courier New" w:eastAsia="Calibri" w:hAnsi="Courier New" w:cs="Courier New"/>
           <w:b w:val="0"/>
           <w:bCs w:val="0"/>
         </w:rPr>
@@ -3206,8 +3078,8 @@
           <w:lang w:val="en-US"/>
         </w:rPr>
         <w:pict w14:anchorId="7125ACBD">
-          <v:shape id="_x0000_i1026" style="width:226.5pt;height:127.5pt;visibility:visible" type="#_x0000_t75">
-            <v:imagedata o:title="" r:id="rId6"/>
+          <v:shape id="_x0000_i1026" type="#_x0000_t75" style="width:226.05pt;height:127.25pt;visibility:visible">
+            <v:imagedata r:id="rId6" o:title=""/>
           </v:shape>
         </w:pict>
       </w:r>
@@ -3218,8 +3090,8 @@
           <w:lang w:val="en-US"/>
         </w:rPr>
         <w:pict w14:anchorId="25857936">
-          <v:shape id="_x0000_i1027" style="width:224.25pt;height:124.5pt;visibility:visible" type="#_x0000_t75">
-            <v:imagedata o:title="" r:id="rId7"/>
+          <v:shape id="_x0000_i1027" type="#_x0000_t75" style="width:224.35pt;height:124.75pt;visibility:visible">
+            <v:imagedata r:id="rId7" o:title=""/>
           </v:shape>
         </w:pict>
       </w:r>
@@ -3244,7 +3116,7 @@
     </w:p>
     <w:p>
       <w:pPr>
-        <w:pStyle w:val="Heading2"/>
+        <w:pStyle w:val="Titre2"/>
         <w:rPr>
           <w:rFonts w:ascii="Century Gothic" w:hAnsi="Century Gothic"/>
           <w:szCs w:val="24"/>
@@ -3332,6 +3204,7 @@
           <w:szCs w:val="22"/>
           <w:lang w:val="en-US"/>
         </w:rPr>
+        <w:lastRenderedPageBreak/>
         <w:t>RSA is the modulation of RR intervals induced by respiration. VO2 max is the maximum rate of oxygen consumption during an incremental effort. It is an important indicator of physical fitness, especially with regard to endurance capacity.</w:t>
       </w:r>
       <w:r>
@@ -3876,10 +3749,10 @@
     </w:p>
     <w:p>
       <w:pPr>
-        <w:pStyle w:val="Heading1"/>
-        <w:jc w:val="both"/>
-        <w:rPr>
-          <w:rFonts w:ascii="Courier New" w:hAnsi="Courier New" w:eastAsia="Calibri" w:cs="Courier New"/>
+        <w:pStyle w:val="Titre1"/>
+        <w:jc w:val="both"/>
+        <w:rPr>
+          <w:rFonts w:ascii="Courier New" w:eastAsia="Calibri" w:hAnsi="Courier New" w:cs="Courier New"/>
           <w:b w:val="0"/>
           <w:bCs w:val="0"/>
           <w:szCs w:val="24"/>
@@ -3888,7 +3761,7 @@
       </w:pPr>
       <w:r>
         <w:rPr>
-          <w:rFonts w:ascii="Courier New" w:hAnsi="Courier New" w:eastAsia="Calibri" w:cs="Courier New"/>
+          <w:rFonts w:ascii="Courier New" w:eastAsia="Calibri" w:hAnsi="Courier New" w:cs="Courier New"/>
           <w:b w:val="0"/>
           <w:bCs w:val="0"/>
           <w:szCs w:val="24"/>
@@ -3899,7 +3772,7 @@
       <w:proofErr w:type="spellStart"/>
       <w:r>
         <w:rPr>
-          <w:rFonts w:ascii="Courier New" w:hAnsi="Courier New" w:eastAsia="Calibri" w:cs="Courier New"/>
+          <w:rFonts w:ascii="Courier New" w:eastAsia="Calibri" w:hAnsi="Courier New" w:cs="Courier New"/>
           <w:b w:val="0"/>
           <w:bCs w:val="0"/>
           <w:szCs w:val="24"/>
@@ -3909,7 +3782,7 @@
       </w:r>
       <w:r>
         <w:rPr>
-          <w:rFonts w:ascii="Courier New" w:hAnsi="Courier New" w:eastAsia="Calibri" w:cs="Courier New"/>
+          <w:rFonts w:ascii="Courier New" w:eastAsia="Calibri" w:hAnsi="Courier New" w:cs="Courier New"/>
           <w:b w:val="0"/>
           <w:bCs w:val="0"/>
           <w:szCs w:val="24"/>
@@ -3919,7 +3792,7 @@
       </w:r>
       <w:r>
         <w:rPr>
-          <w:rFonts w:ascii="Courier New" w:hAnsi="Courier New" w:eastAsia="Calibri" w:cs="Courier New"/>
+          <w:rFonts w:ascii="Courier New" w:eastAsia="Calibri" w:hAnsi="Courier New" w:cs="Courier New"/>
           <w:b w:val="0"/>
           <w:bCs w:val="0"/>
           <w:szCs w:val="24"/>
@@ -3930,7 +3803,7 @@
       <w:proofErr w:type="spellEnd"/>
       <w:r>
         <w:rPr>
-          <w:rFonts w:ascii="Courier New" w:hAnsi="Courier New" w:eastAsia="Calibri" w:cs="Courier New"/>
+          <w:rFonts w:ascii="Courier New" w:eastAsia="Calibri" w:hAnsi="Courier New" w:cs="Courier New"/>
           <w:b w:val="0"/>
           <w:bCs w:val="0"/>
           <w:szCs w:val="24"/>
@@ -3941,7 +3814,7 @@
       <w:proofErr w:type="spellStart"/>
       <w:r>
         <w:rPr>
-          <w:rFonts w:ascii="Courier New" w:hAnsi="Courier New" w:eastAsia="Calibri" w:cs="Courier New"/>
+          <w:rFonts w:ascii="Courier New" w:eastAsia="Calibri" w:hAnsi="Courier New" w:cs="Courier New"/>
           <w:b w:val="0"/>
           <w:bCs w:val="0"/>
           <w:szCs w:val="24"/>
@@ -3952,7 +3825,7 @@
       <w:proofErr w:type="spellEnd"/>
       <w:r>
         <w:rPr>
-          <w:rFonts w:ascii="Courier New" w:hAnsi="Courier New" w:eastAsia="Calibri" w:cs="Courier New"/>
+          <w:rFonts w:ascii="Courier New" w:eastAsia="Calibri" w:hAnsi="Courier New" w:cs="Courier New"/>
           <w:b w:val="0"/>
           <w:bCs w:val="0"/>
           <w:szCs w:val="24"/>
@@ -3962,7 +3835,7 @@
       </w:r>
       <w:r>
         <w:rPr>
-          <w:rFonts w:ascii="Courier New" w:hAnsi="Courier New" w:eastAsia="Calibri" w:cs="Courier New"/>
+          <w:rFonts w:ascii="Courier New" w:eastAsia="Calibri" w:hAnsi="Courier New" w:cs="Courier New"/>
           <w:b w:val="0"/>
           <w:bCs w:val="0"/>
           <w:szCs w:val="24"/>
@@ -3972,7 +3845,7 @@
       </w:r>
       <w:r>
         <w:rPr>
-          <w:rFonts w:ascii="Courier New" w:hAnsi="Courier New" w:eastAsia="Calibri" w:cs="Courier New"/>
+          <w:rFonts w:ascii="Courier New" w:eastAsia="Calibri" w:hAnsi="Courier New" w:cs="Courier New"/>
           <w:b w:val="0"/>
           <w:bCs w:val="0"/>
           <w:szCs w:val="24"/>
@@ -3982,7 +3855,7 @@
       </w:r>
       <w:r>
         <w:rPr>
-          <w:rFonts w:ascii="Courier New" w:hAnsi="Courier New" w:eastAsia="Calibri" w:cs="Courier New"/>
+          <w:rFonts w:ascii="Courier New" w:eastAsia="Calibri" w:hAnsi="Courier New" w:cs="Courier New"/>
           <w:b w:val="0"/>
           <w:bCs w:val="0"/>
           <w:szCs w:val="24"/>
@@ -3992,7 +3865,7 @@
       </w:r>
       <w:r>
         <w:rPr>
-          <w:rFonts w:ascii="Courier New" w:hAnsi="Courier New" w:eastAsia="Calibri" w:cs="Courier New"/>
+          <w:rFonts w:ascii="Courier New" w:eastAsia="Calibri" w:hAnsi="Courier New" w:cs="Courier New"/>
           <w:b w:val="0"/>
           <w:bCs w:val="0"/>
           <w:szCs w:val="24"/>
@@ -4003,17 +3876,17 @@
     </w:p>
     <w:p>
       <w:pPr>
-        <w:pStyle w:val="Heading1"/>
-        <w:jc w:val="both"/>
-        <w:rPr>
-          <w:rFonts w:ascii="Courier New" w:hAnsi="Courier New" w:eastAsia="Calibri" w:cs="Courier New"/>
+        <w:pStyle w:val="Titre1"/>
+        <w:jc w:val="both"/>
+        <w:rPr>
+          <w:rFonts w:ascii="Courier New" w:eastAsia="Calibri" w:hAnsi="Courier New" w:cs="Courier New"/>
           <w:b w:val="0"/>
           <w:bCs w:val="0"/>
         </w:rPr>
       </w:pPr>
       <w:r>
         <w:rPr>
-          <w:rFonts w:ascii="Courier New" w:hAnsi="Courier New" w:eastAsia="Calibri" w:cs="Courier New"/>
+          <w:rFonts w:ascii="Courier New" w:eastAsia="Calibri" w:hAnsi="Courier New" w:cs="Courier New"/>
           <w:b w:val="0"/>
           <w:bCs w:val="0"/>
         </w:rPr>
@@ -4022,7 +3895,7 @@
       <w:proofErr w:type="spellStart"/>
       <w:r>
         <w:rPr>
-          <w:rFonts w:ascii="Courier New" w:hAnsi="Courier New" w:eastAsia="Calibri" w:cs="Courier New"/>
+          <w:rFonts w:ascii="Courier New" w:eastAsia="Calibri" w:hAnsi="Courier New" w:cs="Courier New"/>
           <w:b w:val="0"/>
           <w:bCs w:val="0"/>
         </w:rPr>
@@ -4031,7 +3904,7 @@
       <w:proofErr w:type="spellEnd"/>
       <w:r>
         <w:rPr>
-          <w:rFonts w:ascii="Courier New" w:hAnsi="Courier New" w:eastAsia="Calibri" w:cs="Courier New"/>
+          <w:rFonts w:ascii="Courier New" w:eastAsia="Calibri" w:hAnsi="Courier New" w:cs="Courier New"/>
           <w:b w:val="0"/>
           <w:bCs w:val="0"/>
         </w:rPr>
@@ -4040,7 +3913,7 @@
       <w:proofErr w:type="spellStart"/>
       <w:r>
         <w:rPr>
-          <w:rFonts w:ascii="Courier New" w:hAnsi="Courier New" w:eastAsia="Calibri" w:cs="Courier New"/>
+          <w:rFonts w:ascii="Courier New" w:eastAsia="Calibri" w:hAnsi="Courier New" w:cs="Courier New"/>
           <w:b w:val="0"/>
           <w:bCs w:val="0"/>
         </w:rPr>
@@ -4048,7 +3921,7 @@
       </w:r>
       <w:r>
         <w:rPr>
-          <w:rFonts w:ascii="Courier New" w:hAnsi="Courier New" w:eastAsia="Calibri" w:cs="Courier New"/>
+          <w:rFonts w:ascii="Courier New" w:eastAsia="Calibri" w:hAnsi="Courier New" w:cs="Courier New"/>
           <w:b w:val="0"/>
           <w:bCs w:val="0"/>
         </w:rPr>
@@ -4056,7 +3929,7 @@
       </w:r>
       <w:r>
         <w:rPr>
-          <w:rFonts w:ascii="Courier New" w:hAnsi="Courier New" w:eastAsia="Calibri" w:cs="Courier New"/>
+          <w:rFonts w:ascii="Courier New" w:eastAsia="Calibri" w:hAnsi="Courier New" w:cs="Courier New"/>
           <w:b w:val="0"/>
           <w:bCs w:val="0"/>
         </w:rPr>
@@ -4065,7 +3938,7 @@
       <w:proofErr w:type="spellEnd"/>
       <w:r>
         <w:rPr>
-          <w:rFonts w:ascii="Courier New" w:hAnsi="Courier New" w:eastAsia="Calibri" w:cs="Courier New"/>
+          <w:rFonts w:ascii="Courier New" w:eastAsia="Calibri" w:hAnsi="Courier New" w:cs="Courier New"/>
           <w:b w:val="0"/>
           <w:bCs w:val="0"/>
         </w:rPr>
@@ -4073,7 +3946,7 @@
       </w:r>
       <w:r>
         <w:rPr>
-          <w:rFonts w:ascii="Courier New" w:hAnsi="Courier New" w:eastAsia="Calibri" w:cs="Courier New"/>
+          <w:rFonts w:ascii="Courier New" w:eastAsia="Calibri" w:hAnsi="Courier New" w:cs="Courier New"/>
           <w:b w:val="0"/>
           <w:bCs w:val="0"/>
         </w:rPr>
@@ -4081,7 +3954,7 @@
       </w:r>
       <w:r>
         <w:rPr>
-          <w:rFonts w:ascii="Courier New" w:hAnsi="Courier New" w:eastAsia="Calibri" w:cs="Courier New"/>
+          <w:rFonts w:ascii="Courier New" w:eastAsia="Calibri" w:hAnsi="Courier New" w:cs="Courier New"/>
           <w:b w:val="0"/>
           <w:bCs w:val="0"/>
         </w:rPr>
@@ -4090,17 +3963,17 @@
     </w:p>
     <w:p>
       <w:pPr>
-        <w:pStyle w:val="Heading1"/>
-        <w:jc w:val="both"/>
-        <w:rPr>
-          <w:rFonts w:ascii="Courier New" w:hAnsi="Courier New" w:eastAsia="Calibri" w:cs="Courier New"/>
+        <w:pStyle w:val="Titre1"/>
+        <w:jc w:val="both"/>
+        <w:rPr>
+          <w:rFonts w:ascii="Courier New" w:eastAsia="Calibri" w:hAnsi="Courier New" w:cs="Courier New"/>
           <w:b w:val="0"/>
           <w:bCs w:val="0"/>
         </w:rPr>
       </w:pPr>
       <w:r>
         <w:rPr>
-          <w:rFonts w:ascii="Courier New" w:hAnsi="Courier New" w:eastAsia="Calibri" w:cs="Courier New"/>
+          <w:rFonts w:ascii="Courier New" w:eastAsia="Calibri" w:hAnsi="Courier New" w:cs="Courier New"/>
           <w:b w:val="0"/>
           <w:bCs w:val="0"/>
         </w:rPr>
@@ -4108,7 +3981,7 @@
       </w:r>
       <w:r>
         <w:rPr>
-          <w:rFonts w:ascii="Courier New" w:hAnsi="Courier New" w:eastAsia="Calibri" w:cs="Courier New"/>
+          <w:rFonts w:ascii="Courier New" w:eastAsia="Calibri" w:hAnsi="Courier New" w:cs="Courier New"/>
           <w:b w:val="0"/>
           <w:bCs w:val="0"/>
         </w:rPr>
@@ -4116,7 +3989,7 @@
       </w:r>
       <w:r>
         <w:rPr>
-          <w:rFonts w:ascii="Courier New" w:hAnsi="Courier New" w:eastAsia="Calibri" w:cs="Courier New"/>
+          <w:rFonts w:ascii="Courier New" w:eastAsia="Calibri" w:hAnsi="Courier New" w:cs="Courier New"/>
           <w:b w:val="0"/>
           <w:bCs w:val="0"/>
         </w:rPr>
@@ -4125,7 +3998,7 @@
       <w:proofErr w:type="spellStart"/>
       <w:r>
         <w:rPr>
-          <w:rFonts w:ascii="Courier New" w:hAnsi="Courier New" w:eastAsia="Calibri" w:cs="Courier New"/>
+          <w:rFonts w:ascii="Courier New" w:eastAsia="Calibri" w:hAnsi="Courier New" w:cs="Courier New"/>
           <w:b w:val="0"/>
           <w:bCs w:val="0"/>
         </w:rPr>
@@ -4134,7 +4007,7 @@
       <w:proofErr w:type="spellEnd"/>
       <w:r>
         <w:rPr>
-          <w:rFonts w:ascii="Courier New" w:hAnsi="Courier New" w:eastAsia="Calibri" w:cs="Courier New"/>
+          <w:rFonts w:ascii="Courier New" w:eastAsia="Calibri" w:hAnsi="Courier New" w:cs="Courier New"/>
           <w:b w:val="0"/>
           <w:bCs w:val="0"/>
         </w:rPr>
@@ -4143,7 +4016,7 @@
       <w:proofErr w:type="spellStart"/>
       <w:r>
         <w:rPr>
-          <w:rFonts w:ascii="Courier New" w:hAnsi="Courier New" w:eastAsia="Calibri" w:cs="Courier New"/>
+          <w:rFonts w:ascii="Courier New" w:eastAsia="Calibri" w:hAnsi="Courier New" w:cs="Courier New"/>
           <w:b w:val="0"/>
           <w:bCs w:val="0"/>
         </w:rPr>
@@ -4151,7 +4024,7 @@
       </w:r>
       <w:r>
         <w:rPr>
-          <w:rFonts w:ascii="Courier New" w:hAnsi="Courier New" w:eastAsia="Calibri" w:cs="Courier New"/>
+          <w:rFonts w:ascii="Courier New" w:eastAsia="Calibri" w:hAnsi="Courier New" w:cs="Courier New"/>
           <w:b w:val="0"/>
           <w:bCs w:val="0"/>
         </w:rPr>
@@ -4160,7 +4033,7 @@
       <w:proofErr w:type="spellEnd"/>
       <w:r>
         <w:rPr>
-          <w:rFonts w:ascii="Courier New" w:hAnsi="Courier New" w:eastAsia="Calibri" w:cs="Courier New"/>
+          <w:rFonts w:ascii="Courier New" w:eastAsia="Calibri" w:hAnsi="Courier New" w:cs="Courier New"/>
           <w:b w:val="0"/>
           <w:bCs w:val="0"/>
         </w:rPr>
@@ -4168,7 +4041,7 @@
       </w:r>
       <w:r>
         <w:rPr>
-          <w:rFonts w:ascii="Courier New" w:hAnsi="Courier New" w:eastAsia="Calibri" w:cs="Courier New"/>
+          <w:rFonts w:ascii="Courier New" w:eastAsia="Calibri" w:hAnsi="Courier New" w:cs="Courier New"/>
           <w:b w:val="0"/>
           <w:bCs w:val="0"/>
         </w:rPr>
@@ -4239,7 +4112,7 @@
       </w:pPr>
       <w:r>
         <w:rPr>
-          <w:rFonts w:ascii="Century Gothic" w:hAnsi="Century Gothic" w:eastAsia="Century Gothic" w:cs="Century Gothic"/>
+          <w:rFonts w:ascii="Century Gothic" w:eastAsia="Century Gothic" w:hAnsi="Century Gothic" w:cs="Century Gothic"/>
           <w:sz w:val="22"/>
           <w:szCs w:val="22"/>
           <w:lang w:val="en-US"/>
@@ -4490,18 +4363,18 @@
     </w:p>
     <w:p>
       <w:pPr>
-        <w:pStyle w:val="Heading1"/>
-        <w:jc w:val="both"/>
-        <w:rPr>
-          <w:rFonts w:ascii="Century Gothic" w:hAnsi="Century Gothic"/>
-          <w:sz w:val="22"/>
-          <w:szCs w:val="22"/>
-          <w:lang w:val="en-US"/>
-        </w:rPr>
-      </w:pPr>
-      <w:r>
-        <w:rPr>
-          <w:rFonts w:ascii="Courier New" w:hAnsi="Courier New" w:eastAsia="Calibri" w:cs="Courier New"/>
+        <w:pStyle w:val="Titre1"/>
+        <w:jc w:val="both"/>
+        <w:rPr>
+          <w:rFonts w:ascii="Century Gothic" w:hAnsi="Century Gothic"/>
+          <w:sz w:val="22"/>
+          <w:szCs w:val="22"/>
+          <w:lang w:val="en-US"/>
+        </w:rPr>
+      </w:pPr>
+      <w:r>
+        <w:rPr>
+          <w:rFonts w:ascii="Courier New" w:eastAsia="Calibri" w:hAnsi="Courier New" w:cs="Courier New"/>
           <w:b w:val="0"/>
           <w:bCs w:val="0"/>
           <w:lang w:val="en-US"/>
@@ -4511,7 +4384,7 @@
       <w:proofErr w:type="spellStart"/>
       <w:r>
         <w:rPr>
-          <w:rFonts w:ascii="Courier New" w:hAnsi="Courier New" w:eastAsia="Calibri" w:cs="Courier New"/>
+          <w:rFonts w:ascii="Courier New" w:eastAsia="Calibri" w:hAnsi="Courier New" w:cs="Courier New"/>
           <w:b w:val="0"/>
           <w:bCs w:val="0"/>
           <w:lang w:val="en-US"/>
@@ -4521,7 +4394,7 @@
       <w:proofErr w:type="spellEnd"/>
       <w:r>
         <w:rPr>
-          <w:rFonts w:ascii="Courier New" w:hAnsi="Courier New" w:eastAsia="Calibri" w:cs="Courier New"/>
+          <w:rFonts w:ascii="Courier New" w:eastAsia="Calibri" w:hAnsi="Courier New" w:cs="Courier New"/>
           <w:b w:val="0"/>
           <w:bCs w:val="0"/>
           <w:lang w:val="en-US"/>
@@ -4531,7 +4404,7 @@
       <w:proofErr w:type="spellStart"/>
       <w:r>
         <w:rPr>
-          <w:rFonts w:ascii="Courier New" w:hAnsi="Courier New" w:eastAsia="Calibri" w:cs="Courier New"/>
+          <w:rFonts w:ascii="Courier New" w:eastAsia="Calibri" w:hAnsi="Courier New" w:cs="Courier New"/>
           <w:b w:val="0"/>
           <w:bCs w:val="0"/>
           <w:lang w:val="en-US"/>
@@ -4541,7 +4414,7 @@
       <w:proofErr w:type="spellEnd"/>
       <w:r>
         <w:rPr>
-          <w:rFonts w:ascii="Courier New" w:hAnsi="Courier New" w:eastAsia="Calibri" w:cs="Courier New"/>
+          <w:rFonts w:ascii="Courier New" w:eastAsia="Calibri" w:hAnsi="Courier New" w:cs="Courier New"/>
           <w:b w:val="0"/>
           <w:bCs w:val="0"/>
           <w:lang w:val="en-US"/>
@@ -4550,7 +4423,7 @@
       </w:r>
       <w:r>
         <w:rPr>
-          <w:rFonts w:ascii="Courier New" w:hAnsi="Courier New" w:eastAsia="Calibri" w:cs="Courier New"/>
+          <w:rFonts w:ascii="Courier New" w:eastAsia="Calibri" w:hAnsi="Courier New" w:cs="Courier New"/>
           <w:b w:val="0"/>
           <w:bCs w:val="0"/>
           <w:lang w:val="en-US"/>
@@ -4745,7 +4618,7 @@
     </w:p>
     <w:p>
       <w:pPr>
-        <w:pStyle w:val="ListParagraph"/>
+        <w:pStyle w:val="Paragraphedeliste"/>
         <w:numPr>
           <w:ilvl w:val="0"/>
           <w:numId w:val="1"/>
@@ -4753,7 +4626,7 @@
         <w:spacing w:after="0" w:line="259" w:lineRule="auto"/>
         <w:jc w:val="both"/>
         <w:rPr>
-          <w:rFonts w:ascii="Century Gothic" w:hAnsi="Century Gothic" w:eastAsia="Century Gothic" w:cs="Century Gothic"/>
+          <w:rFonts w:ascii="Century Gothic" w:eastAsia="Century Gothic" w:hAnsi="Century Gothic" w:cs="Century Gothic"/>
         </w:rPr>
       </w:pPr>
       <w:r>
@@ -4765,7 +4638,7 @@
     </w:p>
     <w:p>
       <w:pPr>
-        <w:pStyle w:val="ListParagraph"/>
+        <w:pStyle w:val="Paragraphedeliste"/>
         <w:numPr>
           <w:ilvl w:val="0"/>
           <w:numId w:val="1"/>
@@ -4773,7 +4646,7 @@
         <w:spacing w:after="0" w:line="259" w:lineRule="auto"/>
         <w:jc w:val="both"/>
         <w:rPr>
-          <w:rFonts w:ascii="Century Gothic" w:hAnsi="Century Gothic" w:eastAsia="Century Gothic" w:cs="Century Gothic"/>
+          <w:rFonts w:ascii="Century Gothic" w:eastAsia="Century Gothic" w:hAnsi="Century Gothic" w:cs="Century Gothic"/>
         </w:rPr>
       </w:pPr>
       <w:r>
@@ -4796,7 +4669,7 @@
       </w:r>
       <w:r>
         <w:rPr>
-          <w:rFonts w:ascii="Century Gothic" w:hAnsi="Century Gothic" w:eastAsia="Century Gothic" w:cs="Century Gothic"/>
+          <w:rFonts w:ascii="Century Gothic" w:eastAsia="Century Gothic" w:hAnsi="Century Gothic" w:cs="Century Gothic"/>
           <w:b/>
           <w:bCs/>
         </w:rPr>
@@ -4804,13 +4677,13 @@
       </w:r>
       <w:r>
         <w:rPr>
-          <w:rFonts w:ascii="Century Gothic" w:hAnsi="Century Gothic" w:eastAsia="Century Gothic" w:cs="Century Gothic"/>
+          <w:rFonts w:ascii="Century Gothic" w:eastAsia="Century Gothic" w:hAnsi="Century Gothic" w:cs="Century Gothic"/>
         </w:rPr>
         <w:t xml:space="preserve"> and </w:t>
       </w:r>
       <w:r>
         <w:rPr>
-          <w:rFonts w:ascii="Century Gothic" w:hAnsi="Century Gothic" w:eastAsia="Century Gothic" w:cs="Century Gothic"/>
+          <w:rFonts w:ascii="Century Gothic" w:eastAsia="Century Gothic" w:hAnsi="Century Gothic" w:cs="Century Gothic"/>
           <w:b/>
           <w:bCs/>
         </w:rPr>
@@ -4818,13 +4691,13 @@
       </w:r>
       <w:r>
         <w:rPr>
-          <w:rFonts w:ascii="Century Gothic" w:hAnsi="Century Gothic" w:eastAsia="Century Gothic" w:cs="Century Gothic"/>
+          <w:rFonts w:ascii="Century Gothic" w:eastAsia="Century Gothic" w:hAnsi="Century Gothic" w:cs="Century Gothic"/>
         </w:rPr>
         <w:t xml:space="preserve"> show </w:t>
       </w:r>
       <w:r>
         <w:rPr>
-          <w:rFonts w:ascii="Century Gothic" w:hAnsi="Century Gothic" w:eastAsia="Century Gothic" w:cs="Century Gothic"/>
+          <w:rFonts w:ascii="Century Gothic" w:eastAsia="Century Gothic" w:hAnsi="Century Gothic" w:cs="Century Gothic"/>
           <w:b/>
           <w:bCs/>
         </w:rPr>
@@ -4832,13 +4705,13 @@
       </w:r>
       <w:r>
         <w:rPr>
-          <w:rFonts w:ascii="Century Gothic" w:hAnsi="Century Gothic" w:eastAsia="Century Gothic" w:cs="Century Gothic"/>
+          <w:rFonts w:ascii="Century Gothic" w:eastAsia="Century Gothic" w:hAnsi="Century Gothic" w:cs="Century Gothic"/>
         </w:rPr>
         <w:t xml:space="preserve"> and larger deviations from the reference RF while </w:t>
       </w:r>
       <w:r>
         <w:rPr>
-          <w:rFonts w:ascii="Century Gothic" w:hAnsi="Century Gothic" w:eastAsia="Century Gothic" w:cs="Century Gothic"/>
+          <w:rFonts w:ascii="Century Gothic" w:eastAsia="Century Gothic" w:hAnsi="Century Gothic" w:cs="Century Gothic"/>
           <w:b/>
           <w:bCs/>
         </w:rPr>
@@ -4846,13 +4719,13 @@
       </w:r>
       <w:r>
         <w:rPr>
-          <w:rFonts w:ascii="Century Gothic" w:hAnsi="Century Gothic" w:eastAsia="Century Gothic" w:cs="Century Gothic"/>
+          <w:rFonts w:ascii="Century Gothic" w:eastAsia="Century Gothic" w:hAnsi="Century Gothic" w:cs="Century Gothic"/>
         </w:rPr>
         <w:t xml:space="preserve"> and </w:t>
       </w:r>
       <w:r>
         <w:rPr>
-          <w:rFonts w:ascii="Century Gothic" w:hAnsi="Century Gothic" w:eastAsia="Century Gothic" w:cs="Century Gothic"/>
+          <w:rFonts w:ascii="Century Gothic" w:eastAsia="Century Gothic" w:hAnsi="Century Gothic" w:cs="Century Gothic"/>
           <w:b/>
           <w:bCs/>
         </w:rPr>
@@ -4860,13 +4733,13 @@
       </w:r>
       <w:r>
         <w:rPr>
-          <w:rFonts w:ascii="Century Gothic" w:hAnsi="Century Gothic" w:eastAsia="Century Gothic" w:cs="Century Gothic"/>
+          <w:rFonts w:ascii="Century Gothic" w:eastAsia="Century Gothic" w:hAnsi="Century Gothic" w:cs="Century Gothic"/>
         </w:rPr>
         <w:t xml:space="preserve"> appear to be </w:t>
       </w:r>
       <w:r>
         <w:rPr>
-          <w:rFonts w:ascii="Century Gothic" w:hAnsi="Century Gothic" w:eastAsia="Century Gothic" w:cs="Century Gothic"/>
+          <w:rFonts w:ascii="Century Gothic" w:eastAsia="Century Gothic" w:hAnsi="Century Gothic" w:cs="Century Gothic"/>
           <w:b/>
           <w:bCs/>
         </w:rPr>
@@ -4874,14 +4747,14 @@
       </w:r>
       <w:r>
         <w:rPr>
-          <w:rFonts w:ascii="Century Gothic" w:hAnsi="Century Gothic" w:eastAsia="Century Gothic" w:cs="Century Gothic"/>
+          <w:rFonts w:ascii="Century Gothic" w:eastAsia="Century Gothic" w:hAnsi="Century Gothic" w:cs="Century Gothic"/>
         </w:rPr>
         <w:t xml:space="preserve"> and track the reference RF more closely.</w:t>
       </w:r>
     </w:p>
     <w:p>
       <w:pPr>
-        <w:pStyle w:val="ListParagraph"/>
+        <w:pStyle w:val="Paragraphedeliste"/>
         <w:numPr>
           <w:ilvl w:val="0"/>
           <w:numId w:val="1"/>
@@ -4889,32 +4762,32 @@
         <w:spacing w:after="0" w:line="259" w:lineRule="auto"/>
         <w:jc w:val="both"/>
         <w:rPr>
-          <w:rFonts w:ascii="Century Gothic" w:hAnsi="Century Gothic" w:eastAsia="Century Gothic" w:cs="Century Gothic"/>
-        </w:rPr>
-      </w:pPr>
-      <w:r>
-        <w:rPr>
-          <w:rFonts w:ascii="Century Gothic" w:hAnsi="Century Gothic" w:eastAsia="Century Gothic" w:cs="Century Gothic"/>
+          <w:rFonts w:ascii="Century Gothic" w:eastAsia="Century Gothic" w:hAnsi="Century Gothic" w:cs="Century Gothic"/>
+        </w:rPr>
+      </w:pPr>
+      <w:r>
+        <w:rPr>
+          <w:rFonts w:ascii="Century Gothic" w:eastAsia="Century Gothic" w:hAnsi="Century Gothic" w:cs="Century Gothic"/>
         </w:rPr>
         <w:t xml:space="preserve">In the latest phase (900s-1100s) in which frequency changes </w:t>
       </w:r>
       <w:proofErr w:type="spellStart"/>
       <w:r>
         <w:rPr>
-          <w:rFonts w:ascii="Century Gothic" w:hAnsi="Century Gothic" w:eastAsia="Century Gothic" w:cs="Century Gothic"/>
+          <w:rFonts w:ascii="Century Gothic" w:eastAsia="Century Gothic" w:hAnsi="Century Gothic" w:cs="Century Gothic"/>
         </w:rPr>
         <w:t>faser</w:t>
       </w:r>
       <w:proofErr w:type="spellEnd"/>
       <w:r>
         <w:rPr>
-          <w:rFonts w:ascii="Century Gothic" w:hAnsi="Century Gothic" w:eastAsia="Century Gothic" w:cs="Century Gothic"/>
+          <w:rFonts w:ascii="Century Gothic" w:eastAsia="Century Gothic" w:hAnsi="Century Gothic" w:cs="Century Gothic"/>
         </w:rPr>
         <w:t xml:space="preserve">, the </w:t>
       </w:r>
       <w:r>
         <w:rPr>
-          <w:rFonts w:ascii="Century Gothic" w:hAnsi="Century Gothic" w:eastAsia="Century Gothic" w:cs="Century Gothic"/>
+          <w:rFonts w:ascii="Century Gothic" w:eastAsia="Century Gothic" w:hAnsi="Century Gothic" w:cs="Century Gothic"/>
           <w:b/>
           <w:bCs/>
         </w:rPr>
@@ -4922,13 +4795,13 @@
       </w:r>
       <w:r>
         <w:rPr>
-          <w:rFonts w:ascii="Century Gothic" w:hAnsi="Century Gothic" w:eastAsia="Century Gothic" w:cs="Century Gothic"/>
+          <w:rFonts w:ascii="Century Gothic" w:eastAsia="Century Gothic" w:hAnsi="Century Gothic" w:cs="Century Gothic"/>
         </w:rPr>
         <w:t xml:space="preserve"> and </w:t>
       </w:r>
       <w:r>
         <w:rPr>
-          <w:rFonts w:ascii="Century Gothic" w:hAnsi="Century Gothic" w:eastAsia="Century Gothic" w:cs="Century Gothic"/>
+          <w:rFonts w:ascii="Century Gothic" w:eastAsia="Century Gothic" w:hAnsi="Century Gothic" w:cs="Century Gothic"/>
           <w:b/>
           <w:bCs/>
         </w:rPr>
@@ -4936,13 +4809,13 @@
       </w:r>
       <w:r>
         <w:rPr>
-          <w:rFonts w:ascii="Century Gothic" w:hAnsi="Century Gothic" w:eastAsia="Century Gothic" w:cs="Century Gothic"/>
+          <w:rFonts w:ascii="Century Gothic" w:eastAsia="Century Gothic" w:hAnsi="Century Gothic" w:cs="Century Gothic"/>
         </w:rPr>
         <w:t xml:space="preserve"> methods provide the </w:t>
       </w:r>
       <w:r>
         <w:rPr>
-          <w:rFonts w:ascii="Century Gothic" w:hAnsi="Century Gothic" w:eastAsia="Century Gothic" w:cs="Century Gothic"/>
+          <w:rFonts w:ascii="Century Gothic" w:eastAsia="Century Gothic" w:hAnsi="Century Gothic" w:cs="Century Gothic"/>
           <w:b/>
           <w:bCs/>
         </w:rPr>
@@ -4950,23 +4823,23 @@
       </w:r>
       <w:r>
         <w:rPr>
-          <w:rFonts w:ascii="Century Gothic" w:hAnsi="Century Gothic" w:eastAsia="Century Gothic" w:cs="Century Gothic"/>
+          <w:rFonts w:ascii="Century Gothic" w:eastAsia="Century Gothic" w:hAnsi="Century Gothic" w:cs="Century Gothic"/>
         </w:rPr>
         <w:t xml:space="preserve"> to the reference RF during the sharp increase and the peak region around 1000s}. The red lines are almost superimposed on the blue line.</w:t>
       </w:r>
     </w:p>
     <w:p>
       <w:pPr>
-        <w:pStyle w:val="ListParagraph"/>
+        <w:pStyle w:val="Paragraphedeliste"/>
         <w:spacing w:after="0" w:line="259" w:lineRule="auto"/>
         <w:jc w:val="both"/>
         <w:rPr>
-          <w:rFonts w:ascii="Century Gothic" w:hAnsi="Century Gothic" w:eastAsia="Century Gothic" w:cs="Century Gothic"/>
-        </w:rPr>
-      </w:pPr>
-      <w:r>
-        <w:rPr>
-          <w:rFonts w:ascii="Century Gothic" w:hAnsi="Century Gothic" w:eastAsia="Century Gothic" w:cs="Century Gothic"/>
+          <w:rFonts w:ascii="Century Gothic" w:eastAsia="Century Gothic" w:hAnsi="Century Gothic" w:cs="Century Gothic"/>
+        </w:rPr>
+      </w:pPr>
+      <w:r>
+        <w:rPr>
+          <w:rFonts w:ascii="Century Gothic" w:eastAsia="Century Gothic" w:hAnsi="Century Gothic" w:cs="Century Gothic"/>
           <w:b/>
           <w:bCs/>
         </w:rPr>
@@ -4974,13 +4847,13 @@
       </w:r>
       <w:r>
         <w:rPr>
-          <w:rFonts w:ascii="Century Gothic" w:hAnsi="Century Gothic" w:eastAsia="Century Gothic" w:cs="Century Gothic"/>
+          <w:rFonts w:ascii="Century Gothic" w:eastAsia="Century Gothic" w:hAnsi="Century Gothic" w:cs="Century Gothic"/>
         </w:rPr>
         <w:t xml:space="preserve"> and </w:t>
       </w:r>
       <w:r>
         <w:rPr>
-          <w:rFonts w:ascii="Century Gothic" w:hAnsi="Century Gothic" w:eastAsia="Century Gothic" w:cs="Century Gothic"/>
+          <w:rFonts w:ascii="Century Gothic" w:eastAsia="Century Gothic" w:hAnsi="Century Gothic" w:cs="Century Gothic"/>
           <w:b/>
           <w:bCs/>
         </w:rPr>
@@ -4988,13 +4861,13 @@
       </w:r>
       <w:r>
         <w:rPr>
-          <w:rFonts w:ascii="Century Gothic" w:hAnsi="Century Gothic" w:eastAsia="Century Gothic" w:cs="Century Gothic"/>
+          <w:rFonts w:ascii="Century Gothic" w:eastAsia="Century Gothic" w:hAnsi="Century Gothic" w:cs="Century Gothic"/>
         </w:rPr>
         <w:t xml:space="preserve"> show </w:t>
       </w:r>
       <w:r>
         <w:rPr>
-          <w:rFonts w:ascii="Century Gothic" w:hAnsi="Century Gothic" w:eastAsia="Century Gothic" w:cs="Century Gothic"/>
+          <w:rFonts w:ascii="Century Gothic" w:eastAsia="Century Gothic" w:hAnsi="Century Gothic" w:cs="Century Gothic"/>
           <w:b/>
           <w:bCs/>
         </w:rPr>
@@ -5002,26 +4875,26 @@
       </w:r>
       <w:r>
         <w:rPr>
-          <w:rFonts w:ascii="Century Gothic" w:hAnsi="Century Gothic" w:eastAsia="Century Gothic" w:cs="Century Gothic"/>
+          <w:rFonts w:ascii="Century Gothic" w:eastAsia="Century Gothic" w:hAnsi="Century Gothic" w:cs="Century Gothic"/>
         </w:rPr>
         <w:t xml:space="preserve"> or </w:t>
       </w:r>
       <w:r>
         <w:rPr>
-          <w:rFonts w:ascii="Century Gothic" w:hAnsi="Century Gothic" w:eastAsia="Century Gothic" w:cs="Century Gothic"/>
+          <w:rFonts w:ascii="Century Gothic" w:eastAsia="Century Gothic" w:hAnsi="Century Gothic" w:cs="Century Gothic"/>
         </w:rPr>
         <w:t>undershoots</w:t>
       </w:r>
       <w:r>
         <w:rPr>
-          <w:rFonts w:ascii="Century Gothic" w:hAnsi="Century Gothic" w:eastAsia="Century Gothic" w:cs="Century Gothic"/>
+          <w:rFonts w:ascii="Century Gothic" w:eastAsia="Century Gothic" w:hAnsi="Century Gothic" w:cs="Century Gothic"/>
         </w:rPr>
         <w:t xml:space="preserve"> during the sharp peak compared to Adaptive BP and STFT, meaning they react slightly less accurately to the rapid frequency changes.</w:t>
       </w:r>
     </w:p>
     <w:p>
       <w:pPr>
-        <w:pStyle w:val="ListParagraph"/>
+        <w:pStyle w:val="Paragraphedeliste"/>
         <w:numPr>
           <w:ilvl w:val="0"/>
           <w:numId w:val="1"/>
@@ -5029,18 +4902,18 @@
         <w:spacing w:after="0" w:line="259" w:lineRule="auto"/>
         <w:jc w:val="both"/>
         <w:rPr>
-          <w:rFonts w:ascii="Century Gothic" w:hAnsi="Century Gothic" w:eastAsia="Century Gothic" w:cs="Century Gothic"/>
-        </w:rPr>
-      </w:pPr>
-      <w:r>
-        <w:rPr>
-          <w:rFonts w:ascii="Century Gothic" w:hAnsi="Century Gothic" w:eastAsia="Century Gothic" w:cs="Century Gothic"/>
+          <w:rFonts w:ascii="Century Gothic" w:eastAsia="Century Gothic" w:hAnsi="Century Gothic" w:cs="Century Gothic"/>
+        </w:rPr>
+      </w:pPr>
+      <w:r>
+        <w:rPr>
+          <w:rFonts w:ascii="Century Gothic" w:eastAsia="Century Gothic" w:hAnsi="Century Gothic" w:cs="Century Gothic"/>
         </w:rPr>
         <w:t xml:space="preserve">The </w:t>
       </w:r>
       <w:r>
         <w:rPr>
-          <w:rFonts w:ascii="Century Gothic" w:hAnsi="Century Gothic" w:eastAsia="Century Gothic" w:cs="Century Gothic"/>
+          <w:rFonts w:ascii="Century Gothic" w:eastAsia="Century Gothic" w:hAnsi="Century Gothic" w:cs="Century Gothic"/>
           <w:b/>
           <w:bCs/>
         </w:rPr>
@@ -5048,13 +4921,13 @@
       </w:r>
       <w:r>
         <w:rPr>
-          <w:rFonts w:ascii="Century Gothic" w:hAnsi="Century Gothic" w:eastAsia="Century Gothic" w:cs="Century Gothic"/>
+          <w:rFonts w:ascii="Century Gothic" w:eastAsia="Century Gothic" w:hAnsi="Century Gothic" w:cs="Century Gothic"/>
         </w:rPr>
         <w:t xml:space="preserve"> and </w:t>
       </w:r>
       <w:r>
         <w:rPr>
-          <w:rFonts w:ascii="Century Gothic" w:hAnsi="Century Gothic" w:eastAsia="Century Gothic" w:cs="Century Gothic"/>
+          <w:rFonts w:ascii="Century Gothic" w:eastAsia="Century Gothic" w:hAnsi="Century Gothic" w:cs="Century Gothic"/>
           <w:b/>
           <w:bCs/>
         </w:rPr>
@@ -5062,13 +4935,13 @@
       </w:r>
       <w:r>
         <w:rPr>
-          <w:rFonts w:ascii="Century Gothic" w:hAnsi="Century Gothic" w:eastAsia="Century Gothic" w:cs="Century Gothic"/>
+          <w:rFonts w:ascii="Century Gothic" w:eastAsia="Century Gothic" w:hAnsi="Century Gothic" w:cs="Century Gothic"/>
         </w:rPr>
         <w:t xml:space="preserve"> methods seem slightly </w:t>
       </w:r>
       <w:r>
         <w:rPr>
-          <w:rFonts w:ascii="Century Gothic" w:hAnsi="Century Gothic" w:eastAsia="Century Gothic" w:cs="Century Gothic"/>
+          <w:rFonts w:ascii="Century Gothic" w:eastAsia="Century Gothic" w:hAnsi="Century Gothic" w:cs="Century Gothic"/>
           <w:b/>
           <w:bCs/>
         </w:rPr>
@@ -5076,26 +4949,26 @@
       </w:r>
       <w:r>
         <w:rPr>
-          <w:rFonts w:ascii="Century Gothic" w:hAnsi="Century Gothic" w:eastAsia="Century Gothic" w:cs="Century Gothic"/>
+          <w:rFonts w:ascii="Century Gothic" w:eastAsia="Century Gothic" w:hAnsi="Century Gothic" w:cs="Century Gothic"/>
         </w:rPr>
         <w:t xml:space="preserve"> to the sharp transient artifact observed around 550s, which appears </w:t>
       </w:r>
       <w:r>
         <w:rPr>
-          <w:rFonts w:ascii="Century Gothic" w:hAnsi="Century Gothic" w:eastAsia="Century Gothic" w:cs="Century Gothic"/>
+          <w:rFonts w:ascii="Century Gothic" w:eastAsia="Century Gothic" w:hAnsi="Century Gothic" w:cs="Century Gothic"/>
         </w:rPr>
         <w:t>to be</w:t>
       </w:r>
       <w:r>
         <w:rPr>
-          <w:rFonts w:ascii="Century Gothic" w:hAnsi="Century Gothic" w:eastAsia="Century Gothic" w:cs="Century Gothic"/>
+          <w:rFonts w:ascii="Century Gothic" w:eastAsia="Century Gothic" w:hAnsi="Century Gothic" w:cs="Century Gothic"/>
         </w:rPr>
         <w:t xml:space="preserve"> a significant spike in the reference signal.</w:t>
       </w:r>
     </w:p>
     <w:p>
       <w:pPr>
-        <w:pStyle w:val="ListParagraph"/>
+        <w:pStyle w:val="Paragraphedeliste"/>
         <w:numPr>
           <w:ilvl w:val="0"/>
           <w:numId w:val="1"/>
@@ -5103,18 +4976,19 @@
         <w:spacing w:after="0" w:line="259" w:lineRule="auto"/>
         <w:jc w:val="both"/>
         <w:rPr>
-          <w:rFonts w:ascii="Century Gothic" w:hAnsi="Century Gothic" w:eastAsia="Century Gothic" w:cs="Century Gothic"/>
-        </w:rPr>
-      </w:pPr>
-      <w:r>
-        <w:rPr>
-          <w:rFonts w:ascii="Century Gothic" w:hAnsi="Century Gothic" w:eastAsia="Century Gothic" w:cs="Century Gothic"/>
-        </w:rPr>
+          <w:rFonts w:ascii="Century Gothic" w:eastAsia="Century Gothic" w:hAnsi="Century Gothic" w:cs="Century Gothic"/>
+        </w:rPr>
+      </w:pPr>
+      <w:r>
+        <w:rPr>
+          <w:rFonts w:ascii="Century Gothic" w:eastAsia="Century Gothic" w:hAnsi="Century Gothic" w:cs="Century Gothic"/>
+        </w:rPr>
+        <w:lastRenderedPageBreak/>
         <w:t xml:space="preserve">Based on visual inspection, the </w:t>
       </w:r>
       <w:r>
         <w:rPr>
-          <w:rFonts w:ascii="Century Gothic" w:hAnsi="Century Gothic" w:eastAsia="Century Gothic" w:cs="Century Gothic"/>
+          <w:rFonts w:ascii="Century Gothic" w:eastAsia="Century Gothic" w:hAnsi="Century Gothic" w:cs="Century Gothic"/>
           <w:b/>
           <w:bCs/>
         </w:rPr>
@@ -5122,13 +4996,13 @@
       </w:r>
       <w:r>
         <w:rPr>
-          <w:rFonts w:ascii="Century Gothic" w:hAnsi="Century Gothic" w:eastAsia="Century Gothic" w:cs="Century Gothic"/>
+          <w:rFonts w:ascii="Century Gothic" w:eastAsia="Century Gothic" w:hAnsi="Century Gothic" w:cs="Century Gothic"/>
         </w:rPr>
         <w:t xml:space="preserve"> and </w:t>
       </w:r>
       <w:r>
         <w:rPr>
-          <w:rFonts w:ascii="Century Gothic" w:hAnsi="Century Gothic" w:eastAsia="Century Gothic" w:cs="Century Gothic"/>
+          <w:rFonts w:ascii="Century Gothic" w:eastAsia="Century Gothic" w:hAnsi="Century Gothic" w:cs="Century Gothic"/>
           <w:b/>
           <w:bCs/>
         </w:rPr>
@@ -5136,13 +5010,13 @@
       </w:r>
       <w:r>
         <w:rPr>
-          <w:rFonts w:ascii="Century Gothic" w:hAnsi="Century Gothic" w:eastAsia="Century Gothic" w:cs="Century Gothic"/>
+          <w:rFonts w:ascii="Century Gothic" w:eastAsia="Century Gothic" w:hAnsi="Century Gothic" w:cs="Century Gothic"/>
         </w:rPr>
         <w:t xml:space="preserve"> methods exhibit </w:t>
       </w:r>
       <w:r>
         <w:rPr>
-          <w:rFonts w:ascii="Century Gothic" w:hAnsi="Century Gothic" w:eastAsia="Century Gothic" w:cs="Century Gothic"/>
+          <w:rFonts w:ascii="Century Gothic" w:eastAsia="Century Gothic" w:hAnsi="Century Gothic" w:cs="Century Gothic"/>
           <w:b/>
           <w:bCs/>
         </w:rPr>
@@ -5150,7 +5024,7 @@
       </w:r>
       <w:r>
         <w:rPr>
-          <w:rFonts w:ascii="Century Gothic" w:hAnsi="Century Gothic" w:eastAsia="Century Gothic" w:cs="Century Gothic"/>
+          <w:rFonts w:ascii="Century Gothic" w:eastAsia="Century Gothic" w:hAnsi="Century Gothic" w:cs="Century Gothic"/>
         </w:rPr>
         <w:t xml:space="preserve"> as they provide a smoother, more accurate, and less attenuated estimate of the instantaneous respiration frequency across all phases, especially during periods of rapid change.</w:t>
       </w:r>
@@ -5169,17 +5043,17 @@
     </w:p>
     <w:p>
       <w:pPr>
-        <w:pStyle w:val="Heading2"/>
-        <w:rPr>
-          <w:rFonts w:ascii="Century Gothic" w:hAnsi="Century Gothic"/>
-          <w:szCs w:val="24"/>
-          <w:lang w:val="en-US"/>
-        </w:rPr>
-      </w:pPr>
-    </w:p>
-    <w:p>
-      <w:pPr>
-        <w:pStyle w:val="Heading2"/>
+        <w:pStyle w:val="Titre2"/>
+        <w:rPr>
+          <w:rFonts w:ascii="Century Gothic" w:hAnsi="Century Gothic"/>
+          <w:szCs w:val="24"/>
+          <w:lang w:val="en-US"/>
+        </w:rPr>
+      </w:pPr>
+    </w:p>
+    <w:p>
+      <w:pPr>
+        <w:pStyle w:val="Titre2"/>
         <w:rPr>
           <w:rFonts w:ascii="Century Gothic" w:hAnsi="Century Gothic"/>
           <w:szCs w:val="24"/>
@@ -5569,10 +5443,10 @@
     </w:p>
     <w:p>
       <w:pPr>
-        <w:pStyle w:val="Heading1"/>
-        <w:jc w:val="both"/>
-        <w:rPr>
-          <w:rFonts w:ascii="Courier New" w:hAnsi="Courier New" w:eastAsia="Calibri" w:cs="Courier New"/>
+        <w:pStyle w:val="Titre1"/>
+        <w:jc w:val="both"/>
+        <w:rPr>
+          <w:rFonts w:ascii="Courier New" w:eastAsia="Calibri" w:hAnsi="Courier New" w:cs="Courier New"/>
           <w:b w:val="0"/>
           <w:bCs w:val="0"/>
           <w:szCs w:val="24"/>
@@ -5581,7 +5455,7 @@
       </w:pPr>
       <w:r>
         <w:rPr>
-          <w:rFonts w:ascii="Courier New" w:hAnsi="Courier New" w:eastAsia="Calibri" w:cs="Courier New"/>
+          <w:rFonts w:ascii="Courier New" w:eastAsia="Calibri" w:hAnsi="Courier New" w:cs="Courier New"/>
           <w:b w:val="0"/>
           <w:bCs w:val="0"/>
           <w:szCs w:val="24"/>
@@ -5592,7 +5466,7 @@
       <w:proofErr w:type="spellStart"/>
       <w:r>
         <w:rPr>
-          <w:rFonts w:ascii="Courier New" w:hAnsi="Courier New" w:eastAsia="Calibri" w:cs="Courier New"/>
+          <w:rFonts w:ascii="Courier New" w:eastAsia="Calibri" w:hAnsi="Courier New" w:cs="Courier New"/>
           <w:b w:val="0"/>
           <w:bCs w:val="0"/>
           <w:szCs w:val="24"/>
@@ -5603,7 +5477,7 @@
       <w:proofErr w:type="spellEnd"/>
       <w:r>
         <w:rPr>
-          <w:rFonts w:ascii="Courier New" w:hAnsi="Courier New" w:eastAsia="Calibri" w:cs="Courier New"/>
+          <w:rFonts w:ascii="Courier New" w:eastAsia="Calibri" w:hAnsi="Courier New" w:cs="Courier New"/>
           <w:b w:val="0"/>
           <w:bCs w:val="0"/>
           <w:szCs w:val="24"/>
@@ -5614,7 +5488,7 @@
       <w:proofErr w:type="spellStart"/>
       <w:r>
         <w:rPr>
-          <w:rFonts w:ascii="Courier New" w:hAnsi="Courier New" w:eastAsia="Calibri" w:cs="Courier New"/>
+          <w:rFonts w:ascii="Courier New" w:eastAsia="Calibri" w:hAnsi="Courier New" w:cs="Courier New"/>
           <w:b w:val="0"/>
           <w:bCs w:val="0"/>
           <w:szCs w:val="24"/>
@@ -5625,7 +5499,7 @@
       <w:proofErr w:type="spellEnd"/>
       <w:r>
         <w:rPr>
-          <w:rFonts w:ascii="Courier New" w:hAnsi="Courier New" w:eastAsia="Calibri" w:cs="Courier New"/>
+          <w:rFonts w:ascii="Courier New" w:eastAsia="Calibri" w:hAnsi="Courier New" w:cs="Courier New"/>
           <w:b w:val="0"/>
           <w:bCs w:val="0"/>
           <w:szCs w:val="24"/>
@@ -5636,7 +5510,7 @@
       <w:proofErr w:type="spellStart"/>
       <w:r>
         <w:rPr>
-          <w:rFonts w:ascii="Courier New" w:hAnsi="Courier New" w:eastAsia="Calibri" w:cs="Courier New"/>
+          <w:rFonts w:ascii="Courier New" w:eastAsia="Calibri" w:hAnsi="Courier New" w:cs="Courier New"/>
           <w:b w:val="0"/>
           <w:bCs w:val="0"/>
           <w:szCs w:val="24"/>
@@ -5647,7 +5521,7 @@
       <w:proofErr w:type="spellEnd"/>
       <w:r>
         <w:rPr>
-          <w:rFonts w:ascii="Courier New" w:hAnsi="Courier New" w:eastAsia="Calibri" w:cs="Courier New"/>
+          <w:rFonts w:ascii="Courier New" w:eastAsia="Calibri" w:hAnsi="Courier New" w:cs="Courier New"/>
           <w:b w:val="0"/>
           <w:bCs w:val="0"/>
           <w:szCs w:val="24"/>
@@ -5657,7 +5531,7 @@
       </w:r>
       <w:r>
         <w:rPr>
-          <w:rFonts w:ascii="Courier New" w:hAnsi="Courier New" w:eastAsia="Calibri" w:cs="Courier New"/>
+          <w:rFonts w:ascii="Courier New" w:eastAsia="Calibri" w:hAnsi="Courier New" w:cs="Courier New"/>
           <w:b w:val="0"/>
           <w:bCs w:val="0"/>
           <w:szCs w:val="24"/>
@@ -5667,7 +5541,7 @@
       </w:r>
       <w:r>
         <w:rPr>
-          <w:rFonts w:ascii="Courier New" w:hAnsi="Courier New" w:eastAsia="Calibri" w:cs="Courier New"/>
+          <w:rFonts w:ascii="Courier New" w:eastAsia="Calibri" w:hAnsi="Courier New" w:cs="Courier New"/>
           <w:b w:val="0"/>
           <w:bCs w:val="0"/>
           <w:szCs w:val="24"/>
@@ -5677,7 +5551,7 @@
       </w:r>
       <w:r>
         <w:rPr>
-          <w:rFonts w:ascii="Courier New" w:hAnsi="Courier New" w:eastAsia="Calibri" w:cs="Courier New"/>
+          <w:rFonts w:ascii="Courier New" w:eastAsia="Calibri" w:hAnsi="Courier New" w:cs="Courier New"/>
           <w:b w:val="0"/>
           <w:bCs w:val="0"/>
           <w:szCs w:val="24"/>
@@ -5687,7 +5561,7 @@
       </w:r>
       <w:r>
         <w:rPr>
-          <w:rFonts w:ascii="Courier New" w:hAnsi="Courier New" w:eastAsia="Calibri" w:cs="Courier New"/>
+          <w:rFonts w:ascii="Courier New" w:eastAsia="Calibri" w:hAnsi="Courier New" w:cs="Courier New"/>
           <w:b w:val="0"/>
           <w:bCs w:val="0"/>
           <w:szCs w:val="24"/>
@@ -5697,7 +5571,7 @@
       </w:r>
       <w:r>
         <w:rPr>
-          <w:rFonts w:ascii="Courier New" w:hAnsi="Courier New" w:eastAsia="Calibri" w:cs="Courier New"/>
+          <w:rFonts w:ascii="Courier New" w:eastAsia="Calibri" w:hAnsi="Courier New" w:cs="Courier New"/>
           <w:b w:val="0"/>
           <w:bCs w:val="0"/>
           <w:szCs w:val="24"/>
@@ -5707,7 +5581,7 @@
       </w:r>
       <w:r>
         <w:rPr>
-          <w:rFonts w:ascii="Courier New" w:hAnsi="Courier New" w:eastAsia="Calibri" w:cs="Courier New"/>
+          <w:rFonts w:ascii="Courier New" w:eastAsia="Calibri" w:hAnsi="Courier New" w:cs="Courier New"/>
           <w:b w:val="0"/>
           <w:bCs w:val="0"/>
           <w:szCs w:val="24"/>
@@ -5819,15 +5693,15 @@
         <w:spacing w:before="240" w:after="240"/>
         <w:jc w:val="both"/>
         <w:rPr>
-          <w:rFonts w:ascii="Century Gothic" w:hAnsi="Century Gothic" w:eastAsia="Century Gothic" w:cs="Century Gothic"/>
-          <w:sz w:val="22"/>
-          <w:szCs w:val="22"/>
-          <w:lang w:val="en-US"/>
-        </w:rPr>
-      </w:pPr>
-      <w:r>
-        <w:rPr>
-          <w:rFonts w:ascii="Century Gothic" w:hAnsi="Century Gothic" w:eastAsia="Century Gothic" w:cs="Century Gothic"/>
+          <w:rFonts w:ascii="Century Gothic" w:eastAsia="Century Gothic" w:hAnsi="Century Gothic" w:cs="Century Gothic"/>
+          <w:sz w:val="22"/>
+          <w:szCs w:val="22"/>
+          <w:lang w:val="en-US"/>
+        </w:rPr>
+      </w:pPr>
+      <w:r>
+        <w:rPr>
+          <w:rFonts w:ascii="Century Gothic" w:eastAsia="Century Gothic" w:hAnsi="Century Gothic" w:cs="Century Gothic"/>
           <w:sz w:val="22"/>
           <w:szCs w:val="22"/>
           <w:lang w:val="en-US"/>
@@ -5837,7 +5711,7 @@
       <w:proofErr w:type="spellStart"/>
       <w:r>
         <w:rPr>
-          <w:rFonts w:ascii="Century Gothic" w:hAnsi="Century Gothic" w:eastAsia="Century Gothic" w:cs="Century Gothic"/>
+          <w:rFonts w:ascii="Century Gothic" w:eastAsia="Century Gothic" w:hAnsi="Century Gothic" w:cs="Century Gothic"/>
           <w:sz w:val="22"/>
           <w:szCs w:val="22"/>
           <w:lang w:val="en-US"/>
@@ -5847,7 +5721,7 @@
       <w:proofErr w:type="spellEnd"/>
       <w:r>
         <w:rPr>
-          <w:rFonts w:ascii="Century Gothic" w:hAnsi="Century Gothic" w:eastAsia="Century Gothic" w:cs="Century Gothic"/>
+          <w:rFonts w:ascii="Century Gothic" w:eastAsia="Century Gothic" w:hAnsi="Century Gothic" w:cs="Century Gothic"/>
           <w:sz w:val="22"/>
           <w:szCs w:val="22"/>
           <w:lang w:val="en-US"/>
@@ -5861,15 +5735,9 @@
         <w:jc w:val="both"/>
       </w:pPr>
       <w:r>
-        <w:rPr>
-          <w:noProof/>
-        </w:rPr>
-      </w:r>
-      <w:r>
         <w:pict w14:anchorId="29D541B8">
-          <v:shape id="_x0000_s1029" style="width:116.25pt;height:94.4pt;mso-position-horizontal-relative:char;mso-position-vertical-relative:line" type="#_x0000_t75">
-            <v:imagedata o:title="" r:id="rId8"/>
-            <w10:anchorlock/>
+          <v:shape id="_x0000_i1028" type="#_x0000_t75" style="width:116.35pt;height:94.6pt;mso-position-horizontal-relative:char;mso-position-vertical-relative:line">
+            <v:imagedata r:id="rId8" o:title=""/>
           </v:shape>
         </w:pict>
       </w:r>
@@ -5882,7 +5750,7 @@
       <w:proofErr w:type="spellStart"/>
       <w:r>
         <w:rPr>
-          <w:rFonts w:ascii="Century Gothic" w:hAnsi="Century Gothic" w:eastAsia="Century Gothic" w:cs="Century Gothic"/>
+          <w:rFonts w:ascii="Century Gothic" w:eastAsia="Century Gothic" w:hAnsi="Century Gothic" w:cs="Century Gothic"/>
           <w:sz w:val="22"/>
           <w:szCs w:val="22"/>
           <w:lang w:val="en-US"/>
@@ -5892,7 +5760,7 @@
       <w:proofErr w:type="spellEnd"/>
       <w:r>
         <w:rPr>
-          <w:rFonts w:ascii="Century Gothic" w:hAnsi="Century Gothic" w:eastAsia="Century Gothic" w:cs="Century Gothic"/>
+          <w:rFonts w:ascii="Century Gothic" w:eastAsia="Century Gothic" w:hAnsi="Century Gothic" w:cs="Century Gothic"/>
           <w:sz w:val="22"/>
           <w:szCs w:val="22"/>
           <w:lang w:val="en-US"/>
@@ -6163,11 +6031,12 @@
       </w:pPr>
       <w:r>
         <w:rPr>
-          <w:rFonts w:ascii="Century Gothic" w:hAnsi="Century Gothic" w:eastAsia="Century Gothic" w:cs="Century Gothic"/>
-          <w:sz w:val="22"/>
-          <w:szCs w:val="22"/>
-          <w:lang w:val="en-US"/>
-        </w:rPr>
+          <w:rFonts w:ascii="Century Gothic" w:eastAsia="Century Gothic" w:hAnsi="Century Gothic" w:cs="Century Gothic"/>
+          <w:sz w:val="22"/>
+          <w:szCs w:val="22"/>
+          <w:lang w:val="en-US"/>
+        </w:rPr>
+        <w:lastRenderedPageBreak/>
         <w:t>The two filter outputs represent the same underlying respiratory oscillation extracted from the RR-intervals and from the respiration signal. The RR component reflects respiratory sinus arrhythmia, while the respiration component is the filtered version of the breathing signal itself. Visually, the amplitudes of the two outputs are clearly correlated, showing the same envelope and similar variations over time.</w:t>
       </w:r>
     </w:p>
@@ -6178,7 +6047,7 @@
       </w:pPr>
       <w:r>
         <w:rPr>
-          <w:rFonts w:ascii="Century Gothic" w:hAnsi="Century Gothic" w:eastAsia="Century Gothic" w:cs="Century Gothic"/>
+          <w:rFonts w:ascii="Century Gothic" w:eastAsia="Century Gothic" w:hAnsi="Century Gothic" w:cs="Century Gothic"/>
           <w:sz w:val="22"/>
           <w:szCs w:val="22"/>
           <w:lang w:val="en-US"/>
@@ -6193,7 +6062,7 @@
       </w:pPr>
       <w:r>
         <w:rPr>
-          <w:rFonts w:ascii="Century Gothic" w:hAnsi="Century Gothic" w:eastAsia="Century Gothic" w:cs="Century Gothic"/>
+          <w:rFonts w:ascii="Century Gothic" w:eastAsia="Century Gothic" w:hAnsi="Century Gothic" w:cs="Century Gothic"/>
           <w:sz w:val="22"/>
           <w:szCs w:val="22"/>
           <w:lang w:val="en-US"/>
@@ -6471,7 +6340,7 @@
         <w:spacing w:before="240" w:after="240"/>
         <w:jc w:val="both"/>
         <w:rPr>
-          <w:rFonts w:ascii="Century Gothic" w:hAnsi="Century Gothic" w:eastAsia="Century Gothic" w:cs="Century Gothic"/>
+          <w:rFonts w:ascii="Century Gothic" w:eastAsia="Century Gothic" w:hAnsi="Century Gothic" w:cs="Century Gothic"/>
           <w:sz w:val="24"/>
           <w:szCs w:val="24"/>
           <w:lang w:val="en-US"/>
@@ -6479,12 +6348,48 @@
       </w:pPr>
       <w:r>
         <w:rPr>
-          <w:rFonts w:ascii="Century Gothic" w:hAnsi="Century Gothic" w:eastAsia="Century Gothic" w:cs="Century Gothic"/>
+          <w:rFonts w:ascii="Century Gothic" w:eastAsia="Century Gothic" w:hAnsi="Century Gothic" w:cs="Century Gothic"/>
           <w:sz w:val="24"/>
           <w:szCs w:val="24"/>
           <w:lang w:val="en-US"/>
         </w:rPr>
-        <w:t>The two filter outputs represent the common low-frequency oscillation shared by the RR-intervals and blood pressure, which corresponds to the baroreflex modulation. The RR component shows the slow variations in heart period caused by autonomic regulation, while the BP component reflects the corresponding low-frequency oscillation in arterial pressure.</w:t>
+        <w:t xml:space="preserve">The two filter outputs represent the common low-frequency oscillation shared by the </w:t>
+      </w:r>
+      <w:r>
+        <w:rPr>
+          <w:rFonts w:ascii="Century Gothic" w:eastAsia="Century Gothic" w:hAnsi="Century Gothic" w:cs="Century Gothic"/>
+          <w:sz w:val="24"/>
+          <w:szCs w:val="24"/>
+          <w:lang w:val="en-US"/>
+        </w:rPr>
+        <w:t xml:space="preserve">RR intervals and blood pressure, which corresponds to </w:t>
+      </w:r>
+      <w:r>
+        <w:rPr>
+          <w:rFonts w:ascii="Century Gothic" w:eastAsia="Century Gothic" w:hAnsi="Century Gothic" w:cs="Century Gothic"/>
+          <w:sz w:val="24"/>
+          <w:szCs w:val="24"/>
+          <w:lang w:val="en-US"/>
+        </w:rPr>
+        <w:t xml:space="preserve">baroreflex modulation. The RR component </w:t>
+      </w:r>
+      <w:r>
+        <w:rPr>
+          <w:rFonts w:ascii="Century Gothic" w:eastAsia="Century Gothic" w:hAnsi="Century Gothic" w:cs="Century Gothic"/>
+          <w:sz w:val="24"/>
+          <w:szCs w:val="24"/>
+          <w:lang w:val="en-US"/>
+        </w:rPr>
+        <w:t>represents the slow variations in heart period resulting from</w:t>
+      </w:r>
+      <w:r>
+        <w:rPr>
+          <w:rFonts w:ascii="Century Gothic" w:eastAsia="Century Gothic" w:hAnsi="Century Gothic" w:cs="Century Gothic"/>
+          <w:sz w:val="24"/>
+          <w:szCs w:val="24"/>
+          <w:lang w:val="en-US"/>
+        </w:rPr>
+        <w:t xml:space="preserve"> autonomic regulation, while the BP component reflects the corresponding low-frequency oscillation in arterial pressure.</w:t>
       </w:r>
     </w:p>
     <w:p>
@@ -6492,7 +6397,7 @@
         <w:spacing w:before="240" w:after="240"/>
         <w:jc w:val="both"/>
         <w:rPr>
-          <w:rFonts w:ascii="Century Gothic" w:hAnsi="Century Gothic" w:eastAsia="Century Gothic" w:cs="Century Gothic"/>
+          <w:rFonts w:ascii="Century Gothic" w:eastAsia="Century Gothic" w:hAnsi="Century Gothic" w:cs="Century Gothic"/>
           <w:sz w:val="24"/>
           <w:szCs w:val="24"/>
           <w:lang w:val="en-US"/>
@@ -6500,7 +6405,7 @@
       </w:pPr>
       <w:r>
         <w:rPr>
-          <w:rFonts w:ascii="Century Gothic" w:hAnsi="Century Gothic" w:eastAsia="Century Gothic" w:cs="Century Gothic"/>
+          <w:rFonts w:ascii="Century Gothic" w:eastAsia="Century Gothic" w:hAnsi="Century Gothic" w:cs="Century Gothic"/>
           <w:sz w:val="24"/>
           <w:szCs w:val="24"/>
           <w:lang w:val="en-US"/>
@@ -6513,7 +6418,7 @@
         <w:spacing w:before="240" w:after="240"/>
         <w:jc w:val="both"/>
         <w:rPr>
-          <w:rFonts w:ascii="Century Gothic" w:hAnsi="Century Gothic" w:eastAsia="Century Gothic" w:cs="Century Gothic"/>
+          <w:rFonts w:ascii="Century Gothic" w:eastAsia="Century Gothic" w:hAnsi="Century Gothic" w:cs="Century Gothic"/>
           <w:sz w:val="24"/>
           <w:szCs w:val="24"/>
           <w:lang w:val="en-US"/>
@@ -6521,7 +6426,7 @@
       </w:pPr>
       <w:r>
         <w:rPr>
-          <w:rFonts w:ascii="Century Gothic" w:hAnsi="Century Gothic" w:eastAsia="Century Gothic" w:cs="Century Gothic"/>
+          <w:rFonts w:ascii="Century Gothic" w:eastAsia="Century Gothic" w:hAnsi="Century Gothic" w:cs="Century Gothic"/>
           <w:sz w:val="24"/>
           <w:szCs w:val="24"/>
           <w:lang w:val="en-US"/>
@@ -6576,7 +6481,7 @@
       </w:pPr>
     </w:p>
     <w:sectPr>
-      <w:pgSz w:w="11906" w:h="16838" w:orient="portrait"/>
+      <w:pgSz w:w="11906" w:h="16838"/>
       <w:pgMar w:top="709" w:right="991" w:bottom="993" w:left="1134" w:header="720" w:footer="720" w:gutter="0"/>
       <w:cols w:space="720"/>
     </w:sectPr>
@@ -6602,7 +6507,7 @@
         <w:ind w:left="360" w:hanging="360"/>
       </w:pPr>
       <w:rPr>
-        <w:rFonts w:hint="default" w:ascii="Symbol" w:hAnsi="Symbol"/>
+        <w:rFonts w:ascii="Symbol" w:hAnsi="Symbol" w:hint="default"/>
       </w:rPr>
     </w:lvl>
     <w:lvl w:ilvl="1" w:tplc="04090003" w:tentative="1">
@@ -6617,7 +6522,7 @@
         <w:ind w:left="1080" w:hanging="360"/>
       </w:pPr>
       <w:rPr>
-        <w:rFonts w:hint="default" w:ascii="Courier New" w:hAnsi="Courier New"/>
+        <w:rFonts w:ascii="Courier New" w:hAnsi="Courier New" w:hint="default"/>
       </w:rPr>
     </w:lvl>
     <w:lvl w:ilvl="2" w:tplc="04090005" w:tentative="1">
@@ -6632,7 +6537,7 @@
         <w:ind w:left="1800" w:hanging="360"/>
       </w:pPr>
       <w:rPr>
-        <w:rFonts w:hint="default" w:ascii="Wingdings" w:hAnsi="Wingdings"/>
+        <w:rFonts w:ascii="Wingdings" w:hAnsi="Wingdings" w:hint="default"/>
       </w:rPr>
     </w:lvl>
     <w:lvl w:ilvl="3" w:tplc="04090001" w:tentative="1">
@@ -6647,7 +6552,7 @@
         <w:ind w:left="2520" w:hanging="360"/>
       </w:pPr>
       <w:rPr>
-        <w:rFonts w:hint="default" w:ascii="Symbol" w:hAnsi="Symbol"/>
+        <w:rFonts w:ascii="Symbol" w:hAnsi="Symbol" w:hint="default"/>
       </w:rPr>
     </w:lvl>
     <w:lvl w:ilvl="4" w:tplc="04090003" w:tentative="1">
@@ -6662,7 +6567,7 @@
         <w:ind w:left="3240" w:hanging="360"/>
       </w:pPr>
       <w:rPr>
-        <w:rFonts w:hint="default" w:ascii="Courier New" w:hAnsi="Courier New"/>
+        <w:rFonts w:ascii="Courier New" w:hAnsi="Courier New" w:hint="default"/>
       </w:rPr>
     </w:lvl>
     <w:lvl w:ilvl="5" w:tplc="04090005" w:tentative="1">
@@ -6677,7 +6582,7 @@
         <w:ind w:left="3960" w:hanging="360"/>
       </w:pPr>
       <w:rPr>
-        <w:rFonts w:hint="default" w:ascii="Wingdings" w:hAnsi="Wingdings"/>
+        <w:rFonts w:ascii="Wingdings" w:hAnsi="Wingdings" w:hint="default"/>
       </w:rPr>
     </w:lvl>
     <w:lvl w:ilvl="6" w:tplc="04090001" w:tentative="1">
@@ -6692,7 +6597,7 @@
         <w:ind w:left="4680" w:hanging="360"/>
       </w:pPr>
       <w:rPr>
-        <w:rFonts w:hint="default" w:ascii="Symbol" w:hAnsi="Symbol"/>
+        <w:rFonts w:ascii="Symbol" w:hAnsi="Symbol" w:hint="default"/>
       </w:rPr>
     </w:lvl>
     <w:lvl w:ilvl="7" w:tplc="04090003" w:tentative="1">
@@ -6707,7 +6612,7 @@
         <w:ind w:left="5400" w:hanging="360"/>
       </w:pPr>
       <w:rPr>
-        <w:rFonts w:hint="default" w:ascii="Courier New" w:hAnsi="Courier New"/>
+        <w:rFonts w:ascii="Courier New" w:hAnsi="Courier New" w:hint="default"/>
       </w:rPr>
     </w:lvl>
     <w:lvl w:ilvl="8" w:tplc="04090005" w:tentative="1">
@@ -6722,7 +6627,7 @@
         <w:ind w:left="6120" w:hanging="360"/>
       </w:pPr>
       <w:rPr>
-        <w:rFonts w:hint="default" w:ascii="Wingdings" w:hAnsi="Wingdings"/>
+        <w:rFonts w:ascii="Wingdings" w:hAnsi="Wingdings" w:hint="default"/>
       </w:rPr>
     </w:lvl>
   </w:abstractNum>
@@ -6742,7 +6647,7 @@
         <w:ind w:left="360" w:hanging="360"/>
       </w:pPr>
       <w:rPr>
-        <w:rFonts w:hint="default" w:ascii="Symbol" w:hAnsi="Symbol"/>
+        <w:rFonts w:ascii="Symbol" w:hAnsi="Symbol" w:hint="default"/>
       </w:rPr>
     </w:lvl>
     <w:lvl w:ilvl="1" w:tplc="100C0003" w:tentative="1">
@@ -6757,7 +6662,7 @@
         <w:ind w:left="1080" w:hanging="360"/>
       </w:pPr>
       <w:rPr>
-        <w:rFonts w:hint="default" w:ascii="Courier New" w:hAnsi="Courier New" w:cs="Courier New"/>
+        <w:rFonts w:ascii="Courier New" w:hAnsi="Courier New" w:cs="Courier New" w:hint="default"/>
       </w:rPr>
     </w:lvl>
     <w:lvl w:ilvl="2" w:tplc="100C0005" w:tentative="1">
@@ -6772,7 +6677,7 @@
         <w:ind w:left="1800" w:hanging="360"/>
       </w:pPr>
       <w:rPr>
-        <w:rFonts w:hint="default" w:ascii="Wingdings" w:hAnsi="Wingdings"/>
+        <w:rFonts w:ascii="Wingdings" w:hAnsi="Wingdings" w:hint="default"/>
       </w:rPr>
     </w:lvl>
     <w:lvl w:ilvl="3" w:tplc="100C0001" w:tentative="1">
@@ -6787,7 +6692,7 @@
         <w:ind w:left="2520" w:hanging="360"/>
       </w:pPr>
       <w:rPr>
-        <w:rFonts w:hint="default" w:ascii="Symbol" w:hAnsi="Symbol"/>
+        <w:rFonts w:ascii="Symbol" w:hAnsi="Symbol" w:hint="default"/>
       </w:rPr>
     </w:lvl>
     <w:lvl w:ilvl="4" w:tplc="100C0003" w:tentative="1">
@@ -6802,7 +6707,7 @@
         <w:ind w:left="3240" w:hanging="360"/>
       </w:pPr>
       <w:rPr>
-        <w:rFonts w:hint="default" w:ascii="Courier New" w:hAnsi="Courier New" w:cs="Courier New"/>
+        <w:rFonts w:ascii="Courier New" w:hAnsi="Courier New" w:cs="Courier New" w:hint="default"/>
       </w:rPr>
     </w:lvl>
     <w:lvl w:ilvl="5" w:tplc="100C0005" w:tentative="1">
@@ -6817,7 +6722,7 @@
         <w:ind w:left="3960" w:hanging="360"/>
       </w:pPr>
       <w:rPr>
-        <w:rFonts w:hint="default" w:ascii="Wingdings" w:hAnsi="Wingdings"/>
+        <w:rFonts w:ascii="Wingdings" w:hAnsi="Wingdings" w:hint="default"/>
       </w:rPr>
     </w:lvl>
     <w:lvl w:ilvl="6" w:tplc="100C0001" w:tentative="1">
@@ -6832,7 +6737,7 @@
         <w:ind w:left="4680" w:hanging="360"/>
       </w:pPr>
       <w:rPr>
-        <w:rFonts w:hint="default" w:ascii="Symbol" w:hAnsi="Symbol"/>
+        <w:rFonts w:ascii="Symbol" w:hAnsi="Symbol" w:hint="default"/>
       </w:rPr>
     </w:lvl>
     <w:lvl w:ilvl="7" w:tplc="100C0003" w:tentative="1">
@@ -6847,7 +6752,7 @@
         <w:ind w:left="5400" w:hanging="360"/>
       </w:pPr>
       <w:rPr>
-        <w:rFonts w:hint="default" w:ascii="Courier New" w:hAnsi="Courier New" w:cs="Courier New"/>
+        <w:rFonts w:ascii="Courier New" w:hAnsi="Courier New" w:cs="Courier New" w:hint="default"/>
       </w:rPr>
     </w:lvl>
     <w:lvl w:ilvl="8" w:tplc="100C0005" w:tentative="1">
@@ -6862,7 +6767,7 @@
         <w:ind w:left="6120" w:hanging="360"/>
       </w:pPr>
       <w:rPr>
-        <w:rFonts w:hint="default" w:ascii="Wingdings" w:hAnsi="Wingdings"/>
+        <w:rFonts w:ascii="Wingdings" w:hAnsi="Wingdings" w:hint="default"/>
       </w:rPr>
     </w:lvl>
   </w:abstractNum>
@@ -7411,7 +7316,7 @@
         <w:ind w:left="360" w:hanging="360"/>
       </w:pPr>
       <w:rPr>
-        <w:rFonts w:hint="default" w:ascii="Symbol" w:hAnsi="Symbol"/>
+        <w:rFonts w:ascii="Symbol" w:hAnsi="Symbol" w:hint="default"/>
       </w:rPr>
     </w:lvl>
     <w:lvl w:ilvl="1" w:tplc="100C0003" w:tentative="1">
@@ -7426,7 +7331,7 @@
         <w:ind w:left="1080" w:hanging="360"/>
       </w:pPr>
       <w:rPr>
-        <w:rFonts w:hint="default" w:ascii="Courier New" w:hAnsi="Courier New" w:cs="Courier New"/>
+        <w:rFonts w:ascii="Courier New" w:hAnsi="Courier New" w:cs="Courier New" w:hint="default"/>
       </w:rPr>
     </w:lvl>
     <w:lvl w:ilvl="2" w:tplc="100C0005" w:tentative="1">
@@ -7441,7 +7346,7 @@
         <w:ind w:left="1800" w:hanging="360"/>
       </w:pPr>
       <w:rPr>
-        <w:rFonts w:hint="default" w:ascii="Wingdings" w:hAnsi="Wingdings"/>
+        <w:rFonts w:ascii="Wingdings" w:hAnsi="Wingdings" w:hint="default"/>
       </w:rPr>
     </w:lvl>
     <w:lvl w:ilvl="3" w:tplc="100C0001" w:tentative="1">
@@ -7456,7 +7361,7 @@
         <w:ind w:left="2520" w:hanging="360"/>
       </w:pPr>
       <w:rPr>
-        <w:rFonts w:hint="default" w:ascii="Symbol" w:hAnsi="Symbol"/>
+        <w:rFonts w:ascii="Symbol" w:hAnsi="Symbol" w:hint="default"/>
       </w:rPr>
     </w:lvl>
     <w:lvl w:ilvl="4" w:tplc="100C0003" w:tentative="1">
@@ -7471,7 +7376,7 @@
         <w:ind w:left="3240" w:hanging="360"/>
       </w:pPr>
       <w:rPr>
-        <w:rFonts w:hint="default" w:ascii="Courier New" w:hAnsi="Courier New" w:cs="Courier New"/>
+        <w:rFonts w:ascii="Courier New" w:hAnsi="Courier New" w:cs="Courier New" w:hint="default"/>
       </w:rPr>
     </w:lvl>
     <w:lvl w:ilvl="5" w:tplc="100C0005" w:tentative="1">
@@ -7486,7 +7391,7 @@
         <w:ind w:left="3960" w:hanging="360"/>
       </w:pPr>
       <w:rPr>
-        <w:rFonts w:hint="default" w:ascii="Wingdings" w:hAnsi="Wingdings"/>
+        <w:rFonts w:ascii="Wingdings" w:hAnsi="Wingdings" w:hint="default"/>
       </w:rPr>
     </w:lvl>
     <w:lvl w:ilvl="6" w:tplc="100C0001" w:tentative="1">
@@ -7501,7 +7406,7 @@
         <w:ind w:left="4680" w:hanging="360"/>
       </w:pPr>
       <w:rPr>
-        <w:rFonts w:hint="default" w:ascii="Symbol" w:hAnsi="Symbol"/>
+        <w:rFonts w:ascii="Symbol" w:hAnsi="Symbol" w:hint="default"/>
       </w:rPr>
     </w:lvl>
     <w:lvl w:ilvl="7" w:tplc="100C0003" w:tentative="1">
@@ -7516,7 +7421,7 @@
         <w:ind w:left="5400" w:hanging="360"/>
       </w:pPr>
       <w:rPr>
-        <w:rFonts w:hint="default" w:ascii="Courier New" w:hAnsi="Courier New" w:cs="Courier New"/>
+        <w:rFonts w:ascii="Courier New" w:hAnsi="Courier New" w:cs="Courier New" w:hint="default"/>
       </w:rPr>
     </w:lvl>
     <w:lvl w:ilvl="8" w:tplc="100C0005" w:tentative="1">
@@ -7531,7 +7436,7 @@
         <w:ind w:left="6120" w:hanging="360"/>
       </w:pPr>
       <w:rPr>
-        <w:rFonts w:hint="default" w:ascii="Wingdings" w:hAnsi="Wingdings"/>
+        <w:rFonts w:ascii="Wingdings" w:hAnsi="Wingdings" w:hint="default"/>
       </w:rPr>
     </w:lvl>
   </w:abstractNum>
@@ -7774,7 +7679,7 @@
         <w:ind w:left="1080" w:hanging="360"/>
       </w:pPr>
       <w:rPr>
-        <w:rFonts w:hint="default" w:ascii="Symbol" w:hAnsi="Symbol"/>
+        <w:rFonts w:ascii="Symbol" w:hAnsi="Symbol" w:hint="default"/>
       </w:rPr>
     </w:lvl>
     <w:lvl w:ilvl="1" w:tplc="F104D27C">
@@ -7786,7 +7691,7 @@
         <w:ind w:left="1800" w:hanging="360"/>
       </w:pPr>
       <w:rPr>
-        <w:rFonts w:hint="default" w:ascii="Courier New" w:hAnsi="Courier New"/>
+        <w:rFonts w:ascii="Courier New" w:hAnsi="Courier New" w:hint="default"/>
       </w:rPr>
     </w:lvl>
     <w:lvl w:ilvl="2" w:tplc="8C426BCA">
@@ -7798,7 +7703,7 @@
         <w:ind w:left="2520" w:hanging="360"/>
       </w:pPr>
       <w:rPr>
-        <w:rFonts w:hint="default" w:ascii="Wingdings" w:hAnsi="Wingdings"/>
+        <w:rFonts w:ascii="Wingdings" w:hAnsi="Wingdings" w:hint="default"/>
       </w:rPr>
     </w:lvl>
     <w:lvl w:ilvl="3" w:tplc="7C426BA0">
@@ -7810,7 +7715,7 @@
         <w:ind w:left="3240" w:hanging="360"/>
       </w:pPr>
       <w:rPr>
-        <w:rFonts w:hint="default" w:ascii="Symbol" w:hAnsi="Symbol"/>
+        <w:rFonts w:ascii="Symbol" w:hAnsi="Symbol" w:hint="default"/>
       </w:rPr>
     </w:lvl>
     <w:lvl w:ilvl="4" w:tplc="74880072">
@@ -7822,7 +7727,7 @@
         <w:ind w:left="3960" w:hanging="360"/>
       </w:pPr>
       <w:rPr>
-        <w:rFonts w:hint="default" w:ascii="Courier New" w:hAnsi="Courier New"/>
+        <w:rFonts w:ascii="Courier New" w:hAnsi="Courier New" w:hint="default"/>
       </w:rPr>
     </w:lvl>
     <w:lvl w:ilvl="5" w:tplc="7812AB0C">
@@ -7834,7 +7739,7 @@
         <w:ind w:left="4680" w:hanging="360"/>
       </w:pPr>
       <w:rPr>
-        <w:rFonts w:hint="default" w:ascii="Wingdings" w:hAnsi="Wingdings"/>
+        <w:rFonts w:ascii="Wingdings" w:hAnsi="Wingdings" w:hint="default"/>
       </w:rPr>
     </w:lvl>
     <w:lvl w:ilvl="6" w:tplc="98F20A84">
@@ -7846,7 +7751,7 @@
         <w:ind w:left="5400" w:hanging="360"/>
       </w:pPr>
       <w:rPr>
-        <w:rFonts w:hint="default" w:ascii="Symbol" w:hAnsi="Symbol"/>
+        <w:rFonts w:ascii="Symbol" w:hAnsi="Symbol" w:hint="default"/>
       </w:rPr>
     </w:lvl>
     <w:lvl w:ilvl="7" w:tplc="B3344028">
@@ -7858,7 +7763,7 @@
         <w:ind w:left="6120" w:hanging="360"/>
       </w:pPr>
       <w:rPr>
-        <w:rFonts w:hint="default" w:ascii="Courier New" w:hAnsi="Courier New"/>
+        <w:rFonts w:ascii="Courier New" w:hAnsi="Courier New" w:hint="default"/>
       </w:rPr>
     </w:lvl>
     <w:lvl w:ilvl="8" w:tplc="A92A6314">
@@ -7870,7 +7775,7 @@
         <w:ind w:left="6840" w:hanging="360"/>
       </w:pPr>
       <w:rPr>
-        <w:rFonts w:hint="default" w:ascii="Wingdings" w:hAnsi="Wingdings"/>
+        <w:rFonts w:ascii="Wingdings" w:hAnsi="Wingdings" w:hint="default"/>
       </w:rPr>
     </w:lvl>
   </w:abstractNum>
@@ -8167,7 +8072,7 @@
         <w:ind w:left="720" w:hanging="360"/>
       </w:pPr>
       <w:rPr>
-        <w:rFonts w:hint="default" w:ascii="Wingdings" w:hAnsi="Wingdings"/>
+        <w:rFonts w:ascii="Wingdings" w:hAnsi="Wingdings" w:hint="default"/>
       </w:rPr>
     </w:lvl>
     <w:lvl w:ilvl="1" w:tplc="100C0003">
@@ -8179,7 +8084,7 @@
         <w:ind w:left="1440" w:hanging="360"/>
       </w:pPr>
       <w:rPr>
-        <w:rFonts w:hint="default" w:ascii="Courier New" w:hAnsi="Courier New" w:cs="Courier New"/>
+        <w:rFonts w:ascii="Courier New" w:hAnsi="Courier New" w:cs="Courier New" w:hint="default"/>
       </w:rPr>
     </w:lvl>
     <w:lvl w:ilvl="2" w:tplc="100C0005">
@@ -8191,7 +8096,7 @@
         <w:ind w:left="2160" w:hanging="360"/>
       </w:pPr>
       <w:rPr>
-        <w:rFonts w:hint="default" w:ascii="Wingdings" w:hAnsi="Wingdings"/>
+        <w:rFonts w:ascii="Wingdings" w:hAnsi="Wingdings" w:hint="default"/>
       </w:rPr>
     </w:lvl>
     <w:lvl w:ilvl="3" w:tplc="100C0001">
@@ -8203,7 +8108,7 @@
         <w:ind w:left="2880" w:hanging="360"/>
       </w:pPr>
       <w:rPr>
-        <w:rFonts w:hint="default" w:ascii="Symbol" w:hAnsi="Symbol"/>
+        <w:rFonts w:ascii="Symbol" w:hAnsi="Symbol" w:hint="default"/>
       </w:rPr>
     </w:lvl>
     <w:lvl w:ilvl="4" w:tplc="100C0003">
@@ -8215,7 +8120,7 @@
         <w:ind w:left="3600" w:hanging="360"/>
       </w:pPr>
       <w:rPr>
-        <w:rFonts w:hint="default" w:ascii="Courier New" w:hAnsi="Courier New" w:cs="Courier New"/>
+        <w:rFonts w:ascii="Courier New" w:hAnsi="Courier New" w:cs="Courier New" w:hint="default"/>
       </w:rPr>
     </w:lvl>
     <w:lvl w:ilvl="5" w:tplc="100C0005">
@@ -8227,7 +8132,7 @@
         <w:ind w:left="4320" w:hanging="360"/>
       </w:pPr>
       <w:rPr>
-        <w:rFonts w:hint="default" w:ascii="Wingdings" w:hAnsi="Wingdings"/>
+        <w:rFonts w:ascii="Wingdings" w:hAnsi="Wingdings" w:hint="default"/>
       </w:rPr>
     </w:lvl>
     <w:lvl w:ilvl="6" w:tplc="100C0001">
@@ -8239,7 +8144,7 @@
         <w:ind w:left="5040" w:hanging="360"/>
       </w:pPr>
       <w:rPr>
-        <w:rFonts w:hint="default" w:ascii="Symbol" w:hAnsi="Symbol"/>
+        <w:rFonts w:ascii="Symbol" w:hAnsi="Symbol" w:hint="default"/>
       </w:rPr>
     </w:lvl>
     <w:lvl w:ilvl="7" w:tplc="100C0003">
@@ -8251,7 +8156,7 @@
         <w:ind w:left="5760" w:hanging="360"/>
       </w:pPr>
       <w:rPr>
-        <w:rFonts w:hint="default" w:ascii="Courier New" w:hAnsi="Courier New" w:cs="Courier New"/>
+        <w:rFonts w:ascii="Courier New" w:hAnsi="Courier New" w:cs="Courier New" w:hint="default"/>
       </w:rPr>
     </w:lvl>
     <w:lvl w:ilvl="8" w:tplc="100C0005">
@@ -8263,7 +8168,7 @@
         <w:ind w:left="6480" w:hanging="360"/>
       </w:pPr>
       <w:rPr>
-        <w:rFonts w:hint="default" w:ascii="Wingdings" w:hAnsi="Wingdings"/>
+        <w:rFonts w:ascii="Wingdings" w:hAnsi="Wingdings" w:hint="default"/>
       </w:rPr>
     </w:lvl>
   </w:abstractNum>
@@ -8280,7 +8185,7 @@
         <w:ind w:left="720" w:hanging="360"/>
       </w:pPr>
       <w:rPr>
-        <w:rFonts w:hint="default" w:ascii="Symbol" w:hAnsi="Symbol"/>
+        <w:rFonts w:ascii="Symbol" w:hAnsi="Symbol" w:hint="default"/>
       </w:rPr>
     </w:lvl>
     <w:lvl w:ilvl="1" w:tplc="7CA447BA">
@@ -8292,7 +8197,7 @@
         <w:ind w:left="1440" w:hanging="360"/>
       </w:pPr>
       <w:rPr>
-        <w:rFonts w:hint="default" w:ascii="Courier New" w:hAnsi="Courier New"/>
+        <w:rFonts w:ascii="Courier New" w:hAnsi="Courier New" w:hint="default"/>
       </w:rPr>
     </w:lvl>
     <w:lvl w:ilvl="2" w:tplc="F9408D8E">
@@ -8304,7 +8209,7 @@
         <w:ind w:left="2160" w:hanging="360"/>
       </w:pPr>
       <w:rPr>
-        <w:rFonts w:hint="default" w:ascii="Wingdings" w:hAnsi="Wingdings"/>
+        <w:rFonts w:ascii="Wingdings" w:hAnsi="Wingdings" w:hint="default"/>
       </w:rPr>
     </w:lvl>
     <w:lvl w:ilvl="3" w:tplc="E2043302">
@@ -8316,7 +8221,7 @@
         <w:ind w:left="2880" w:hanging="360"/>
       </w:pPr>
       <w:rPr>
-        <w:rFonts w:hint="default" w:ascii="Symbol" w:hAnsi="Symbol"/>
+        <w:rFonts w:ascii="Symbol" w:hAnsi="Symbol" w:hint="default"/>
       </w:rPr>
     </w:lvl>
     <w:lvl w:ilvl="4" w:tplc="4A4CDA08">
@@ -8328,7 +8233,7 @@
         <w:ind w:left="3600" w:hanging="360"/>
       </w:pPr>
       <w:rPr>
-        <w:rFonts w:hint="default" w:ascii="Courier New" w:hAnsi="Courier New"/>
+        <w:rFonts w:ascii="Courier New" w:hAnsi="Courier New" w:hint="default"/>
       </w:rPr>
     </w:lvl>
     <w:lvl w:ilvl="5" w:tplc="140A25C0">
@@ -8340,7 +8245,7 @@
         <w:ind w:left="4320" w:hanging="360"/>
       </w:pPr>
       <w:rPr>
-        <w:rFonts w:hint="default" w:ascii="Wingdings" w:hAnsi="Wingdings"/>
+        <w:rFonts w:ascii="Wingdings" w:hAnsi="Wingdings" w:hint="default"/>
       </w:rPr>
     </w:lvl>
     <w:lvl w:ilvl="6" w:tplc="804C734C">
@@ -8352,7 +8257,7 @@
         <w:ind w:left="5040" w:hanging="360"/>
       </w:pPr>
       <w:rPr>
-        <w:rFonts w:hint="default" w:ascii="Symbol" w:hAnsi="Symbol"/>
+        <w:rFonts w:ascii="Symbol" w:hAnsi="Symbol" w:hint="default"/>
       </w:rPr>
     </w:lvl>
     <w:lvl w:ilvl="7" w:tplc="84C86122">
@@ -8364,7 +8269,7 @@
         <w:ind w:left="5760" w:hanging="360"/>
       </w:pPr>
       <w:rPr>
-        <w:rFonts w:hint="default" w:ascii="Courier New" w:hAnsi="Courier New"/>
+        <w:rFonts w:ascii="Courier New" w:hAnsi="Courier New" w:hint="default"/>
       </w:rPr>
     </w:lvl>
     <w:lvl w:ilvl="8" w:tplc="D1960BF4">
@@ -8376,7 +8281,7 @@
         <w:ind w:left="6480" w:hanging="360"/>
       </w:pPr>
       <w:rPr>
-        <w:rFonts w:hint="default" w:ascii="Wingdings" w:hAnsi="Wingdings"/>
+        <w:rFonts w:ascii="Wingdings" w:hAnsi="Wingdings" w:hint="default"/>
       </w:rPr>
     </w:lvl>
   </w:abstractNum>
@@ -8393,7 +8298,7 @@
         <w:ind w:left="720" w:hanging="360"/>
       </w:pPr>
       <w:rPr>
-        <w:rFonts w:hint="default" w:ascii="Symbol" w:hAnsi="Symbol"/>
+        <w:rFonts w:ascii="Symbol" w:hAnsi="Symbol" w:hint="default"/>
       </w:rPr>
     </w:lvl>
     <w:lvl w:ilvl="1" w:tplc="5C488C60">
@@ -8405,7 +8310,7 @@
         <w:ind w:left="1440" w:hanging="360"/>
       </w:pPr>
       <w:rPr>
-        <w:rFonts w:hint="default" w:ascii="Courier New" w:hAnsi="Courier New"/>
+        <w:rFonts w:ascii="Courier New" w:hAnsi="Courier New" w:hint="default"/>
       </w:rPr>
     </w:lvl>
     <w:lvl w:ilvl="2" w:tplc="E430A5BA">
@@ -8417,7 +8322,7 @@
         <w:ind w:left="2160" w:hanging="360"/>
       </w:pPr>
       <w:rPr>
-        <w:rFonts w:hint="default" w:ascii="Wingdings" w:hAnsi="Wingdings"/>
+        <w:rFonts w:ascii="Wingdings" w:hAnsi="Wingdings" w:hint="default"/>
       </w:rPr>
     </w:lvl>
     <w:lvl w:ilvl="3" w:tplc="3AE6D95E">
@@ -8429,7 +8334,7 @@
         <w:ind w:left="2880" w:hanging="360"/>
       </w:pPr>
       <w:rPr>
-        <w:rFonts w:hint="default" w:ascii="Symbol" w:hAnsi="Symbol"/>
+        <w:rFonts w:ascii="Symbol" w:hAnsi="Symbol" w:hint="default"/>
       </w:rPr>
     </w:lvl>
     <w:lvl w:ilvl="4" w:tplc="8194A626">
@@ -8441,7 +8346,7 @@
         <w:ind w:left="3600" w:hanging="360"/>
       </w:pPr>
       <w:rPr>
-        <w:rFonts w:hint="default" w:ascii="Courier New" w:hAnsi="Courier New"/>
+        <w:rFonts w:ascii="Courier New" w:hAnsi="Courier New" w:hint="default"/>
       </w:rPr>
     </w:lvl>
     <w:lvl w:ilvl="5" w:tplc="876A5B4E">
@@ -8453,7 +8358,7 @@
         <w:ind w:left="4320" w:hanging="360"/>
       </w:pPr>
       <w:rPr>
-        <w:rFonts w:hint="default" w:ascii="Wingdings" w:hAnsi="Wingdings"/>
+        <w:rFonts w:ascii="Wingdings" w:hAnsi="Wingdings" w:hint="default"/>
       </w:rPr>
     </w:lvl>
     <w:lvl w:ilvl="6" w:tplc="161A53A6">
@@ -8465,7 +8370,7 @@
         <w:ind w:left="5040" w:hanging="360"/>
       </w:pPr>
       <w:rPr>
-        <w:rFonts w:hint="default" w:ascii="Symbol" w:hAnsi="Symbol"/>
+        <w:rFonts w:ascii="Symbol" w:hAnsi="Symbol" w:hint="default"/>
       </w:rPr>
     </w:lvl>
     <w:lvl w:ilvl="7" w:tplc="8D86C3B6">
@@ -8477,7 +8382,7 @@
         <w:ind w:left="5760" w:hanging="360"/>
       </w:pPr>
       <w:rPr>
-        <w:rFonts w:hint="default" w:ascii="Courier New" w:hAnsi="Courier New"/>
+        <w:rFonts w:ascii="Courier New" w:hAnsi="Courier New" w:hint="default"/>
       </w:rPr>
     </w:lvl>
     <w:lvl w:ilvl="8" w:tplc="9D74F766">
@@ -8489,7 +8394,7 @@
         <w:ind w:left="6480" w:hanging="360"/>
       </w:pPr>
       <w:rPr>
-        <w:rFonts w:hint="default" w:ascii="Wingdings" w:hAnsi="Wingdings"/>
+        <w:rFonts w:ascii="Wingdings" w:hAnsi="Wingdings" w:hint="default"/>
       </w:rPr>
     </w:lvl>
   </w:abstractNum>
@@ -8878,7 +8783,7 @@
         <w:ind w:left="360" w:hanging="360"/>
       </w:pPr>
       <w:rPr>
-        <w:rFonts w:hint="default" w:ascii="Symbol" w:hAnsi="Symbol"/>
+        <w:rFonts w:ascii="Symbol" w:hAnsi="Symbol" w:hint="default"/>
       </w:rPr>
     </w:lvl>
     <w:lvl w:ilvl="1" w:tplc="04090003" w:tentative="1">
@@ -8893,7 +8798,7 @@
         <w:ind w:left="1080" w:hanging="360"/>
       </w:pPr>
       <w:rPr>
-        <w:rFonts w:hint="default" w:ascii="Courier New" w:hAnsi="Courier New" w:cs="Courier New"/>
+        <w:rFonts w:ascii="Courier New" w:hAnsi="Courier New" w:cs="Courier New" w:hint="default"/>
       </w:rPr>
     </w:lvl>
     <w:lvl w:ilvl="2" w:tplc="04090005" w:tentative="1">
@@ -8908,7 +8813,7 @@
         <w:ind w:left="1800" w:hanging="360"/>
       </w:pPr>
       <w:rPr>
-        <w:rFonts w:hint="default" w:ascii="Wingdings" w:hAnsi="Wingdings"/>
+        <w:rFonts w:ascii="Wingdings" w:hAnsi="Wingdings" w:hint="default"/>
       </w:rPr>
     </w:lvl>
     <w:lvl w:ilvl="3" w:tplc="04090001" w:tentative="1">
@@ -8923,7 +8828,7 @@
         <w:ind w:left="2520" w:hanging="360"/>
       </w:pPr>
       <w:rPr>
-        <w:rFonts w:hint="default" w:ascii="Symbol" w:hAnsi="Symbol"/>
+        <w:rFonts w:ascii="Symbol" w:hAnsi="Symbol" w:hint="default"/>
       </w:rPr>
     </w:lvl>
     <w:lvl w:ilvl="4" w:tplc="04090003" w:tentative="1">
@@ -8938,7 +8843,7 @@
         <w:ind w:left="3240" w:hanging="360"/>
       </w:pPr>
       <w:rPr>
-        <w:rFonts w:hint="default" w:ascii="Courier New" w:hAnsi="Courier New" w:cs="Courier New"/>
+        <w:rFonts w:ascii="Courier New" w:hAnsi="Courier New" w:cs="Courier New" w:hint="default"/>
       </w:rPr>
     </w:lvl>
     <w:lvl w:ilvl="5" w:tplc="04090005" w:tentative="1">
@@ -8953,7 +8858,7 @@
         <w:ind w:left="3960" w:hanging="360"/>
       </w:pPr>
       <w:rPr>
-        <w:rFonts w:hint="default" w:ascii="Wingdings" w:hAnsi="Wingdings"/>
+        <w:rFonts w:ascii="Wingdings" w:hAnsi="Wingdings" w:hint="default"/>
       </w:rPr>
     </w:lvl>
     <w:lvl w:ilvl="6" w:tplc="04090001" w:tentative="1">
@@ -8968,7 +8873,7 @@
         <w:ind w:left="4680" w:hanging="360"/>
       </w:pPr>
       <w:rPr>
-        <w:rFonts w:hint="default" w:ascii="Symbol" w:hAnsi="Symbol"/>
+        <w:rFonts w:ascii="Symbol" w:hAnsi="Symbol" w:hint="default"/>
       </w:rPr>
     </w:lvl>
     <w:lvl w:ilvl="7" w:tplc="04090003" w:tentative="1">
@@ -8983,7 +8888,7 @@
         <w:ind w:left="5400" w:hanging="360"/>
       </w:pPr>
       <w:rPr>
-        <w:rFonts w:hint="default" w:ascii="Courier New" w:hAnsi="Courier New" w:cs="Courier New"/>
+        <w:rFonts w:ascii="Courier New" w:hAnsi="Courier New" w:cs="Courier New" w:hint="default"/>
       </w:rPr>
     </w:lvl>
     <w:lvl w:ilvl="8" w:tplc="04090005" w:tentative="1">
@@ -8998,7 +8903,7 @@
         <w:ind w:left="6120" w:hanging="360"/>
       </w:pPr>
       <w:rPr>
-        <w:rFonts w:hint="default" w:ascii="Wingdings" w:hAnsi="Wingdings"/>
+        <w:rFonts w:ascii="Wingdings" w:hAnsi="Wingdings" w:hint="default"/>
       </w:rPr>
     </w:lvl>
   </w:abstractNum>
@@ -9069,11 +8974,11 @@
 </file>
 
 <file path=word/styles.xml><?xml version="1.0" encoding="utf-8"?>
-<w:styles xmlns:wp14="http://schemas.microsoft.com/office/word/2010/wordprocessingDrawing" xmlns:mc="http://schemas.openxmlformats.org/markup-compatibility/2006" xmlns:r="http://schemas.openxmlformats.org/officeDocument/2006/relationships" xmlns:w="http://schemas.openxmlformats.org/wordprocessingml/2006/main" xmlns:w14="http://schemas.microsoft.com/office/word/2010/wordml" xmlns:w15="http://schemas.microsoft.com/office/word/2012/wordml" xmlns:w16cex="http://schemas.microsoft.com/office/word/2018/wordml/cex" xmlns:w16cid="http://schemas.microsoft.com/office/word/2016/wordml/cid" xmlns:w16="http://schemas.microsoft.com/office/word/2018/wordml" xmlns:w16du="http://schemas.microsoft.com/office/word/2023/wordml/word16du" xmlns:w16sdtdh="http://schemas.microsoft.com/office/word/2020/wordml/sdtdatahash" xmlns:w16sdtfl="http://schemas.microsoft.com/office/word/2024/wordml/sdtformatlock" xmlns:w16se="http://schemas.microsoft.com/office/word/2015/wordml/symex" mc:Ignorable="w14 w15 w16se w16cid w16 w16cex w16sdtdh w16sdtfl w16du wp14">
+<w:styles xmlns:mc="http://schemas.openxmlformats.org/markup-compatibility/2006" xmlns:r="http://schemas.openxmlformats.org/officeDocument/2006/relationships" xmlns:w="http://schemas.openxmlformats.org/wordprocessingml/2006/main" xmlns:w14="http://schemas.microsoft.com/office/word/2010/wordml" xmlns:w15="http://schemas.microsoft.com/office/word/2012/wordml" xmlns:w16cex="http://schemas.microsoft.com/office/word/2018/wordml/cex" xmlns:w16cid="http://schemas.microsoft.com/office/word/2016/wordml/cid" xmlns:w16="http://schemas.microsoft.com/office/word/2018/wordml" xmlns:w16du="http://schemas.microsoft.com/office/word/2023/wordml/word16du" xmlns:w16sdtdh="http://schemas.microsoft.com/office/word/2020/wordml/sdtdatahash" xmlns:w16sdtfl="http://schemas.microsoft.com/office/word/2024/wordml/sdtformatlock" xmlns:w16se="http://schemas.microsoft.com/office/word/2015/wordml/symex" mc:Ignorable="w14 w15 w16se w16cid w16 w16cex w16sdtdh w16sdtfl w16du">
   <w:docDefaults>
     <w:rPrDefault>
       <w:rPr>
-        <w:rFonts w:ascii="Times New Roman" w:hAnsi="Times New Roman" w:eastAsia="Times New Roman" w:cs="Times New Roman"/>
+        <w:rFonts w:ascii="Times New Roman" w:eastAsia="Times New Roman" w:hAnsi="Times New Roman" w:cs="Times New Roman"/>
         <w:lang w:val="fr-BE" w:eastAsia="fr-BE" w:bidi="ar-SA"/>
       </w:rPr>
     </w:rPrDefault>
@@ -9139,7 +9044,7 @@
     <w:lsdException w:name="Table Web 2" w:semiHidden="1" w:unhideWhenUsed="1"/>
     <w:lsdException w:name="Table Web 3" w:semiHidden="1" w:unhideWhenUsed="1"/>
     <w:lsdException w:name="Table Theme" w:semiHidden="1" w:unhideWhenUsed="1"/>
-    <w:lsdException w:name="Placeholder Text" w:uiPriority="99" w:semiHidden="1"/>
+    <w:lsdException w:name="Placeholder Text" w:semiHidden="1" w:uiPriority="99"/>
     <w:lsdException w:name="No Spacing" w:uiPriority="1" w:qFormat="1"/>
     <w:lsdException w:name="Light Shading" w:uiPriority="60"/>
     <w:lsdException w:name="Light List" w:uiPriority="61"/>
@@ -9161,7 +9066,7 @@
     <w:lsdException w:name="Medium Shading 1 Accent 1" w:uiPriority="63"/>
     <w:lsdException w:name="Medium Shading 2 Accent 1" w:uiPriority="64"/>
     <w:lsdException w:name="Medium List 1 Accent 1" w:uiPriority="65"/>
-    <w:lsdException w:name="Revision" w:uiPriority="99" w:semiHidden="1"/>
+    <w:lsdException w:name="Revision" w:semiHidden="1" w:uiPriority="99"/>
     <w:lsdException w:name="List Paragraph" w:uiPriority="34" w:qFormat="1"/>
     <w:lsdException w:name="Quote" w:uiPriority="29" w:qFormat="1"/>
     <w:lsdException w:name="Intense Quote" w:uiPriority="30" w:qFormat="1"/>
@@ -9248,8 +9153,8 @@
     <w:lsdException w:name="Subtle Reference" w:uiPriority="31" w:qFormat="1"/>
     <w:lsdException w:name="Intense Reference" w:uiPriority="32" w:qFormat="1"/>
     <w:lsdException w:name="Book Title" w:uiPriority="33" w:qFormat="1"/>
-    <w:lsdException w:name="Bibliography" w:uiPriority="37" w:semiHidden="1" w:unhideWhenUsed="1"/>
-    <w:lsdException w:name="TOC Heading" w:uiPriority="39" w:semiHidden="1" w:unhideWhenUsed="1" w:qFormat="1"/>
+    <w:lsdException w:name="Bibliography" w:semiHidden="1" w:uiPriority="37" w:unhideWhenUsed="1"/>
+    <w:lsdException w:name="TOC Heading" w:semiHidden="1" w:uiPriority="39" w:unhideWhenUsed="1" w:qFormat="1"/>
     <w:lsdException w:name="Plain Table 1" w:uiPriority="41"/>
     <w:lsdException w:name="Plain Table 2" w:uiPriority="42"/>
     <w:lsdException w:name="Plain Table 3" w:uiPriority="43"/>
@@ -9354,20 +9259,20 @@
     <w:lsdException w:name="List Table 5 Dark Accent 6" w:uiPriority="50"/>
     <w:lsdException w:name="List Table 6 Colorful Accent 6" w:uiPriority="51"/>
     <w:lsdException w:name="List Table 7 Colorful Accent 6" w:uiPriority="52"/>
-    <w:lsdException w:name="Mention" w:uiPriority="99" w:semiHidden="1" w:unhideWhenUsed="1"/>
-    <w:lsdException w:name="Smart Hyperlink" w:uiPriority="99" w:semiHidden="1" w:unhideWhenUsed="1"/>
-    <w:lsdException w:name="Hashtag" w:uiPriority="99" w:semiHidden="1" w:unhideWhenUsed="1"/>
-    <w:lsdException w:name="Unresolved Mention" w:uiPriority="99" w:semiHidden="1" w:unhideWhenUsed="1"/>
-    <w:lsdException w:name="Smart Link" w:uiPriority="99" w:semiHidden="1" w:unhideWhenUsed="1"/>
+    <w:lsdException w:name="Mention" w:semiHidden="1" w:uiPriority="99" w:unhideWhenUsed="1"/>
+    <w:lsdException w:name="Smart Hyperlink" w:semiHidden="1" w:uiPriority="99" w:unhideWhenUsed="1"/>
+    <w:lsdException w:name="Hashtag" w:semiHidden="1" w:uiPriority="99" w:unhideWhenUsed="1"/>
+    <w:lsdException w:name="Unresolved Mention" w:semiHidden="1" w:uiPriority="99" w:unhideWhenUsed="1"/>
+    <w:lsdException w:name="Smart Link" w:semiHidden="1" w:uiPriority="99" w:unhideWhenUsed="1"/>
   </w:latentStyles>
-  <w:style w:type="paragraph" w:styleId="Normal" w:default="1">
+  <w:style w:type="paragraph" w:default="1" w:styleId="Normal">
     <w:name w:val="Normal"/>
     <w:qFormat/>
     <w:rPr>
       <w:lang w:val="en-AU" w:eastAsia="en-US"/>
     </w:rPr>
   </w:style>
-  <w:style w:type="paragraph" w:styleId="Heading1">
+  <w:style w:type="paragraph" w:styleId="Titre1">
     <w:name w:val="heading 1"/>
     <w:basedOn w:val="Normal"/>
     <w:next w:val="Normal"/>
@@ -9382,7 +9287,7 @@
       <w:sz w:val="24"/>
     </w:rPr>
   </w:style>
-  <w:style w:type="paragraph" w:styleId="Heading2">
+  <w:style w:type="paragraph" w:styleId="Titre2">
     <w:name w:val="heading 2"/>
     <w:basedOn w:val="Normal"/>
     <w:next w:val="Normal"/>
@@ -9399,7 +9304,7 @@
       <w:lang w:val="fr-FR"/>
     </w:rPr>
   </w:style>
-  <w:style w:type="paragraph" w:styleId="Heading3">
+  <w:style w:type="paragraph" w:styleId="Titre3">
     <w:name w:val="heading 3"/>
     <w:basedOn w:val="Normal"/>
     <w:next w:val="Normal"/>
@@ -9416,7 +9321,7 @@
       <w:lang w:val="fr-FR"/>
     </w:rPr>
   </w:style>
-  <w:style w:type="paragraph" w:styleId="Heading4">
+  <w:style w:type="paragraph" w:styleId="Titre4">
     <w:name w:val="heading 4"/>
     <w:basedOn w:val="Normal"/>
     <w:next w:val="Normal"/>
@@ -9433,7 +9338,7 @@
       <w:lang w:val="fr-FR"/>
     </w:rPr>
   </w:style>
-  <w:style w:type="paragraph" w:styleId="Heading5">
+  <w:style w:type="paragraph" w:styleId="Titre5">
     <w:name w:val="heading 5"/>
     <w:basedOn w:val="Normal"/>
     <w:next w:val="Normal"/>
@@ -9448,7 +9353,7 @@
       <w:lang w:val="fr-FR"/>
     </w:rPr>
   </w:style>
-  <w:style w:type="paragraph" w:styleId="Heading6">
+  <w:style w:type="paragraph" w:styleId="Titre6">
     <w:name w:val="heading 6"/>
     <w:basedOn w:val="Normal"/>
     <w:next w:val="Normal"/>
@@ -9463,7 +9368,7 @@
       <w:lang w:val="fr-FR"/>
     </w:rPr>
   </w:style>
-  <w:style w:type="paragraph" w:styleId="Heading7">
+  <w:style w:type="paragraph" w:styleId="Titre7">
     <w:name w:val="heading 7"/>
     <w:basedOn w:val="Normal"/>
     <w:next w:val="Normal"/>
@@ -9477,13 +9382,13 @@
       <w:lang w:val="fr-FR"/>
     </w:rPr>
   </w:style>
-  <w:style w:type="character" w:styleId="DefaultParagraphFont" w:default="1">
+  <w:style w:type="character" w:default="1" w:styleId="Policepardfaut">
     <w:name w:val="Default Paragraph Font"/>
     <w:uiPriority w:val="1"/>
     <w:semiHidden/>
     <w:unhideWhenUsed/>
   </w:style>
-  <w:style w:type="table" w:styleId="TableNormal" w:default="1">
+  <w:style w:type="table" w:default="1" w:styleId="TableauNormal">
     <w:name w:val="Normal Table"/>
     <w:uiPriority w:val="99"/>
     <w:semiHidden/>
@@ -9498,13 +9403,13 @@
       </w:tblCellMar>
     </w:tblPr>
   </w:style>
-  <w:style w:type="numbering" w:styleId="NoList" w:default="1">
+  <w:style w:type="numbering" w:default="1" w:styleId="Aucuneliste">
     <w:name w:val="No List"/>
     <w:uiPriority w:val="99"/>
     <w:semiHidden/>
     <w:unhideWhenUsed/>
   </w:style>
-  <w:style w:type="paragraph" w:styleId="BodyTextIndent">
+  <w:style w:type="paragraph" w:styleId="Retraitcorpsdetexte">
     <w:name w:val="Body Text Indent"/>
     <w:basedOn w:val="Normal"/>
     <w:pPr>
@@ -9516,7 +9421,7 @@
       <w:lang w:val="fr-FR"/>
     </w:rPr>
   </w:style>
-  <w:style w:type="paragraph" w:styleId="BodyText">
+  <w:style w:type="paragraph" w:styleId="Corpsdetexte">
     <w:name w:val="Body Text"/>
     <w:basedOn w:val="Normal"/>
     <w:pPr>
@@ -9527,7 +9432,7 @@
       <w:lang w:val="fr-FR"/>
     </w:rPr>
   </w:style>
-  <w:style w:type="paragraph" w:styleId="BodyText2">
+  <w:style w:type="paragraph" w:styleId="Corpsdetexte2">
     <w:name w:val="Body Text 2"/>
     <w:basedOn w:val="Normal"/>
     <w:pPr>
@@ -9538,7 +9443,7 @@
       <w:lang w:val="fr-FR"/>
     </w:rPr>
   </w:style>
-  <w:style w:type="paragraph" w:styleId="BodyText3">
+  <w:style w:type="paragraph" w:styleId="Corpsdetexte3">
     <w:name w:val="Body Text 3"/>
     <w:basedOn w:val="Normal"/>
     <w:pPr>
@@ -9551,7 +9456,7 @@
       <w:lang w:val="fr-FR"/>
     </w:rPr>
   </w:style>
-  <w:style w:type="paragraph" w:styleId="DocumentMap">
+  <w:style w:type="paragraph" w:styleId="Explorateurdedocuments">
     <w:name w:val="Document Map"/>
     <w:basedOn w:val="Normal"/>
     <w:semiHidden/>
@@ -9563,7 +9468,7 @@
       <w:rFonts w:ascii="Tahoma" w:hAnsi="Tahoma" w:cs="Tahoma"/>
     </w:rPr>
   </w:style>
-  <w:style w:type="paragraph" w:styleId="ListParagraph">
+  <w:style w:type="paragraph" w:styleId="Paragraphedeliste">
     <w:name w:val="List Paragraph"/>
     <w:basedOn w:val="Normal"/>
     <w:uiPriority w:val="34"/>
@@ -9575,7 +9480,7 @@
       <w:contextualSpacing/>
     </w:pPr>
     <w:rPr>
-      <w:rFonts w:ascii="Calibri" w:hAnsi="Calibri" w:eastAsia="Calibri"/>
+      <w:rFonts w:ascii="Calibri" w:eastAsia="Calibri" w:hAnsi="Calibri"/>
       <w:sz w:val="22"/>
       <w:szCs w:val="22"/>
       <w:lang w:val="en-US"/>
@@ -9585,7 +9490,7 @@
 </file>
 
 <file path=word/theme/theme1.xml><?xml version="1.0" encoding="utf-8"?>
-<a:theme xmlns:a="http://schemas.openxmlformats.org/drawingml/2006/main" xmlns:thm15="http://schemas.microsoft.com/office/thememl/2012/main" name="Thème Office">
+<a:theme xmlns:a="http://schemas.openxmlformats.org/drawingml/2006/main" name="Thème Office">
   <a:themeElements>
     <a:clrScheme name="Office">
       <a:dk1>

</xml_diff>